<commit_message>
Clarify data sources in Supporting Materials
A teammate read 'Data source: lib/courseAdvisor.ts' as an external website called courseadvisor. If she read it that way, a judge could too.

Adds a 'How to read this section' note stating that file paths are files inside our own codebase, that 'API: None' means no internet call, and that exactly one module (SIFU) calls an external API. Relabels each entry to 'Data source (inside our own code)' and 'External API'.
</commit_message>
<xml_diff>
--- a/docs/CareerArc_Supporting_Materials.docx
+++ b/docs/CareerArc_Supporting_Materials.docx
@@ -1237,2216 +1237,21 @@
           <w:sz w:val="24"/>
           <w:szCs w:val="24"/>
         </w:rPr>
-        <w:t xml:space="preserve">Module-by-module</w:t>
-      </w:r>
-    </w:p>
-    <w:p>
-      <w:pPr>
-        <w:pStyle w:val="Heading3"/>
-        <w:spacing w:after="70" w:before="200"/>
-      </w:pPr>
-      <w:r>
-        <w:rPr>
-          <w:rFonts w:ascii="Arial" w:cs="Arial" w:eastAsia="Arial" w:hAnsi="Arial"/>
-          <w:b/>
-          <w:bCs/>
-          <w:color w:val="8A6D1F"/>
-          <w:sz w:val="22"/>
-          <w:szCs w:val="22"/>
-        </w:rPr>
-        <w:t xml:space="preserve">1. One-Click Login  ·  /login</w:t>
-      </w:r>
-    </w:p>
-    <w:p>
-      <w:pPr>
-        <w:spacing w:after="110" w:line="268"/>
-      </w:pPr>
-      <w:r>
-        <w:rPr>
-          <w:rFonts w:ascii="Arial" w:cs="Arial" w:eastAsia="Arial" w:hAnsi="Arial"/>
-          <w:b/>
-          <w:bCs/>
-          <w:color w:val="2D3436"/>
-          <w:sz w:val="21"/>
-          <w:szCs w:val="21"/>
-        </w:rPr>
-        <w:t xml:space="preserve">Purpose: </w:t>
-      </w:r>
-      <w:r>
-        <w:rPr>
-          <w:rFonts w:ascii="Arial" w:cs="Arial" w:eastAsia="Arial" w:hAnsi="Arial"/>
-          <w:color w:val="2D3436"/>
-          <w:sz w:val="21"/>
-          <w:szCs w:val="21"/>
-        </w:rPr>
-        <w:t xml:space="preserve">Remove all friction for judges and demo users.</w:t>
-      </w:r>
-    </w:p>
-    <w:p>
-      <w:pPr>
-        <w:spacing w:after="110" w:line="268"/>
-      </w:pPr>
-      <w:r>
-        <w:rPr>
-          <w:rFonts w:ascii="Arial" w:cs="Arial" w:eastAsia="Arial" w:hAnsi="Arial"/>
-          <w:b/>
-          <w:bCs/>
-          <w:color w:val="2D3436"/>
-          <w:sz w:val="21"/>
-          <w:szCs w:val="21"/>
-        </w:rPr>
-        <w:t xml:space="preserve">How it works: </w:t>
-      </w:r>
-      <w:r>
-        <w:rPr>
-          <w:rFonts w:ascii="Arial" w:cs="Arial" w:eastAsia="Arial" w:hAnsi="Arial"/>
-          <w:color w:val="2D3436"/>
-          <w:sz w:val="21"/>
-          <w:szCs w:val="21"/>
-        </w:rPr>
-        <w:t xml:space="preserve">Four role tiles; clicking one writes the role to localStorage and routes to that dashboard. No password, no form.</w:t>
-      </w:r>
-    </w:p>
-    <w:p>
-      <w:pPr>
-        <w:spacing w:after="110" w:line="268"/>
-      </w:pPr>
-      <w:r>
-        <w:rPr>
-          <w:rFonts w:ascii="Arial" w:cs="Arial" w:eastAsia="Arial" w:hAnsi="Arial"/>
-          <w:b/>
-          <w:bCs/>
-          <w:color w:val="2D3436"/>
-          <w:sz w:val="21"/>
-          <w:szCs w:val="21"/>
-        </w:rPr>
-        <w:t xml:space="preserve">Data source: </w:t>
-      </w:r>
-      <w:r>
-        <w:rPr>
-          <w:rFonts w:ascii="Arial" w:cs="Arial" w:eastAsia="Arial" w:hAnsi="Arial"/>
-          <w:color w:val="2D3436"/>
-          <w:sz w:val="21"/>
-          <w:szCs w:val="21"/>
-        </w:rPr>
-        <w:t xml:space="preserve">Role definitions in the page component.</w:t>
-      </w:r>
-    </w:p>
-    <w:p>
-      <w:pPr>
-        <w:spacing w:after="110" w:line="268"/>
-      </w:pPr>
-      <w:r>
-        <w:rPr>
-          <w:rFonts w:ascii="Arial" w:cs="Arial" w:eastAsia="Arial" w:hAnsi="Arial"/>
-          <w:b/>
-          <w:bCs/>
-          <w:color w:val="2D3436"/>
-          <w:sz w:val="21"/>
-          <w:szCs w:val="21"/>
-        </w:rPr>
-        <w:t xml:space="preserve">API: </w:t>
-      </w:r>
-      <w:r>
-        <w:rPr>
-          <w:rFonts w:ascii="Arial" w:cs="Arial" w:eastAsia="Arial" w:hAnsi="Arial"/>
-          <w:b w:val="false"/>
-          <w:bCs w:val="false"/>
-          <w:color w:val="5A6570"/>
-          <w:sz w:val="21"/>
-          <w:szCs w:val="21"/>
-        </w:rPr>
-        <w:t xml:space="preserve">None</w:t>
-      </w:r>
-    </w:p>
-    <w:p>
-      <w:pPr>
-        <w:pStyle w:val="Heading3"/>
-        <w:spacing w:after="70" w:before="200"/>
-      </w:pPr>
-      <w:r>
-        <w:rPr>
-          <w:rFonts w:ascii="Arial" w:cs="Arial" w:eastAsia="Arial" w:hAnsi="Arial"/>
-          <w:b/>
-          <w:bCs/>
-          <w:color w:val="8A6D1F"/>
-          <w:sz w:val="22"/>
-          <w:szCs w:val="22"/>
-        </w:rPr>
-        <w:t xml:space="preserve">2. Onboarding  ·  /onboarding</w:t>
-      </w:r>
-    </w:p>
-    <w:p>
-      <w:pPr>
-        <w:spacing w:after="110" w:line="268"/>
-      </w:pPr>
-      <w:r>
-        <w:rPr>
-          <w:rFonts w:ascii="Arial" w:cs="Arial" w:eastAsia="Arial" w:hAnsi="Arial"/>
-          <w:b/>
-          <w:bCs/>
-          <w:color w:val="2D3436"/>
-          <w:sz w:val="21"/>
-          <w:szCs w:val="21"/>
-        </w:rPr>
-        <w:t xml:space="preserve">Purpose: </w:t>
-      </w:r>
-      <w:r>
-        <w:rPr>
-          <w:rFonts w:ascii="Arial" w:cs="Arial" w:eastAsia="Arial" w:hAnsi="Arial"/>
-          <w:color w:val="2D3436"/>
-          <w:sz w:val="21"/>
-          <w:szCs w:val="21"/>
-        </w:rPr>
-        <w:t xml:space="preserve">Turn a blank profile into a readiness diagnosis in ~60 seconds — the emotional hook of the demo.</w:t>
-      </w:r>
-    </w:p>
-    <w:p>
-      <w:pPr>
-        <w:spacing w:after="110" w:line="268"/>
-      </w:pPr>
-      <w:r>
-        <w:rPr>
-          <w:rFonts w:ascii="Arial" w:cs="Arial" w:eastAsia="Arial" w:hAnsi="Arial"/>
-          <w:b/>
-          <w:bCs/>
-          <w:color w:val="2D3436"/>
-          <w:sz w:val="21"/>
-          <w:szCs w:val="21"/>
-        </w:rPr>
-        <w:t xml:space="preserve">How it works: </w:t>
-      </w:r>
-      <w:r>
-        <w:rPr>
-          <w:rFonts w:ascii="Arial" w:cs="Arial" w:eastAsia="Arial" w:hAnsi="Arial"/>
-          <w:color w:val="2D3436"/>
-          <w:sz w:val="21"/>
-          <w:szCs w:val="21"/>
-        </w:rPr>
-        <w:t xml:space="preserve">A gated wizard whose steps are configured by the chosen level (Internship / Fresh Grad / Mid / Senior). Each step recalculates the CRS, which animates live in the side gauge. One config object drives four journeys.</w:t>
-      </w:r>
-    </w:p>
-    <w:p>
-      <w:pPr>
-        <w:spacing w:after="110" w:line="268"/>
-      </w:pPr>
-      <w:r>
-        <w:rPr>
-          <w:rFonts w:ascii="Arial" w:cs="Arial" w:eastAsia="Arial" w:hAnsi="Arial"/>
-          <w:b/>
-          <w:bCs/>
-          <w:color w:val="2D3436"/>
-          <w:sz w:val="21"/>
-          <w:szCs w:val="21"/>
-        </w:rPr>
-        <w:t xml:space="preserve">Data source: </w:t>
-      </w:r>
-      <w:r>
-        <w:rPr>
-          <w:rFonts w:ascii="Arial" w:cs="Arial" w:eastAsia="Arial" w:hAnsi="Arial"/>
-          <w:color w:val="2D3436"/>
-          <w:sz w:val="21"/>
-          <w:szCs w:val="21"/>
-        </w:rPr>
-        <w:t xml:space="preserve">levels + levelByKey in lib/careerData.ts; result saved to localStorage as careerProfile.</w:t>
-      </w:r>
-    </w:p>
-    <w:p>
-      <w:pPr>
-        <w:spacing w:after="110" w:line="268"/>
-      </w:pPr>
-      <w:r>
-        <w:rPr>
-          <w:rFonts w:ascii="Arial" w:cs="Arial" w:eastAsia="Arial" w:hAnsi="Arial"/>
-          <w:b/>
-          <w:bCs/>
-          <w:color w:val="2D3436"/>
-          <w:sz w:val="21"/>
-          <w:szCs w:val="21"/>
-        </w:rPr>
-        <w:t xml:space="preserve">API: </w:t>
-      </w:r>
-      <w:r>
-        <w:rPr>
-          <w:rFonts w:ascii="Arial" w:cs="Arial" w:eastAsia="Arial" w:hAnsi="Arial"/>
-          <w:b w:val="false"/>
-          <w:bCs w:val="false"/>
-          <w:color w:val="5A6570"/>
-          <w:sz w:val="21"/>
-          <w:szCs w:val="21"/>
-        </w:rPr>
-        <w:t xml:space="preserve">None</w:t>
-      </w:r>
-    </w:p>
-    <w:p>
-      <w:pPr>
-        <w:pStyle w:val="Heading3"/>
-        <w:spacing w:after="70" w:before="200"/>
-      </w:pPr>
-      <w:r>
-        <w:rPr>
-          <w:rFonts w:ascii="Arial" w:cs="Arial" w:eastAsia="Arial" w:hAnsi="Arial"/>
-          <w:b/>
-          <w:bCs/>
-          <w:color w:val="8A6D1F"/>
-          <w:sz w:val="22"/>
-          <w:szCs w:val="22"/>
-        </w:rPr>
-        <w:t xml:space="preserve">3. Dashboard — CRS hub  ·  /dashboard</w:t>
-      </w:r>
-    </w:p>
-    <w:p>
-      <w:pPr>
-        <w:spacing w:after="110" w:line="268"/>
-      </w:pPr>
-      <w:r>
-        <w:rPr>
-          <w:rFonts w:ascii="Arial" w:cs="Arial" w:eastAsia="Arial" w:hAnsi="Arial"/>
-          <w:b/>
-          <w:bCs/>
-          <w:color w:val="2D3436"/>
-          <w:sz w:val="21"/>
-          <w:szCs w:val="21"/>
-        </w:rPr>
-        <w:t xml:space="preserve">Purpose: </w:t>
-      </w:r>
-      <w:r>
-        <w:rPr>
-          <w:rFonts w:ascii="Arial" w:cs="Arial" w:eastAsia="Arial" w:hAnsi="Arial"/>
-          <w:color w:val="2D3436"/>
-          <w:sz w:val="21"/>
-          <w:szCs w:val="21"/>
-        </w:rPr>
-        <w:t xml:space="preserve">Answer "how ready am I, and what is the single best thing to do next?"</w:t>
-      </w:r>
-    </w:p>
-    <w:p>
-      <w:pPr>
-        <w:spacing w:after="110" w:line="268"/>
-      </w:pPr>
-      <w:r>
-        <w:rPr>
-          <w:rFonts w:ascii="Arial" w:cs="Arial" w:eastAsia="Arial" w:hAnsi="Arial"/>
-          <w:b/>
-          <w:bCs/>
-          <w:color w:val="2D3436"/>
-          <w:sz w:val="21"/>
-          <w:szCs w:val="21"/>
-        </w:rPr>
-        <w:t xml:space="preserve">How it works: </w:t>
-      </w:r>
-      <w:r>
-        <w:rPr>
-          <w:rFonts w:ascii="Arial" w:cs="Arial" w:eastAsia="Arial" w:hAnsi="Arial"/>
-          <w:color w:val="2D3436"/>
-          <w:sz w:val="21"/>
-          <w:szCs w:val="21"/>
-        </w:rPr>
-        <w:t xml:space="preserve">Reads the saved profile, computes CRS, renders the 5-component breakdown, ranks all jobs by real skill compatibility, and surfaces an AI-style next action targeting the weakest component.</w:t>
-      </w:r>
-    </w:p>
-    <w:p>
-      <w:pPr>
-        <w:spacing w:after="110" w:line="268"/>
-      </w:pPr>
-      <w:r>
-        <w:rPr>
-          <w:rFonts w:ascii="Arial" w:cs="Arial" w:eastAsia="Arial" w:hAnsi="Arial"/>
-          <w:b/>
-          <w:bCs/>
-          <w:color w:val="2D3436"/>
-          <w:sz w:val="21"/>
-          <w:szCs w:val="21"/>
-        </w:rPr>
-        <w:t xml:space="preserve">Data source: </w:t>
-      </w:r>
-      <w:r>
-        <w:rPr>
-          <w:rFonts w:ascii="Arial" w:cs="Arial" w:eastAsia="Arial" w:hAnsi="Arial"/>
-          <w:color w:val="2D3436"/>
-          <w:sz w:val="21"/>
-          <w:szCs w:val="21"/>
-        </w:rPr>
-        <w:t xml:space="preserve">careerProfile (localStorage) + mockJobs (lib/mockData.ts).</w:t>
-      </w:r>
-    </w:p>
-    <w:p>
-      <w:pPr>
-        <w:spacing w:after="110" w:line="268"/>
-      </w:pPr>
-      <w:r>
-        <w:rPr>
-          <w:rFonts w:ascii="Arial" w:cs="Arial" w:eastAsia="Arial" w:hAnsi="Arial"/>
-          <w:b/>
-          <w:bCs/>
-          <w:color w:val="2D3436"/>
-          <w:sz w:val="21"/>
-          <w:szCs w:val="21"/>
-        </w:rPr>
-        <w:t xml:space="preserve">API: </w:t>
-      </w:r>
-      <w:r>
-        <w:rPr>
-          <w:rFonts w:ascii="Arial" w:cs="Arial" w:eastAsia="Arial" w:hAnsi="Arial"/>
-          <w:b/>
-          <w:bCs/>
-          <w:color w:val="00795C"/>
-          <w:sz w:val="21"/>
-          <w:szCs w:val="21"/>
-        </w:rPr>
-        <w:t xml:space="preserve">None — text from nextActionText()</w:t>
-      </w:r>
-    </w:p>
-    <w:p>
-      <w:pPr>
-        <w:pStyle w:val="Heading3"/>
-        <w:spacing w:after="70" w:before="200"/>
-      </w:pPr>
-      <w:r>
-        <w:rPr>
-          <w:rFonts w:ascii="Arial" w:cs="Arial" w:eastAsia="Arial" w:hAnsi="Arial"/>
-          <w:b/>
-          <w:bCs/>
-          <w:color w:val="8A6D1F"/>
-          <w:sz w:val="22"/>
-          <w:szCs w:val="22"/>
-        </w:rPr>
-        <w:t xml:space="preserve">4. Course Advisor  ·  /course-advisor</w:t>
-      </w:r>
-    </w:p>
-    <w:p>
-      <w:pPr>
-        <w:spacing w:after="110" w:line="268"/>
-      </w:pPr>
-      <w:r>
-        <w:rPr>
-          <w:rFonts w:ascii="Arial" w:cs="Arial" w:eastAsia="Arial" w:hAnsi="Arial"/>
-          <w:b/>
-          <w:bCs/>
-          <w:color w:val="2D3436"/>
-          <w:sz w:val="21"/>
-          <w:szCs w:val="21"/>
-        </w:rPr>
-        <w:t xml:space="preserve">Purpose: </w:t>
-      </w:r>
-      <w:r>
-        <w:rPr>
-          <w:rFonts w:ascii="Arial" w:cs="Arial" w:eastAsia="Arial" w:hAnsi="Arial"/>
-          <w:color w:val="2D3436"/>
-          <w:sz w:val="21"/>
-          <w:szCs w:val="21"/>
-        </w:rPr>
-        <w:t xml:space="preserve">For 16–18 year olds who have not chosen a course — answered before they commit 4 years and RM40,000.</w:t>
-      </w:r>
-    </w:p>
-    <w:p>
-      <w:pPr>
-        <w:spacing w:after="110" w:line="268"/>
-      </w:pPr>
-      <w:r>
-        <w:rPr>
-          <w:rFonts w:ascii="Arial" w:cs="Arial" w:eastAsia="Arial" w:hAnsi="Arial"/>
-          <w:b/>
-          <w:bCs/>
-          <w:color w:val="2D3436"/>
-          <w:sz w:val="21"/>
-          <w:szCs w:val="21"/>
-        </w:rPr>
-        <w:t xml:space="preserve">How it works: </w:t>
-      </w:r>
-      <w:r>
-        <w:rPr>
-          <w:rFonts w:ascii="Arial" w:cs="Arial" w:eastAsia="Arial" w:hAnsi="Arial"/>
-          <w:color w:val="2D3436"/>
-          <w:sz w:val="21"/>
-          <w:szCs w:val="21"/>
-        </w:rPr>
-        <w:t xml:space="preserve">Three steps (interests → subjects → work animal) feed matchCourses(), scoring ten courses on a weighted model (interests 55%, subjects 30%, animal 15%). Each card also shows a non-degree route.</w:t>
-      </w:r>
-    </w:p>
-    <w:p>
-      <w:pPr>
-        <w:spacing w:after="110" w:line="268"/>
-      </w:pPr>
-      <w:r>
-        <w:rPr>
-          <w:rFonts w:ascii="Arial" w:cs="Arial" w:eastAsia="Arial" w:hAnsi="Arial"/>
-          <w:b/>
-          <w:bCs/>
-          <w:color w:val="2D3436"/>
-          <w:sz w:val="21"/>
-          <w:szCs w:val="21"/>
-        </w:rPr>
-        <w:t xml:space="preserve">Data source: </w:t>
-      </w:r>
-      <w:r>
-        <w:rPr>
-          <w:rFonts w:ascii="Arial" w:cs="Arial" w:eastAsia="Arial" w:hAnsi="Arial"/>
-          <w:color w:val="2D3436"/>
-          <w:sz w:val="21"/>
-          <w:szCs w:val="21"/>
-        </w:rPr>
-        <w:t xml:space="preserve">lib/courseAdvisor.ts — courses, demand signals, salary ranges, durability notes, skills routes.</w:t>
-      </w:r>
-    </w:p>
-    <w:p>
-      <w:pPr>
-        <w:spacing w:after="110" w:line="268"/>
-      </w:pPr>
-      <w:r>
-        <w:rPr>
-          <w:rFonts w:ascii="Arial" w:cs="Arial" w:eastAsia="Arial" w:hAnsi="Arial"/>
-          <w:b/>
-          <w:bCs/>
-          <w:color w:val="2D3436"/>
-          <w:sz w:val="21"/>
-          <w:szCs w:val="21"/>
-        </w:rPr>
-        <w:t xml:space="preserve">API: </w:t>
-      </w:r>
-      <w:r>
-        <w:rPr>
-          <w:rFonts w:ascii="Arial" w:cs="Arial" w:eastAsia="Arial" w:hAnsi="Arial"/>
-          <w:b w:val="false"/>
-          <w:bCs w:val="false"/>
-          <w:color w:val="5A6570"/>
-          <w:sz w:val="21"/>
-          <w:szCs w:val="21"/>
-        </w:rPr>
-        <w:t xml:space="preserve">None</w:t>
-      </w:r>
-    </w:p>
-    <w:p>
-      <w:pPr>
-        <w:pStyle w:val="Heading3"/>
-        <w:spacing w:after="70" w:before="200"/>
-      </w:pPr>
-      <w:r>
-        <w:rPr>
-          <w:rFonts w:ascii="Arial" w:cs="Arial" w:eastAsia="Arial" w:hAnsi="Arial"/>
-          <w:b/>
-          <w:bCs/>
-          <w:color w:val="8A6D1F"/>
-          <w:sz w:val="22"/>
-          <w:szCs w:val="22"/>
-        </w:rPr>
-        <w:t xml:space="preserve">5. Career Path  ·  /career-path</w:t>
-      </w:r>
-    </w:p>
-    <w:p>
-      <w:pPr>
-        <w:spacing w:after="110" w:line="268"/>
-      </w:pPr>
-      <w:r>
-        <w:rPr>
-          <w:rFonts w:ascii="Arial" w:cs="Arial" w:eastAsia="Arial" w:hAnsi="Arial"/>
-          <w:b/>
-          <w:bCs/>
-          <w:color w:val="2D3436"/>
-          <w:sz w:val="21"/>
-          <w:szCs w:val="21"/>
-        </w:rPr>
-        <w:t xml:space="preserve">Purpose: </w:t>
-      </w:r>
-      <w:r>
-        <w:rPr>
-          <w:rFonts w:ascii="Arial" w:cs="Arial" w:eastAsia="Arial" w:hAnsi="Arial"/>
-          <w:color w:val="2D3436"/>
-          <w:sz w:val="21"/>
-          <w:szCs w:val="21"/>
-        </w:rPr>
-        <w:t xml:space="preserve">A plan a person can act on. Deliberately not a 40-year fantasy.</w:t>
-      </w:r>
-    </w:p>
-    <w:p>
-      <w:pPr>
-        <w:spacing w:after="110" w:line="268"/>
-      </w:pPr>
-      <w:r>
-        <w:rPr>
-          <w:rFonts w:ascii="Arial" w:cs="Arial" w:eastAsia="Arial" w:hAnsi="Arial"/>
-          <w:b/>
-          <w:bCs/>
-          <w:color w:val="2D3436"/>
-          <w:sz w:val="21"/>
-          <w:szCs w:val="21"/>
-        </w:rPr>
-        <w:t xml:space="preserve">How it works: </w:t>
-      </w:r>
-      <w:r>
-        <w:rPr>
-          <w:rFonts w:ascii="Arial" w:cs="Arial" w:eastAsia="Arial" w:hAnsi="Arial"/>
-          <w:color w:val="2D3436"/>
-          <w:sz w:val="21"/>
-          <w:szCs w:val="21"/>
-        </w:rPr>
-        <w:t xml:space="preserve">Three tracks. Each shows a concrete 4-year plan of what to DO each year, then clearly-labelled 2030/2040 scenarios, then a Future-Proof Check of durable vs automatable skills.</w:t>
-      </w:r>
-    </w:p>
-    <w:p>
-      <w:pPr>
-        <w:spacing w:after="110" w:line="268"/>
-      </w:pPr>
-      <w:r>
-        <w:rPr>
-          <w:rFonts w:ascii="Arial" w:cs="Arial" w:eastAsia="Arial" w:hAnsi="Arial"/>
-          <w:b/>
-          <w:bCs/>
-          <w:color w:val="2D3436"/>
-          <w:sz w:val="21"/>
-          <w:szCs w:val="21"/>
-        </w:rPr>
-        <w:t xml:space="preserve">Data source: </w:t>
-      </w:r>
-      <w:r>
-        <w:rPr>
-          <w:rFonts w:ascii="Arial" w:cs="Arial" w:eastAsia="Arial" w:hAnsi="Arial"/>
-          <w:color w:val="2D3436"/>
-          <w:sz w:val="21"/>
-          <w:szCs w:val="21"/>
-        </w:rPr>
-        <w:t xml:space="preserve">careerPathData + futureProof (lib/mockData.ts).</w:t>
-      </w:r>
-    </w:p>
-    <w:p>
-      <w:pPr>
-        <w:spacing w:after="110" w:line="268"/>
-      </w:pPr>
-      <w:r>
-        <w:rPr>
-          <w:rFonts w:ascii="Arial" w:cs="Arial" w:eastAsia="Arial" w:hAnsi="Arial"/>
-          <w:b/>
-          <w:bCs/>
-          <w:color w:val="2D3436"/>
-          <w:sz w:val="21"/>
-          <w:szCs w:val="21"/>
-        </w:rPr>
-        <w:t xml:space="preserve">API: </w:t>
-      </w:r>
-      <w:r>
-        <w:rPr>
-          <w:rFonts w:ascii="Arial" w:cs="Arial" w:eastAsia="Arial" w:hAnsi="Arial"/>
-          <w:b w:val="false"/>
-          <w:bCs w:val="false"/>
-          <w:color w:val="5A6570"/>
-          <w:sz w:val="21"/>
-          <w:szCs w:val="21"/>
-        </w:rPr>
-        <w:t xml:space="preserve">None</w:t>
-      </w:r>
-    </w:p>
-    <w:p>
-      <w:pPr>
-        <w:pStyle w:val="Heading3"/>
-        <w:spacing w:after="70" w:before="200"/>
-      </w:pPr>
-      <w:r>
-        <w:rPr>
-          <w:rFonts w:ascii="Arial" w:cs="Arial" w:eastAsia="Arial" w:hAnsi="Arial"/>
-          <w:b/>
-          <w:bCs/>
-          <w:color w:val="8A6D1F"/>
-          <w:sz w:val="22"/>
-          <w:szCs w:val="22"/>
-        </w:rPr>
-        <w:t xml:space="preserve">6. Job Search  ·  /jobs</w:t>
-      </w:r>
-    </w:p>
-    <w:p>
-      <w:pPr>
-        <w:spacing w:after="110" w:line="268"/>
-      </w:pPr>
-      <w:r>
-        <w:rPr>
-          <w:rFonts w:ascii="Arial" w:cs="Arial" w:eastAsia="Arial" w:hAnsi="Arial"/>
-          <w:b/>
-          <w:bCs/>
-          <w:color w:val="2D3436"/>
-          <w:sz w:val="21"/>
-          <w:szCs w:val="21"/>
-        </w:rPr>
-        <w:t xml:space="preserve">Purpose: </w:t>
-      </w:r>
-      <w:r>
-        <w:rPr>
-          <w:rFonts w:ascii="Arial" w:cs="Arial" w:eastAsia="Arial" w:hAnsi="Arial"/>
-          <w:color w:val="2D3436"/>
-          <w:sz w:val="21"/>
-          <w:szCs w:val="21"/>
-        </w:rPr>
-        <w:t xml:space="preserve">Make browsing decision-focused rather than a list to scroll.</w:t>
-      </w:r>
-    </w:p>
-    <w:p>
-      <w:pPr>
-        <w:spacing w:after="110" w:line="268"/>
-      </w:pPr>
-      <w:r>
-        <w:rPr>
-          <w:rFonts w:ascii="Arial" w:cs="Arial" w:eastAsia="Arial" w:hAnsi="Arial"/>
-          <w:b/>
-          <w:bCs/>
-          <w:color w:val="2D3436"/>
-          <w:sz w:val="21"/>
-          <w:szCs w:val="21"/>
-        </w:rPr>
-        <w:t xml:space="preserve">How it works: </w:t>
-      </w:r>
-      <w:r>
-        <w:rPr>
-          <w:rFonts w:ascii="Arial" w:cs="Arial" w:eastAsia="Arial" w:hAnsi="Arial"/>
-          <w:color w:val="2D3436"/>
-          <w:sz w:val="21"/>
-          <w:szCs w:val="21"/>
-        </w:rPr>
-        <w:t xml:space="preserve">Every card computes a live Match Score against the real profile, sorts by it, shows missing skills in red, and carries the Anti-Ghost rating.</w:t>
-      </w:r>
-    </w:p>
-    <w:p>
-      <w:pPr>
-        <w:spacing w:after="110" w:line="268"/>
-      </w:pPr>
-      <w:r>
-        <w:rPr>
-          <w:rFonts w:ascii="Arial" w:cs="Arial" w:eastAsia="Arial" w:hAnsi="Arial"/>
-          <w:b/>
-          <w:bCs/>
-          <w:color w:val="2D3436"/>
-          <w:sz w:val="21"/>
-          <w:szCs w:val="21"/>
-        </w:rPr>
-        <w:t xml:space="preserve">Data source: </w:t>
-      </w:r>
-      <w:r>
-        <w:rPr>
-          <w:rFonts w:ascii="Arial" w:cs="Arial" w:eastAsia="Arial" w:hAnsi="Arial"/>
-          <w:color w:val="2D3436"/>
-          <w:sz w:val="21"/>
-          <w:szCs w:val="21"/>
-        </w:rPr>
-        <w:t xml:space="preserve">mockJobs + jobDetails.</w:t>
-      </w:r>
-    </w:p>
-    <w:p>
-      <w:pPr>
-        <w:spacing w:after="110" w:line="268"/>
-      </w:pPr>
-      <w:r>
-        <w:rPr>
-          <w:rFonts w:ascii="Arial" w:cs="Arial" w:eastAsia="Arial" w:hAnsi="Arial"/>
-          <w:b/>
-          <w:bCs/>
-          <w:color w:val="2D3436"/>
-          <w:sz w:val="21"/>
-          <w:szCs w:val="21"/>
-        </w:rPr>
-        <w:t xml:space="preserve">API: </w:t>
-      </w:r>
-      <w:r>
-        <w:rPr>
-          <w:rFonts w:ascii="Arial" w:cs="Arial" w:eastAsia="Arial" w:hAnsi="Arial"/>
-          <w:b w:val="false"/>
-          <w:bCs w:val="false"/>
-          <w:color w:val="5A6570"/>
-          <w:sz w:val="21"/>
-          <w:szCs w:val="21"/>
-        </w:rPr>
-        <w:t xml:space="preserve">None</w:t>
-      </w:r>
-    </w:p>
-    <w:p>
-      <w:pPr>
-        <w:pStyle w:val="Heading3"/>
-        <w:spacing w:after="70" w:before="200"/>
-      </w:pPr>
-      <w:r>
-        <w:rPr>
-          <w:rFonts w:ascii="Arial" w:cs="Arial" w:eastAsia="Arial" w:hAnsi="Arial"/>
-          <w:b/>
-          <w:bCs/>
-          <w:color w:val="8A6D1F"/>
-          <w:sz w:val="22"/>
-          <w:szCs w:val="22"/>
-        </w:rPr>
-        <w:t xml:space="preserve">7. Job Detail — Match Score  ·  /jobs/[id]</w:t>
-      </w:r>
-    </w:p>
-    <w:p>
-      <w:pPr>
-        <w:spacing w:after="110" w:line="268"/>
-      </w:pPr>
-      <w:r>
-        <w:rPr>
-          <w:rFonts w:ascii="Arial" w:cs="Arial" w:eastAsia="Arial" w:hAnsi="Arial"/>
-          <w:b/>
-          <w:bCs/>
-          <w:color w:val="2D3436"/>
-          <w:sz w:val="21"/>
-          <w:szCs w:val="21"/>
-        </w:rPr>
-        <w:t xml:space="preserve">Purpose: </w:t>
-      </w:r>
-      <w:r>
-        <w:rPr>
-          <w:rFonts w:ascii="Arial" w:cs="Arial" w:eastAsia="Arial" w:hAnsi="Arial"/>
-          <w:color w:val="2D3436"/>
-          <w:sz w:val="21"/>
-          <w:szCs w:val="21"/>
-        </w:rPr>
-        <w:t xml:space="preserve">Answer "do I fit THIS role, and why?" — not just a skills tick-list.</w:t>
-      </w:r>
-    </w:p>
-    <w:p>
-      <w:pPr>
-        <w:spacing w:after="110" w:line="268"/>
-      </w:pPr>
-      <w:r>
-        <w:rPr>
-          <w:rFonts w:ascii="Arial" w:cs="Arial" w:eastAsia="Arial" w:hAnsi="Arial"/>
-          <w:b/>
-          <w:bCs/>
-          <w:color w:val="2D3436"/>
-          <w:sz w:val="21"/>
-          <w:szCs w:val="21"/>
-        </w:rPr>
-        <w:t xml:space="preserve">How it works: </w:t>
-      </w:r>
-      <w:r>
-        <w:rPr>
-          <w:rFonts w:ascii="Arial" w:cs="Arial" w:eastAsia="Arial" w:hAnsi="Arial"/>
-          <w:color w:val="2D3436"/>
-          <w:sz w:val="21"/>
-          <w:szCs w:val="21"/>
-        </w:rPr>
-        <w:t xml:space="preserve">matchScore() scores six weighted dimensions with a reason for each, then lists matched/missing skills and an apply verdict (Strong apply / Close 1 gap / Stretch).</w:t>
-      </w:r>
-    </w:p>
-    <w:p>
-      <w:pPr>
-        <w:spacing w:after="110" w:line="268"/>
-      </w:pPr>
-      <w:r>
-        <w:rPr>
-          <w:rFonts w:ascii="Arial" w:cs="Arial" w:eastAsia="Arial" w:hAnsi="Arial"/>
-          <w:b/>
-          <w:bCs/>
-          <w:color w:val="2D3436"/>
-          <w:sz w:val="21"/>
-          <w:szCs w:val="21"/>
-        </w:rPr>
-        <w:t xml:space="preserve">Data source: </w:t>
-      </w:r>
-      <w:r>
-        <w:rPr>
-          <w:rFonts w:ascii="Arial" w:cs="Arial" w:eastAsia="Arial" w:hAnsi="Arial"/>
-          <w:color w:val="2D3436"/>
-          <w:sz w:val="21"/>
-          <w:szCs w:val="21"/>
-        </w:rPr>
-        <w:t xml:space="preserve">mockJobs + jobDetails + careerProfile.</w:t>
-      </w:r>
-    </w:p>
-    <w:p>
-      <w:pPr>
-        <w:spacing w:after="110" w:line="268"/>
-      </w:pPr>
-      <w:r>
-        <w:rPr>
-          <w:rFonts w:ascii="Arial" w:cs="Arial" w:eastAsia="Arial" w:hAnsi="Arial"/>
-          <w:b/>
-          <w:bCs/>
-          <w:color w:val="2D3436"/>
-          <w:sz w:val="21"/>
-          <w:szCs w:val="21"/>
-        </w:rPr>
-        <w:t xml:space="preserve">API: </w:t>
-      </w:r>
-      <w:r>
-        <w:rPr>
-          <w:rFonts w:ascii="Arial" w:cs="Arial" w:eastAsia="Arial" w:hAnsi="Arial"/>
-          <w:b/>
-          <w:bCs/>
-          <w:color w:val="00795C"/>
-          <w:sz w:val="21"/>
-          <w:szCs w:val="21"/>
-        </w:rPr>
-        <w:t xml:space="preserve">None — deterministic and explainable</w:t>
-      </w:r>
-    </w:p>
-    <w:p>
-      <w:pPr>
-        <w:pStyle w:val="Heading3"/>
-        <w:spacing w:after="70" w:before="200"/>
-      </w:pPr>
-      <w:r>
-        <w:rPr>
-          <w:rFonts w:ascii="Arial" w:cs="Arial" w:eastAsia="Arial" w:hAnsi="Arial"/>
-          <w:b/>
-          <w:bCs/>
-          <w:color w:val="8A6D1F"/>
-          <w:sz w:val="22"/>
-          <w:szCs w:val="22"/>
-        </w:rPr>
-        <w:t xml:space="preserve">8. My Applications  ·  /applications</w:t>
-      </w:r>
-    </w:p>
-    <w:p>
-      <w:pPr>
-        <w:spacing w:after="110" w:line="268"/>
-      </w:pPr>
-      <w:r>
-        <w:rPr>
-          <w:rFonts w:ascii="Arial" w:cs="Arial" w:eastAsia="Arial" w:hAnsi="Arial"/>
-          <w:b/>
-          <w:bCs/>
-          <w:color w:val="2D3436"/>
-          <w:sz w:val="21"/>
-          <w:szCs w:val="21"/>
-        </w:rPr>
-        <w:t xml:space="preserve">Purpose: </w:t>
-      </w:r>
-      <w:r>
-        <w:rPr>
-          <w:rFonts w:ascii="Arial" w:cs="Arial" w:eastAsia="Arial" w:hAnsi="Arial"/>
-          <w:color w:val="2D3436"/>
-          <w:sz w:val="21"/>
-          <w:szCs w:val="21"/>
-        </w:rPr>
-        <w:t xml:space="preserve">Close the loop after applying — no more black hole.</w:t>
-      </w:r>
-    </w:p>
-    <w:p>
-      <w:pPr>
-        <w:spacing w:after="110" w:line="268"/>
-      </w:pPr>
-      <w:r>
-        <w:rPr>
-          <w:rFonts w:ascii="Arial" w:cs="Arial" w:eastAsia="Arial" w:hAnsi="Arial"/>
-          <w:b/>
-          <w:bCs/>
-          <w:color w:val="2D3436"/>
-          <w:sz w:val="21"/>
-          <w:szCs w:val="21"/>
-        </w:rPr>
-        <w:t xml:space="preserve">How it works: </w:t>
-      </w:r>
-      <w:r>
-        <w:rPr>
-          <w:rFonts w:ascii="Arial" w:cs="Arial" w:eastAsia="Arial" w:hAnsi="Arial"/>
-          <w:color w:val="2D3436"/>
-          <w:sz w:val="21"/>
-          <w:szCs w:val="21"/>
-        </w:rPr>
-        <w:t xml:space="preserve">Applications persist to localStorage; each row shows a 4-stage pipeline (Applied → Under Review → Interview → Offer), the Anti-Ghost rating and a next step. Stalled ones flagged amber.</w:t>
-      </w:r>
-    </w:p>
-    <w:p>
-      <w:pPr>
-        <w:spacing w:after="110" w:line="268"/>
-      </w:pPr>
-      <w:r>
-        <w:rPr>
-          <w:rFonts w:ascii="Arial" w:cs="Arial" w:eastAsia="Arial" w:hAnsi="Arial"/>
-          <w:b/>
-          <w:bCs/>
-          <w:color w:val="2D3436"/>
-          <w:sz w:val="21"/>
-          <w:szCs w:val="21"/>
-        </w:rPr>
-        <w:t xml:space="preserve">Data source: </w:t>
-      </w:r>
-      <w:r>
-        <w:rPr>
-          <w:rFonts w:ascii="Arial" w:cs="Arial" w:eastAsia="Arial" w:hAnsi="Arial"/>
-          <w:color w:val="2D3436"/>
-          <w:sz w:val="21"/>
-          <w:szCs w:val="21"/>
-        </w:rPr>
-        <w:t xml:space="preserve">myApplications (localStorage) + mockApplications for varied demo stages.</w:t>
-      </w:r>
-    </w:p>
-    <w:p>
-      <w:pPr>
-        <w:spacing w:after="110" w:line="268"/>
-      </w:pPr>
-      <w:r>
-        <w:rPr>
-          <w:rFonts w:ascii="Arial" w:cs="Arial" w:eastAsia="Arial" w:hAnsi="Arial"/>
-          <w:b/>
-          <w:bCs/>
-          <w:color w:val="2D3436"/>
-          <w:sz w:val="21"/>
-          <w:szCs w:val="21"/>
-        </w:rPr>
-        <w:t xml:space="preserve">API: </w:t>
-      </w:r>
-      <w:r>
-        <w:rPr>
-          <w:rFonts w:ascii="Arial" w:cs="Arial" w:eastAsia="Arial" w:hAnsi="Arial"/>
-          <w:b w:val="false"/>
-          <w:bCs w:val="false"/>
-          <w:color w:val="5A6570"/>
-          <w:sz w:val="21"/>
-          <w:szCs w:val="21"/>
-        </w:rPr>
-        <w:t xml:space="preserve">None</w:t>
-      </w:r>
-    </w:p>
-    <w:p>
-      <w:pPr>
-        <w:pStyle w:val="Heading3"/>
-        <w:spacing w:after="70" w:before="200"/>
-      </w:pPr>
-      <w:r>
-        <w:rPr>
-          <w:rFonts w:ascii="Arial" w:cs="Arial" w:eastAsia="Arial" w:hAnsi="Arial"/>
-          <w:b/>
-          <w:bCs/>
-          <w:color w:val="8A6D1F"/>
-          <w:sz w:val="22"/>
-          <w:szCs w:val="22"/>
-        </w:rPr>
-        <w:t xml:space="preserve">9. Company Directory  ·  /companies</w:t>
-      </w:r>
-    </w:p>
-    <w:p>
-      <w:pPr>
-        <w:spacing w:after="110" w:line="268"/>
-      </w:pPr>
-      <w:r>
-        <w:rPr>
-          <w:rFonts w:ascii="Arial" w:cs="Arial" w:eastAsia="Arial" w:hAnsi="Arial"/>
-          <w:b/>
-          <w:bCs/>
-          <w:color w:val="2D3436"/>
-          <w:sz w:val="21"/>
-          <w:szCs w:val="21"/>
-        </w:rPr>
-        <w:t xml:space="preserve">Purpose: </w:t>
-      </w:r>
-      <w:r>
-        <w:rPr>
-          <w:rFonts w:ascii="Arial" w:cs="Arial" w:eastAsia="Arial" w:hAnsi="Arial"/>
-          <w:color w:val="2D3436"/>
-          <w:sz w:val="21"/>
-          <w:szCs w:val="21"/>
-        </w:rPr>
-        <w:t xml:space="preserve">Let candidates judge an employer before applying.</w:t>
-      </w:r>
-    </w:p>
-    <w:p>
-      <w:pPr>
-        <w:spacing w:after="110" w:line="268"/>
-      </w:pPr>
-      <w:r>
-        <w:rPr>
-          <w:rFonts w:ascii="Arial" w:cs="Arial" w:eastAsia="Arial" w:hAnsi="Arial"/>
-          <w:b/>
-          <w:bCs/>
-          <w:color w:val="2D3436"/>
-          <w:sz w:val="21"/>
-          <w:szCs w:val="21"/>
-        </w:rPr>
-        <w:t xml:space="preserve">How it works: </w:t>
-      </w:r>
-      <w:r>
-        <w:rPr>
-          <w:rFonts w:ascii="Arial" w:cs="Arial" w:eastAsia="Arial" w:hAnsi="Arial"/>
-          <w:color w:val="2D3436"/>
-          <w:sz w:val="21"/>
-          <w:szCs w:val="21"/>
-        </w:rPr>
-        <w:t xml:space="preserve">Verified badges, years as Talentbank partner, ratings, Anti-Ghost scores, culture signals, candidate reviews and open roles. Links out to Glassdoor.</w:t>
-      </w:r>
-    </w:p>
-    <w:p>
-      <w:pPr>
-        <w:spacing w:after="110" w:line="268"/>
-      </w:pPr>
-      <w:r>
-        <w:rPr>
-          <w:rFonts w:ascii="Arial" w:cs="Arial" w:eastAsia="Arial" w:hAnsi="Arial"/>
-          <w:b/>
-          <w:bCs/>
-          <w:color w:val="2D3436"/>
-          <w:sz w:val="21"/>
-          <w:szCs w:val="21"/>
-        </w:rPr>
-        <w:t xml:space="preserve">Data source: </w:t>
-      </w:r>
-      <w:r>
-        <w:rPr>
-          <w:rFonts w:ascii="Arial" w:cs="Arial" w:eastAsia="Arial" w:hAnsi="Arial"/>
-          <w:color w:val="2D3436"/>
-          <w:sz w:val="21"/>
-          <w:szCs w:val="21"/>
-        </w:rPr>
-        <w:t xml:space="preserve">mockCompanies; reviews from getCompanyReviews().</w:t>
-      </w:r>
-    </w:p>
-    <w:p>
-      <w:pPr>
-        <w:spacing w:after="110" w:line="268"/>
-      </w:pPr>
-      <w:r>
-        <w:rPr>
-          <w:rFonts w:ascii="Arial" w:cs="Arial" w:eastAsia="Arial" w:hAnsi="Arial"/>
-          <w:b/>
-          <w:bCs/>
-          <w:color w:val="2D3436"/>
-          <w:sz w:val="21"/>
-          <w:szCs w:val="21"/>
-        </w:rPr>
-        <w:t xml:space="preserve">API: </w:t>
-      </w:r>
-      <w:r>
-        <w:rPr>
-          <w:rFonts w:ascii="Arial" w:cs="Arial" w:eastAsia="Arial" w:hAnsi="Arial"/>
-          <w:b/>
-          <w:bCs/>
-          <w:color w:val="00795C"/>
-          <w:sz w:val="21"/>
-          <w:szCs w:val="21"/>
-        </w:rPr>
-        <w:t xml:space="preserve">None (Glassdoor is an outbound link)</w:t>
-      </w:r>
-    </w:p>
-    <w:p>
-      <w:pPr>
-        <w:pStyle w:val="Heading3"/>
-        <w:spacing w:after="70" w:before="200"/>
-      </w:pPr>
-      <w:r>
-        <w:rPr>
-          <w:rFonts w:ascii="Arial" w:cs="Arial" w:eastAsia="Arial" w:hAnsi="Arial"/>
-          <w:b/>
-          <w:bCs/>
-          <w:color w:val="8A6D1F"/>
-          <w:sz w:val="22"/>
-          <w:szCs w:val="22"/>
-        </w:rPr>
-        <w:t xml:space="preserve">10. YourAnimal Test  ·  /aptitude-test</w:t>
-      </w:r>
-    </w:p>
-    <w:p>
-      <w:pPr>
-        <w:spacing w:after="110" w:line="268"/>
-      </w:pPr>
-      <w:r>
-        <w:rPr>
-          <w:rFonts w:ascii="Arial" w:cs="Arial" w:eastAsia="Arial" w:hAnsi="Arial"/>
-          <w:b/>
-          <w:bCs/>
-          <w:color w:val="2D3436"/>
-          <w:sz w:val="21"/>
-          <w:szCs w:val="21"/>
-        </w:rPr>
-        <w:t xml:space="preserve">Purpose: </w:t>
-      </w:r>
-      <w:r>
-        <w:rPr>
-          <w:rFonts w:ascii="Arial" w:cs="Arial" w:eastAsia="Arial" w:hAnsi="Arial"/>
-          <w:color w:val="2D3436"/>
-          <w:sz w:val="21"/>
-          <w:szCs w:val="21"/>
-        </w:rPr>
-        <w:t xml:space="preserve">Talentbank's mandatory personality assessment, used as a career-fit and culture signal.</w:t>
-      </w:r>
-    </w:p>
-    <w:p>
-      <w:pPr>
-        <w:spacing w:after="110" w:line="268"/>
-      </w:pPr>
-      <w:r>
-        <w:rPr>
-          <w:rFonts w:ascii="Arial" w:cs="Arial" w:eastAsia="Arial" w:hAnsi="Arial"/>
-          <w:b/>
-          <w:bCs/>
-          <w:color w:val="2D3436"/>
-          <w:sz w:val="21"/>
-          <w:szCs w:val="21"/>
-        </w:rPr>
-        <w:t xml:space="preserve">How it works: </w:t>
-      </w:r>
-      <w:r>
-        <w:rPr>
-          <w:rFonts w:ascii="Arial" w:cs="Arial" w:eastAsia="Arial" w:hAnsi="Arial"/>
-          <w:color w:val="2D3436"/>
-          <w:sz w:val="21"/>
-          <w:szCs w:val="21"/>
-        </w:rPr>
-        <w:t xml:space="preserve">The full 40-question assessment mapping to five work animals (Lion, Owl, Dolphin, Fox, Wolf), each with work style, predicted trajectory and best-fit roles. Saved to the profile and shown to employers.</w:t>
-      </w:r>
-    </w:p>
-    <w:p>
-      <w:pPr>
-        <w:spacing w:after="110" w:line="268"/>
-      </w:pPr>
-      <w:r>
-        <w:rPr>
-          <w:rFonts w:ascii="Arial" w:cs="Arial" w:eastAsia="Arial" w:hAnsi="Arial"/>
-          <w:b/>
-          <w:bCs/>
-          <w:color w:val="2D3436"/>
-          <w:sz w:val="21"/>
-          <w:szCs w:val="21"/>
-        </w:rPr>
-        <w:t xml:space="preserve">Data source: </w:t>
-      </w:r>
-      <w:r>
-        <w:rPr>
-          <w:rFonts w:ascii="Arial" w:cs="Arial" w:eastAsia="Arial" w:hAnsi="Arial"/>
-          <w:color w:val="2D3436"/>
-          <w:sz w:val="21"/>
-          <w:szCs w:val="21"/>
-        </w:rPr>
-        <w:t xml:space="preserve">lib/animalTest.ts. Attribution to yourworkanimal.com.</w:t>
-      </w:r>
-    </w:p>
-    <w:p>
-      <w:pPr>
-        <w:spacing w:after="110" w:line="268"/>
-      </w:pPr>
-      <w:r>
-        <w:rPr>
-          <w:rFonts w:ascii="Arial" w:cs="Arial" w:eastAsia="Arial" w:hAnsi="Arial"/>
-          <w:b/>
-          <w:bCs/>
-          <w:color w:val="2D3436"/>
-          <w:sz w:val="21"/>
-          <w:szCs w:val="21"/>
-        </w:rPr>
-        <w:t xml:space="preserve">API: </w:t>
-      </w:r>
-      <w:r>
-        <w:rPr>
-          <w:rFonts w:ascii="Arial" w:cs="Arial" w:eastAsia="Arial" w:hAnsi="Arial"/>
-          <w:b w:val="false"/>
-          <w:bCs w:val="false"/>
-          <w:color w:val="5A6570"/>
-          <w:sz w:val="21"/>
-          <w:szCs w:val="21"/>
-        </w:rPr>
-        <w:t xml:space="preserve">None</w:t>
-      </w:r>
-    </w:p>
-    <w:p>
-      <w:pPr>
-        <w:pStyle w:val="Heading3"/>
-        <w:spacing w:after="70" w:before="200"/>
-      </w:pPr>
-      <w:r>
-        <w:rPr>
-          <w:rFonts w:ascii="Arial" w:cs="Arial" w:eastAsia="Arial" w:hAnsi="Arial"/>
-          <w:b/>
-          <w:bCs/>
-          <w:color w:val="8A6D1F"/>
-          <w:sz w:val="22"/>
-          <w:szCs w:val="22"/>
-        </w:rPr>
-        <w:t xml:space="preserve">11. My Story Video  ·  /story-video</w:t>
-      </w:r>
-    </w:p>
-    <w:p>
-      <w:pPr>
-        <w:spacing w:after="110" w:line="268"/>
-      </w:pPr>
-      <w:r>
-        <w:rPr>
-          <w:rFonts w:ascii="Arial" w:cs="Arial" w:eastAsia="Arial" w:hAnsi="Arial"/>
-          <w:b/>
-          <w:bCs/>
-          <w:color w:val="2D3436"/>
-          <w:sz w:val="21"/>
-          <w:szCs w:val="21"/>
-        </w:rPr>
-        <w:t xml:space="preserve">Purpose: </w:t>
-      </w:r>
-      <w:r>
-        <w:rPr>
-          <w:rFonts w:ascii="Arial" w:cs="Arial" w:eastAsia="Arial" w:hAnsi="Arial"/>
-          <w:color w:val="2D3436"/>
-          <w:sz w:val="21"/>
-          <w:szCs w:val="21"/>
-        </w:rPr>
-        <w:t xml:space="preserve">The one place a candidate stops being a score and becomes a person.</w:t>
-      </w:r>
-    </w:p>
-    <w:p>
-      <w:pPr>
-        <w:spacing w:after="110" w:line="268"/>
-      </w:pPr>
-      <w:r>
-        <w:rPr>
-          <w:rFonts w:ascii="Arial" w:cs="Arial" w:eastAsia="Arial" w:hAnsi="Arial"/>
-          <w:b/>
-          <w:bCs/>
-          <w:color w:val="2D3436"/>
-          <w:sz w:val="21"/>
-          <w:szCs w:val="21"/>
-        </w:rPr>
-        <w:t xml:space="preserve">How it works: </w:t>
-      </w:r>
-      <w:r>
-        <w:rPr>
-          <w:rFonts w:ascii="Arial" w:cs="Arial" w:eastAsia="Arial" w:hAnsi="Arial"/>
-          <w:color w:val="2D3436"/>
-          <w:sz w:val="21"/>
-          <w:szCs w:val="21"/>
-        </w:rPr>
-        <w:t xml:space="preserve">A guided 60-second video with four prompts that advance as a teleprompter. Uses the real camera (getUserMedia + MediaRecorder); if denied it runs a simulated recording so the demo never breaks. Privacy toggles control visibility.</w:t>
-      </w:r>
-    </w:p>
-    <w:p>
-      <w:pPr>
-        <w:spacing w:after="110" w:line="268"/>
-      </w:pPr>
-      <w:r>
-        <w:rPr>
-          <w:rFonts w:ascii="Arial" w:cs="Arial" w:eastAsia="Arial" w:hAnsi="Arial"/>
-          <w:b/>
-          <w:bCs/>
-          <w:color w:val="2D3436"/>
-          <w:sz w:val="21"/>
-          <w:szCs w:val="21"/>
-        </w:rPr>
-        <w:t xml:space="preserve">Data source: </w:t>
-      </w:r>
-      <w:r>
-        <w:rPr>
-          <w:rFonts w:ascii="Arial" w:cs="Arial" w:eastAsia="Arial" w:hAnsi="Arial"/>
-          <w:color w:val="2D3436"/>
-          <w:sz w:val="21"/>
-          <w:szCs w:val="21"/>
-        </w:rPr>
-        <w:t xml:space="preserve">Prompts/metadata in lib/storyVideo.ts; recording held in browser memory only — nothing uploaded.</w:t>
-      </w:r>
-    </w:p>
-    <w:p>
-      <w:pPr>
-        <w:spacing w:after="110" w:line="268"/>
-      </w:pPr>
-      <w:r>
-        <w:rPr>
-          <w:rFonts w:ascii="Arial" w:cs="Arial" w:eastAsia="Arial" w:hAnsi="Arial"/>
-          <w:b/>
-          <w:bCs/>
-          <w:color w:val="2D3436"/>
-          <w:sz w:val="21"/>
-          <w:szCs w:val="21"/>
-        </w:rPr>
-        <w:t xml:space="preserve">API: </w:t>
-      </w:r>
-      <w:r>
-        <w:rPr>
-          <w:rFonts w:ascii="Arial" w:cs="Arial" w:eastAsia="Arial" w:hAnsi="Arial"/>
-          <w:b w:val="false"/>
-          <w:bCs w:val="false"/>
-          <w:color w:val="5A6570"/>
-          <w:sz w:val="21"/>
-          <w:szCs w:val="21"/>
-        </w:rPr>
-        <w:t xml:space="preserve">None</w:t>
-      </w:r>
-    </w:p>
-    <w:p>
-      <w:pPr>
-        <w:pStyle w:val="Heading3"/>
-        <w:spacing w:after="70" w:before="200"/>
-      </w:pPr>
-      <w:r>
-        <w:rPr>
-          <w:rFonts w:ascii="Arial" w:cs="Arial" w:eastAsia="Arial" w:hAnsi="Arial"/>
-          <w:b/>
-          <w:bCs/>
-          <w:color w:val="8A6D1F"/>
-          <w:sz w:val="22"/>
-          <w:szCs w:val="22"/>
-        </w:rPr>
-        <w:t xml:space="preserve">13. Employer Dashboard  ·  /employer</w:t>
-      </w:r>
-    </w:p>
-    <w:p>
-      <w:pPr>
-        <w:spacing w:after="110" w:line="268"/>
-      </w:pPr>
-      <w:r>
-        <w:rPr>
-          <w:rFonts w:ascii="Arial" w:cs="Arial" w:eastAsia="Arial" w:hAnsi="Arial"/>
-          <w:b/>
-          <w:bCs/>
-          <w:color w:val="2D3436"/>
-          <w:sz w:val="21"/>
-          <w:szCs w:val="21"/>
-        </w:rPr>
-        <w:t xml:space="preserve">Purpose: </w:t>
-      </w:r>
-      <w:r>
-        <w:rPr>
-          <w:rFonts w:ascii="Arial" w:cs="Arial" w:eastAsia="Arial" w:hAnsi="Arial"/>
-          <w:color w:val="2D3436"/>
-          <w:sz w:val="21"/>
-          <w:szCs w:val="21"/>
-        </w:rPr>
-        <w:t xml:space="preserve">Make hiring accountable, not just efficient.</w:t>
-      </w:r>
-    </w:p>
-    <w:p>
-      <w:pPr>
-        <w:spacing w:after="110" w:line="268"/>
-      </w:pPr>
-      <w:r>
-        <w:rPr>
-          <w:rFonts w:ascii="Arial" w:cs="Arial" w:eastAsia="Arial" w:hAnsi="Arial"/>
-          <w:b/>
-          <w:bCs/>
-          <w:color w:val="2D3436"/>
-          <w:sz w:val="21"/>
-          <w:szCs w:val="21"/>
-        </w:rPr>
-        <w:t xml:space="preserve">How it works: </w:t>
-      </w:r>
-      <w:r>
-        <w:rPr>
-          <w:rFonts w:ascii="Arial" w:cs="Arial" w:eastAsia="Arial" w:hAnsi="Arial"/>
-          <w:color w:val="2D3436"/>
-          <w:sz w:val="21"/>
-          <w:szCs w:val="21"/>
-        </w:rPr>
-        <w:t xml:space="preserve">Shows the employer's own Anti-Ghost score (response time, ghosting rate, 6-week trend) alongside applicants ranked by CRS and tagged with YourAnimal culture fit.</w:t>
-      </w:r>
-    </w:p>
-    <w:p>
-      <w:pPr>
-        <w:spacing w:after="110" w:line="268"/>
-      </w:pPr>
-      <w:r>
-        <w:rPr>
-          <w:rFonts w:ascii="Arial" w:cs="Arial" w:eastAsia="Arial" w:hAnsi="Arial"/>
-          <w:b/>
-          <w:bCs/>
-          <w:color w:val="2D3436"/>
-          <w:sz w:val="21"/>
-          <w:szCs w:val="21"/>
-        </w:rPr>
-        <w:t xml:space="preserve">Data source: </w:t>
-      </w:r>
-      <w:r>
-        <w:rPr>
-          <w:rFonts w:ascii="Arial" w:cs="Arial" w:eastAsia="Arial" w:hAnsi="Arial"/>
-          <w:color w:val="2D3436"/>
-          <w:sz w:val="21"/>
-          <w:szCs w:val="21"/>
-        </w:rPr>
-        <w:t xml:space="preserve">mockEmployerStats + the shared candidate pool — the same people the university sees.</w:t>
-      </w:r>
-    </w:p>
-    <w:p>
-      <w:pPr>
-        <w:spacing w:after="110" w:line="268"/>
-      </w:pPr>
-      <w:r>
-        <w:rPr>
-          <w:rFonts w:ascii="Arial" w:cs="Arial" w:eastAsia="Arial" w:hAnsi="Arial"/>
-          <w:b/>
-          <w:bCs/>
-          <w:color w:val="2D3436"/>
-          <w:sz w:val="21"/>
-          <w:szCs w:val="21"/>
-        </w:rPr>
-        <w:t xml:space="preserve">API: </w:t>
-      </w:r>
-      <w:r>
-        <w:rPr>
-          <w:rFonts w:ascii="Arial" w:cs="Arial" w:eastAsia="Arial" w:hAnsi="Arial"/>
-          <w:b w:val="false"/>
-          <w:bCs w:val="false"/>
-          <w:color w:val="5A6570"/>
-          <w:sz w:val="21"/>
-          <w:szCs w:val="21"/>
-        </w:rPr>
-        <w:t xml:space="preserve">None</w:t>
-      </w:r>
-    </w:p>
-    <w:p>
-      <w:pPr>
-        <w:pStyle w:val="Heading3"/>
-        <w:spacing w:after="70" w:before="200"/>
-      </w:pPr>
-      <w:r>
-        <w:rPr>
-          <w:rFonts w:ascii="Arial" w:cs="Arial" w:eastAsia="Arial" w:hAnsi="Arial"/>
-          <w:b/>
-          <w:bCs/>
-          <w:color w:val="8A6D1F"/>
-          <w:sz w:val="22"/>
-          <w:szCs w:val="22"/>
-        </w:rPr>
-        <w:t xml:space="preserve">14. Applicant Detail  ·  /employer/applicants/[id]</w:t>
-      </w:r>
-    </w:p>
-    <w:p>
-      <w:pPr>
-        <w:spacing w:after="110" w:line="268"/>
-      </w:pPr>
-      <w:r>
-        <w:rPr>
-          <w:rFonts w:ascii="Arial" w:cs="Arial" w:eastAsia="Arial" w:hAnsi="Arial"/>
-          <w:b/>
-          <w:bCs/>
-          <w:color w:val="2D3436"/>
-          <w:sz w:val="21"/>
-          <w:szCs w:val="21"/>
-        </w:rPr>
-        <w:t xml:space="preserve">Purpose: </w:t>
-      </w:r>
-      <w:r>
-        <w:rPr>
-          <w:rFonts w:ascii="Arial" w:cs="Arial" w:eastAsia="Arial" w:hAnsi="Arial"/>
-          <w:color w:val="2D3436"/>
-          <w:sz w:val="21"/>
-          <w:szCs w:val="21"/>
-        </w:rPr>
-        <w:t xml:space="preserve">Everything a hiring manager needs on one screen.</w:t>
-      </w:r>
-    </w:p>
-    <w:p>
-      <w:pPr>
-        <w:spacing w:after="110" w:line="268"/>
-      </w:pPr>
-      <w:r>
-        <w:rPr>
-          <w:rFonts w:ascii="Arial" w:cs="Arial" w:eastAsia="Arial" w:hAnsi="Arial"/>
-          <w:b/>
-          <w:bCs/>
-          <w:color w:val="2D3436"/>
-          <w:sz w:val="21"/>
-          <w:szCs w:val="21"/>
-        </w:rPr>
-        <w:t xml:space="preserve">How it works: </w:t>
-      </w:r>
-      <w:r>
-        <w:rPr>
-          <w:rFonts w:ascii="Arial" w:cs="Arial" w:eastAsia="Arial" w:hAnsi="Arial"/>
-          <w:color w:val="2D3436"/>
-          <w:sz w:val="21"/>
-          <w:szCs w:val="21"/>
-        </w:rPr>
-        <w:t xml:space="preserve">Readiness score and risk band, a "Match to this role" card scoring the candidate against the job they applied for, ending with gaps to probe in interview, plus their Story Video and an A4-style resume.</w:t>
-      </w:r>
-    </w:p>
-    <w:p>
-      <w:pPr>
-        <w:spacing w:after="110" w:line="268"/>
-      </w:pPr>
-      <w:r>
-        <w:rPr>
-          <w:rFonts w:ascii="Arial" w:cs="Arial" w:eastAsia="Arial" w:hAnsi="Arial"/>
-          <w:b/>
-          <w:bCs/>
-          <w:color w:val="2D3436"/>
-          <w:sz w:val="21"/>
-          <w:szCs w:val="21"/>
-        </w:rPr>
-        <w:t xml:space="preserve">Data source: </w:t>
-      </w:r>
-      <w:r>
-        <w:rPr>
-          <w:rFonts w:ascii="Arial" w:cs="Arial" w:eastAsia="Arial" w:hAnsi="Arial"/>
-          <w:color w:val="2D3436"/>
-          <w:sz w:val="21"/>
-          <w:szCs w:val="21"/>
-        </w:rPr>
-        <w:t xml:space="preserve">Shared candidates array + applicantRoles mapping.</w:t>
-      </w:r>
-    </w:p>
-    <w:p>
-      <w:pPr>
-        <w:spacing w:after="110" w:line="268"/>
-      </w:pPr>
-      <w:r>
-        <w:rPr>
-          <w:rFonts w:ascii="Arial" w:cs="Arial" w:eastAsia="Arial" w:hAnsi="Arial"/>
-          <w:b/>
-          <w:bCs/>
-          <w:color w:val="2D3436"/>
-          <w:sz w:val="21"/>
-          <w:szCs w:val="21"/>
-        </w:rPr>
-        <w:t xml:space="preserve">API: </w:t>
-      </w:r>
-      <w:r>
-        <w:rPr>
-          <w:rFonts w:ascii="Arial" w:cs="Arial" w:eastAsia="Arial" w:hAnsi="Arial"/>
-          <w:b w:val="false"/>
-          <w:bCs w:val="false"/>
-          <w:color w:val="5A6570"/>
-          <w:sz w:val="21"/>
-          <w:szCs w:val="21"/>
-        </w:rPr>
-        <w:t xml:space="preserve">None</w:t>
-      </w:r>
-    </w:p>
-    <w:p>
-      <w:pPr>
-        <w:pStyle w:val="Heading3"/>
-        <w:spacing w:after="70" w:before="200"/>
-      </w:pPr>
-      <w:r>
-        <w:rPr>
-          <w:rFonts w:ascii="Arial" w:cs="Arial" w:eastAsia="Arial" w:hAnsi="Arial"/>
-          <w:b/>
-          <w:bCs/>
-          <w:color w:val="8A6D1F"/>
-          <w:sz w:val="22"/>
-          <w:szCs w:val="22"/>
-        </w:rPr>
-        <w:t xml:space="preserve">15. Employability Dashboard  ·  /university</w:t>
-      </w:r>
-    </w:p>
-    <w:p>
-      <w:pPr>
-        <w:spacing w:after="110" w:line="268"/>
-      </w:pPr>
-      <w:r>
-        <w:rPr>
-          <w:rFonts w:ascii="Arial" w:cs="Arial" w:eastAsia="Arial" w:hAnsi="Arial"/>
-          <w:b/>
-          <w:bCs/>
-          <w:color w:val="2D3436"/>
-          <w:sz w:val="21"/>
-          <w:szCs w:val="21"/>
-        </w:rPr>
-        <w:t xml:space="preserve">Purpose: </w:t>
-      </w:r>
-      <w:r>
-        <w:rPr>
-          <w:rFonts w:ascii="Arial" w:cs="Arial" w:eastAsia="Arial" w:hAnsi="Arial"/>
-          <w:color w:val="2D3436"/>
-          <w:sz w:val="21"/>
-          <w:szCs w:val="21"/>
-        </w:rPr>
-        <w:t xml:space="preserve">Answer "which students are career-ready, and which are at risk?" — while there is still time to help.</w:t>
-      </w:r>
-    </w:p>
-    <w:p>
-      <w:pPr>
-        <w:spacing w:after="110" w:line="268"/>
-      </w:pPr>
-      <w:r>
-        <w:rPr>
-          <w:rFonts w:ascii="Arial" w:cs="Arial" w:eastAsia="Arial" w:hAnsi="Arial"/>
-          <w:b/>
-          <w:bCs/>
-          <w:color w:val="2D3436"/>
-          <w:sz w:val="21"/>
-          <w:szCs w:val="21"/>
-        </w:rPr>
-        <w:t xml:space="preserve">How it works: </w:t>
-      </w:r>
-      <w:r>
-        <w:rPr>
-          <w:rFonts w:ascii="Arial" w:cs="Arial" w:eastAsia="Arial" w:hAnsi="Arial"/>
-          <w:color w:val="2D3436"/>
-          <w:sz w:val="21"/>
-          <w:szCs w:val="21"/>
-        </w:rPr>
-        <w:t xml:space="preserve">Aggregates the same candidate pool into cohort readiness, at-risk counts, average ATS, portfolio completion and 12-month retention, plus an AI-style insight naming the programme needing most support.</w:t>
-      </w:r>
-    </w:p>
-    <w:p>
-      <w:pPr>
-        <w:spacing w:after="110" w:line="268"/>
-      </w:pPr>
-      <w:r>
-        <w:rPr>
-          <w:rFonts w:ascii="Arial" w:cs="Arial" w:eastAsia="Arial" w:hAnsi="Arial"/>
-          <w:b/>
-          <w:bCs/>
-          <w:color w:val="2D3436"/>
-          <w:sz w:val="21"/>
-          <w:szCs w:val="21"/>
-        </w:rPr>
-        <w:t xml:space="preserve">Data source: </w:t>
-      </w:r>
-      <w:r>
-        <w:rPr>
-          <w:rFonts w:ascii="Arial" w:cs="Arial" w:eastAsia="Arial" w:hAnsi="Arial"/>
-          <w:color w:val="2D3436"/>
-          <w:sz w:val="21"/>
-          <w:szCs w:val="21"/>
-        </w:rPr>
-        <w:t xml:space="preserve">Derived live from candidates + mockUniversityStats.</w:t>
-      </w:r>
-    </w:p>
-    <w:p>
-      <w:pPr>
-        <w:spacing w:after="110" w:line="268"/>
-      </w:pPr>
-      <w:r>
-        <w:rPr>
-          <w:rFonts w:ascii="Arial" w:cs="Arial" w:eastAsia="Arial" w:hAnsi="Arial"/>
-          <w:b/>
-          <w:bCs/>
-          <w:color w:val="2D3436"/>
-          <w:sz w:val="21"/>
-          <w:szCs w:val="21"/>
-        </w:rPr>
-        <w:t xml:space="preserve">API: </w:t>
-      </w:r>
-      <w:r>
-        <w:rPr>
-          <w:rFonts w:ascii="Arial" w:cs="Arial" w:eastAsia="Arial" w:hAnsi="Arial"/>
-          <w:b w:val="false"/>
-          <w:bCs w:val="false"/>
-          <w:color w:val="5A6570"/>
-          <w:sz w:val="21"/>
-          <w:szCs w:val="21"/>
-        </w:rPr>
-        <w:t xml:space="preserve">None</w:t>
-      </w:r>
-    </w:p>
-    <w:p>
-      <w:pPr>
-        <w:pStyle w:val="Heading3"/>
-        <w:spacing w:after="70" w:before="200"/>
-      </w:pPr>
-      <w:r>
-        <w:rPr>
-          <w:rFonts w:ascii="Arial" w:cs="Arial" w:eastAsia="Arial" w:hAnsi="Arial"/>
-          <w:b/>
-          <w:bCs/>
-          <w:color w:val="8A6D1F"/>
-          <w:sz w:val="22"/>
-          <w:szCs w:val="22"/>
-        </w:rPr>
-        <w:t xml:space="preserve">16. Intervention Queue  ·  /university/interventions</w:t>
-      </w:r>
-    </w:p>
-    <w:p>
-      <w:pPr>
-        <w:spacing w:after="110" w:line="268"/>
-      </w:pPr>
-      <w:r>
-        <w:rPr>
-          <w:rFonts w:ascii="Arial" w:cs="Arial" w:eastAsia="Arial" w:hAnsi="Arial"/>
-          <w:b/>
-          <w:bCs/>
-          <w:color w:val="2D3436"/>
-          <w:sz w:val="21"/>
-          <w:szCs w:val="21"/>
-        </w:rPr>
-        <w:t xml:space="preserve">Purpose: </w:t>
-      </w:r>
-      <w:r>
-        <w:rPr>
-          <w:rFonts w:ascii="Arial" w:cs="Arial" w:eastAsia="Arial" w:hAnsi="Arial"/>
-          <w:color w:val="2D3436"/>
-          <w:sz w:val="21"/>
-          <w:szCs w:val="21"/>
-        </w:rPr>
-        <w:t xml:space="preserve">Turn analysis into action — the university's to-do list.</w:t>
-      </w:r>
-    </w:p>
-    <w:p>
-      <w:pPr>
-        <w:spacing w:after="110" w:line="268"/>
-      </w:pPr>
-      <w:r>
-        <w:rPr>
-          <w:rFonts w:ascii="Arial" w:cs="Arial" w:eastAsia="Arial" w:hAnsi="Arial"/>
-          <w:b/>
-          <w:bCs/>
-          <w:color w:val="2D3436"/>
-          <w:sz w:val="21"/>
-          <w:szCs w:val="21"/>
-        </w:rPr>
-        <w:t xml:space="preserve">How it works: </w:t>
-      </w:r>
-      <w:r>
-        <w:rPr>
-          <w:rFonts w:ascii="Arial" w:cs="Arial" w:eastAsia="Arial" w:hAnsi="Arial"/>
-          <w:color w:val="2D3436"/>
-          <w:sz w:val="21"/>
-          <w:szCs w:val="21"/>
-        </w:rPr>
-        <w:t xml:space="preserve">Students sorted lowest-readiness first, each with the detected issue (low ATS, no portfolio, few applications) and a recommended intervention. A "Why this recommendation?" panel shows the breakdown and the rule that fired.</w:t>
-      </w:r>
-    </w:p>
-    <w:p>
-      <w:pPr>
-        <w:spacing w:after="110" w:line="268"/>
-      </w:pPr>
-      <w:r>
-        <w:rPr>
-          <w:rFonts w:ascii="Arial" w:cs="Arial" w:eastAsia="Arial" w:hAnsi="Arial"/>
-          <w:b/>
-          <w:bCs/>
-          <w:color w:val="2D3436"/>
-          <w:sz w:val="21"/>
-          <w:szCs w:val="21"/>
-        </w:rPr>
-        <w:t xml:space="preserve">Data source: </w:t>
-      </w:r>
-      <w:r>
-        <w:rPr>
-          <w:rFonts w:ascii="Arial" w:cs="Arial" w:eastAsia="Arial" w:hAnsi="Arial"/>
-          <w:color w:val="2D3436"/>
-          <w:sz w:val="21"/>
-          <w:szCs w:val="21"/>
-        </w:rPr>
-        <w:t xml:space="preserve">Shared candidate pool; issue/action derived from each weakest CRS component.</w:t>
-      </w:r>
-    </w:p>
-    <w:p>
-      <w:pPr>
-        <w:spacing w:after="110" w:line="268"/>
-      </w:pPr>
-      <w:r>
-        <w:rPr>
-          <w:rFonts w:ascii="Arial" w:cs="Arial" w:eastAsia="Arial" w:hAnsi="Arial"/>
-          <w:b/>
-          <w:bCs/>
-          <w:color w:val="2D3436"/>
-          <w:sz w:val="21"/>
-          <w:szCs w:val="21"/>
-        </w:rPr>
-        <w:t xml:space="preserve">API: </w:t>
-      </w:r>
-      <w:r>
-        <w:rPr>
-          <w:rFonts w:ascii="Arial" w:cs="Arial" w:eastAsia="Arial" w:hAnsi="Arial"/>
-          <w:b w:val="false"/>
-          <w:bCs w:val="false"/>
-          <w:color w:val="5A6570"/>
-          <w:sz w:val="21"/>
-          <w:szCs w:val="21"/>
-        </w:rPr>
-        <w:t xml:space="preserve">None</w:t>
-      </w:r>
-    </w:p>
-    <w:p>
-      <w:pPr>
-        <w:pStyle w:val="Heading3"/>
-        <w:spacing w:after="70" w:before="200"/>
-      </w:pPr>
-      <w:r>
-        <w:rPr>
-          <w:rFonts w:ascii="Arial" w:cs="Arial" w:eastAsia="Arial" w:hAnsi="Arial"/>
-          <w:b/>
-          <w:bCs/>
-          <w:color w:val="8A6D1F"/>
-          <w:sz w:val="22"/>
-          <w:szCs w:val="22"/>
-        </w:rPr>
-        <w:t xml:space="preserve">17. Faculty Skill Gaps  ·  /university/skill-gaps</w:t>
-      </w:r>
-    </w:p>
-    <w:p>
-      <w:pPr>
-        <w:spacing w:after="110" w:line="268"/>
-      </w:pPr>
-      <w:r>
-        <w:rPr>
-          <w:rFonts w:ascii="Arial" w:cs="Arial" w:eastAsia="Arial" w:hAnsi="Arial"/>
-          <w:b/>
-          <w:bCs/>
-          <w:color w:val="2D3436"/>
-          <w:sz w:val="21"/>
-          <w:szCs w:val="21"/>
-        </w:rPr>
-        <w:t xml:space="preserve">Purpose: </w:t>
-      </w:r>
-      <w:r>
-        <w:rPr>
-          <w:rFonts w:ascii="Arial" w:cs="Arial" w:eastAsia="Arial" w:hAnsi="Arial"/>
-          <w:color w:val="2D3436"/>
-          <w:sz w:val="21"/>
-          <w:szCs w:val="21"/>
-        </w:rPr>
-        <w:t xml:space="preserve">Show curriculum leaders which skills to close, at scale.</w:t>
-      </w:r>
-    </w:p>
-    <w:p>
-      <w:pPr>
-        <w:spacing w:after="110" w:line="268"/>
-      </w:pPr>
-      <w:r>
-        <w:rPr>
-          <w:rFonts w:ascii="Arial" w:cs="Arial" w:eastAsia="Arial" w:hAnsi="Arial"/>
-          <w:b/>
-          <w:bCs/>
-          <w:color w:val="2D3436"/>
-          <w:sz w:val="21"/>
-          <w:szCs w:val="21"/>
-        </w:rPr>
-        <w:t xml:space="preserve">How it works: </w:t>
-      </w:r>
-      <w:r>
-        <w:rPr>
-          <w:rFonts w:ascii="Arial" w:cs="Arial" w:eastAsia="Arial" w:hAnsi="Arial"/>
-          <w:color w:val="2D3436"/>
-          <w:sz w:val="21"/>
-          <w:szCs w:val="21"/>
-        </w:rPr>
-        <w:t xml:space="preserve">Each gap lists target roles it blocks, students affected, a recommended intervention (SQL clinic, cloud bootcamp, Power BI) and estimated readiness uplift.</w:t>
-      </w:r>
-    </w:p>
-    <w:p>
-      <w:pPr>
-        <w:spacing w:after="110" w:line="268"/>
-      </w:pPr>
-      <w:r>
-        <w:rPr>
-          <w:rFonts w:ascii="Arial" w:cs="Arial" w:eastAsia="Arial" w:hAnsi="Arial"/>
-          <w:b/>
-          <w:bCs/>
-          <w:color w:val="2D3436"/>
-          <w:sz w:val="21"/>
-          <w:szCs w:val="21"/>
-        </w:rPr>
-        <w:t xml:space="preserve">Data source: </w:t>
-      </w:r>
-      <w:r>
-        <w:rPr>
-          <w:rFonts w:ascii="Arial" w:cs="Arial" w:eastAsia="Arial" w:hAnsi="Arial"/>
-          <w:color w:val="2D3436"/>
-          <w:sz w:val="21"/>
-          <w:szCs w:val="21"/>
-        </w:rPr>
-        <w:t xml:space="preserve">skillGaps + programmesSummary.</w:t>
-      </w:r>
-    </w:p>
-    <w:p>
-      <w:pPr>
-        <w:spacing w:after="110" w:line="268"/>
-      </w:pPr>
-      <w:r>
-        <w:rPr>
-          <w:rFonts w:ascii="Arial" w:cs="Arial" w:eastAsia="Arial" w:hAnsi="Arial"/>
-          <w:b/>
-          <w:bCs/>
-          <w:color w:val="2D3436"/>
-          <w:sz w:val="21"/>
-          <w:szCs w:val="21"/>
-        </w:rPr>
-        <w:t xml:space="preserve">API: </w:t>
-      </w:r>
-      <w:r>
-        <w:rPr>
-          <w:rFonts w:ascii="Arial" w:cs="Arial" w:eastAsia="Arial" w:hAnsi="Arial"/>
-          <w:b w:val="false"/>
-          <w:bCs w:val="false"/>
-          <w:color w:val="5A6570"/>
-          <w:sz w:val="21"/>
-          <w:szCs w:val="21"/>
-        </w:rPr>
-        <w:t xml:space="preserve">None</w:t>
-      </w:r>
-    </w:p>
-    <w:p>
-      <w:pPr>
-        <w:pStyle w:val="Heading3"/>
-        <w:spacing w:after="70" w:before="200"/>
-      </w:pPr>
-      <w:r>
-        <w:rPr>
-          <w:rFonts w:ascii="Arial" w:cs="Arial" w:eastAsia="Arial" w:hAnsi="Arial"/>
-          <w:b/>
-          <w:bCs/>
-          <w:color w:val="8A6D1F"/>
-          <w:sz w:val="22"/>
-          <w:szCs w:val="22"/>
-        </w:rPr>
-        <w:t xml:space="preserve">18. Ministry Dashboard  ·  /ministry</w:t>
-      </w:r>
-    </w:p>
-    <w:p>
-      <w:pPr>
-        <w:spacing w:after="110" w:line="268"/>
-      </w:pPr>
-      <w:r>
-        <w:rPr>
-          <w:rFonts w:ascii="Arial" w:cs="Arial" w:eastAsia="Arial" w:hAnsi="Arial"/>
-          <w:b/>
-          <w:bCs/>
-          <w:color w:val="2D3436"/>
-          <w:sz w:val="21"/>
-          <w:szCs w:val="21"/>
-        </w:rPr>
-        <w:t xml:space="preserve">Purpose: </w:t>
-      </w:r>
-      <w:r>
-        <w:rPr>
-          <w:rFonts w:ascii="Arial" w:cs="Arial" w:eastAsia="Arial" w:hAnsi="Arial"/>
-          <w:color w:val="2D3436"/>
-          <w:sz w:val="21"/>
-          <w:szCs w:val="21"/>
-        </w:rPr>
-        <w:t xml:space="preserve">National graduate employability for policy and planning (MOHE).</w:t>
-      </w:r>
-    </w:p>
-    <w:p>
-      <w:pPr>
-        <w:spacing w:after="110" w:line="268"/>
-      </w:pPr>
-      <w:r>
-        <w:rPr>
-          <w:rFonts w:ascii="Arial" w:cs="Arial" w:eastAsia="Arial" w:hAnsi="Arial"/>
-          <w:b/>
-          <w:bCs/>
-          <w:color w:val="2D3436"/>
-          <w:sz w:val="21"/>
-          <w:szCs w:val="21"/>
-        </w:rPr>
-        <w:t xml:space="preserve">How it works: </w:t>
-      </w:r>
-      <w:r>
-        <w:rPr>
-          <w:rFonts w:ascii="Arial" w:cs="Arial" w:eastAsia="Arial" w:hAnsi="Arial"/>
-          <w:color w:val="2D3436"/>
-          <w:sz w:val="21"/>
-          <w:szCs w:val="21"/>
-        </w:rPr>
-        <w:t xml:space="preserve">National KPIs, employability by field, 3-year trend, hiring sectors — and the differentiator, "Speed vs Stickiness": today the system measures how fast graduates are hired, nobody measures whether they stayed.</w:t>
-      </w:r>
-    </w:p>
-    <w:p>
-      <w:pPr>
-        <w:spacing w:after="110" w:line="268"/>
-      </w:pPr>
-      <w:r>
-        <w:rPr>
-          <w:rFonts w:ascii="Arial" w:cs="Arial" w:eastAsia="Arial" w:hAnsi="Arial"/>
-          <w:b/>
-          <w:bCs/>
-          <w:color w:val="2D3436"/>
-          <w:sz w:val="21"/>
-          <w:szCs w:val="21"/>
-        </w:rPr>
-        <w:t xml:space="preserve">Data source: </w:t>
-      </w:r>
-      <w:r>
-        <w:rPr>
-          <w:rFonts w:ascii="Arial" w:cs="Arial" w:eastAsia="Arial" w:hAnsi="Arial"/>
-          <w:color w:val="2D3436"/>
-          <w:sz w:val="21"/>
-          <w:szCs w:val="21"/>
-        </w:rPr>
-        <w:t xml:space="preserve">mockMinistryStats including speedVsFit.</w:t>
-      </w:r>
-    </w:p>
-    <w:p>
-      <w:pPr>
-        <w:spacing w:after="110" w:line="268"/>
-      </w:pPr>
-      <w:r>
-        <w:rPr>
-          <w:rFonts w:ascii="Arial" w:cs="Arial" w:eastAsia="Arial" w:hAnsi="Arial"/>
-          <w:b/>
-          <w:bCs/>
-          <w:color w:val="2D3436"/>
-          <w:sz w:val="21"/>
-          <w:szCs w:val="21"/>
-        </w:rPr>
-        <w:t xml:space="preserve">API: </w:t>
-      </w:r>
-      <w:r>
-        <w:rPr>
-          <w:rFonts w:ascii="Arial" w:cs="Arial" w:eastAsia="Arial" w:hAnsi="Arial"/>
-          <w:b w:val="false"/>
-          <w:bCs w:val="false"/>
-          <w:color w:val="5A6570"/>
-          <w:sz w:val="21"/>
-          <w:szCs w:val="21"/>
-        </w:rPr>
-        <w:t xml:space="preserve">None</w:t>
-      </w:r>
-    </w:p>
-    <w:p>
-      <w:pPr>
-        <w:pStyle w:val="Heading3"/>
-        <w:spacing w:after="70" w:before="200"/>
-      </w:pPr>
-      <w:r>
-        <w:rPr>
-          <w:rFonts w:ascii="Arial" w:cs="Arial" w:eastAsia="Arial" w:hAnsi="Arial"/>
-          <w:b/>
-          <w:bCs/>
-          <w:color w:val="8A6D1F"/>
-          <w:sz w:val="22"/>
-          <w:szCs w:val="22"/>
-        </w:rPr>
-        <w:t xml:space="preserve">19. Impact &amp; SDG  ·  /impact</w:t>
-      </w:r>
-    </w:p>
-    <w:p>
-      <w:pPr>
-        <w:spacing w:after="110" w:line="268"/>
-      </w:pPr>
-      <w:r>
-        <w:rPr>
-          <w:rFonts w:ascii="Arial" w:cs="Arial" w:eastAsia="Arial" w:hAnsi="Arial"/>
-          <w:b/>
-          <w:bCs/>
-          <w:color w:val="2D3436"/>
-          <w:sz w:val="21"/>
-          <w:szCs w:val="21"/>
-        </w:rPr>
-        <w:t xml:space="preserve">Purpose: </w:t>
-      </w:r>
-      <w:r>
-        <w:rPr>
-          <w:rFonts w:ascii="Arial" w:cs="Arial" w:eastAsia="Arial" w:hAnsi="Arial"/>
-          <w:color w:val="2D3436"/>
-          <w:sz w:val="21"/>
-          <w:szCs w:val="21"/>
-        </w:rPr>
-        <w:t xml:space="preserve">Show impact, not just features — the judging criterion that matters most.</w:t>
-      </w:r>
-    </w:p>
-    <w:p>
-      <w:pPr>
-        <w:spacing w:after="110" w:line="268"/>
-      </w:pPr>
-      <w:r>
-        <w:rPr>
-          <w:rFonts w:ascii="Arial" w:cs="Arial" w:eastAsia="Arial" w:hAnsi="Arial"/>
-          <w:b/>
-          <w:bCs/>
-          <w:color w:val="2D3436"/>
-          <w:sz w:val="21"/>
-          <w:szCs w:val="21"/>
-        </w:rPr>
-        <w:t xml:space="preserve">How it works: </w:t>
-      </w:r>
-      <w:r>
-        <w:rPr>
-          <w:rFonts w:ascii="Arial" w:cs="Arial" w:eastAsia="Arial" w:hAnsi="Arial"/>
-          <w:color w:val="2D3436"/>
-          <w:sz w:val="21"/>
-          <w:szCs w:val="21"/>
-        </w:rPr>
-        <w:t xml:space="preserve">Headline impact metrics plus the three UN SDGs CareerArc moves (4 Quality Education, 8 Decent Work, 17 Partnerships), each mapped to the features that deliver them.</w:t>
-      </w:r>
-    </w:p>
-    <w:p>
-      <w:pPr>
-        <w:spacing w:after="110" w:line="268"/>
-      </w:pPr>
-      <w:r>
-        <w:rPr>
-          <w:rFonts w:ascii="Arial" w:cs="Arial" w:eastAsia="Arial" w:hAnsi="Arial"/>
-          <w:b/>
-          <w:bCs/>
-          <w:color w:val="2D3436"/>
-          <w:sz w:val="21"/>
-          <w:szCs w:val="21"/>
-        </w:rPr>
-        <w:t xml:space="preserve">Data source: </w:t>
-      </w:r>
-      <w:r>
-        <w:rPr>
-          <w:rFonts w:ascii="Arial" w:cs="Arial" w:eastAsia="Arial" w:hAnsi="Arial"/>
-          <w:color w:val="2D3436"/>
-          <w:sz w:val="21"/>
-          <w:szCs w:val="21"/>
-        </w:rPr>
-        <w:t xml:space="preserve">sdgGoals + mockImpactMetrics.</w:t>
-      </w:r>
-    </w:p>
-    <w:p>
-      <w:pPr>
-        <w:spacing w:after="110" w:line="268"/>
-      </w:pPr>
-      <w:r>
-        <w:rPr>
-          <w:rFonts w:ascii="Arial" w:cs="Arial" w:eastAsia="Arial" w:hAnsi="Arial"/>
-          <w:b/>
-          <w:bCs/>
-          <w:color w:val="2D3436"/>
-          <w:sz w:val="21"/>
-          <w:szCs w:val="21"/>
-        </w:rPr>
-        <w:t xml:space="preserve">API: </w:t>
-      </w:r>
-      <w:r>
-        <w:rPr>
-          <w:rFonts w:ascii="Arial" w:cs="Arial" w:eastAsia="Arial" w:hAnsi="Arial"/>
-          <w:b w:val="false"/>
-          <w:bCs w:val="false"/>
-          <w:color w:val="5A6570"/>
-          <w:sz w:val="21"/>
-          <w:szCs w:val="21"/>
-        </w:rPr>
-        <w:t xml:space="preserve">None</w:t>
-      </w:r>
-    </w:p>
-    <w:p>
-      <w:pPr>
-        <w:pStyle w:val="Heading3"/>
-        <w:spacing w:after="70" w:before="200"/>
-      </w:pPr>
-      <w:r>
-        <w:rPr>
-          <w:rFonts w:ascii="Arial" w:cs="Arial" w:eastAsia="Arial" w:hAnsi="Arial"/>
-          <w:b/>
-          <w:bCs/>
-          <w:color w:val="8A6D1F"/>
-          <w:sz w:val="22"/>
-          <w:szCs w:val="22"/>
-        </w:rPr>
-        <w:t xml:space="preserve">12. SIFU Interview Coach  ·  /interview-coach   ★ REAL AI</w:t>
-      </w:r>
-    </w:p>
-    <w:p>
-      <w:pPr>
-        <w:spacing w:after="110" w:line="268"/>
-      </w:pPr>
-      <w:r>
-        <w:rPr>
-          <w:rFonts w:ascii="Arial" w:cs="Arial" w:eastAsia="Arial" w:hAnsi="Arial"/>
-          <w:b/>
-          <w:bCs/>
-          <w:color w:val="2D3436"/>
-          <w:sz w:val="21"/>
-          <w:szCs w:val="21"/>
-        </w:rPr>
-        <w:t xml:space="preserve">Purpose: </w:t>
-      </w:r>
-      <w:r>
-        <w:rPr>
-          <w:rFonts w:ascii="Arial" w:cs="Arial" w:eastAsia="Arial" w:hAnsi="Arial"/>
-          <w:color w:val="2D3436"/>
-          <w:sz w:val="21"/>
-          <w:szCs w:val="21"/>
-        </w:rPr>
-        <w:t xml:space="preserve">Smart Interview Feedback &amp; Upskilling. Practice interviews and get honest, specific coaching. ("Sifu" = master/mentor.)</w:t>
-      </w:r>
-    </w:p>
-    <w:p>
-      <w:pPr>
-        <w:spacing w:after="110" w:line="268"/>
-      </w:pPr>
-      <w:r>
-        <w:rPr>
-          <w:rFonts w:ascii="Arial" w:cs="Arial" w:eastAsia="Arial" w:hAnsi="Arial"/>
-          <w:b/>
-          <w:bCs/>
-          <w:color w:val="2D3436"/>
-          <w:sz w:val="21"/>
-          <w:szCs w:val="21"/>
-        </w:rPr>
-        <w:t xml:space="preserve">How it works: </w:t>
-      </w:r>
-      <w:r>
-        <w:rPr>
-          <w:rFonts w:ascii="Arial" w:cs="Arial" w:eastAsia="Arial" w:hAnsi="Arial"/>
-          <w:color w:val="2D3436"/>
-          <w:sz w:val="21"/>
-          <w:szCs w:val="21"/>
-        </w:rPr>
-        <w:t xml:space="preserve">Two real Claude API calls behind Next.js server routes:</w:t>
+        <w:t xml:space="preserve">How to read this section</w:t>
+      </w:r>
+    </w:p>
+    <w:p>
+      <w:pPr>
+        <w:spacing w:after="110" w:line="268"/>
+      </w:pPr>
+      <w:r>
+        <w:rPr>
+          <w:rFonts w:ascii="Arial" w:cs="Arial" w:eastAsia="Arial" w:hAnsi="Arial"/>
+          <w:color w:val="2D3436"/>
+          <w:sz w:val="21"/>
+          <w:szCs w:val="21"/>
+        </w:rPr>
+        <w:t xml:space="preserve">Each module below lists a Data source and an API. To avoid any confusion:</w:t>
       </w:r>
     </w:p>
     <w:p>
@@ -3467,16 +1272,16 @@
           <w:sz w:val="21"/>
           <w:szCs w:val="21"/>
         </w:rPr>
-        <w:t xml:space="preserve">POST /api/interview-questions </w:t>
-      </w:r>
-      <w:r>
-        <w:rPr>
-          <w:rFonts w:ascii="Arial" w:cs="Arial" w:eastAsia="Arial" w:hAnsi="Arial"/>
-          <w:color w:val="2D3436"/>
-          <w:sz w:val="21"/>
-          <w:szCs w:val="21"/>
-        </w:rPr>
-        <w:t xml:space="preserve">→ generates 5 questions plus model answers, tailored to the chosen role, company type, seniority and question type.</w:t>
+        <w:t xml:space="preserve">File paths such as lib/courseAdvisor.ts are files inside our own codebase</w:t>
+      </w:r>
+      <w:r>
+        <w:rPr>
+          <w:rFonts w:ascii="Arial" w:cs="Arial" w:eastAsia="Arial" w:hAnsi="Arial"/>
+          <w:color w:val="2D3436"/>
+          <w:sz w:val="21"/>
+          <w:szCs w:val="21"/>
+        </w:rPr>
+        <w:t xml:space="preserve"> — they are not external websites, third-party services or purchased datasets. Think of them as spreadsheets we wrote ourselves and shipped inside the app.</w:t>
       </w:r>
     </w:p>
     <w:p>
@@ -3497,6 +1302,2322 @@
           <w:sz w:val="21"/>
           <w:szCs w:val="21"/>
         </w:rPr>
+        <w:t xml:space="preserve">"API: None" </w:t>
+      </w:r>
+      <w:r>
+        <w:rPr>
+          <w:rFonts w:ascii="Arial" w:cs="Arial" w:eastAsia="Arial" w:hAnsi="Arial"/>
+          <w:color w:val="2D3436"/>
+          <w:sz w:val="21"/>
+          <w:szCs w:val="21"/>
+        </w:rPr>
+        <w:t xml:space="preserve">means that module makes no internet call at all. Everything it needs is already bundled in the application.</w:t>
+      </w:r>
+    </w:p>
+    <w:p>
+      <w:pPr>
+        <w:pStyle w:val="ListParagraph"/>
+        <w:numPr>
+          <w:ilvl w:val="0"/>
+          <w:numId w:val="3"/>
+        </w:numPr>
+        <w:spacing w:after="55" w:line="260"/>
+      </w:pPr>
+      <w:r>
+        <w:rPr>
+          <w:rFonts w:ascii="Arial" w:cs="Arial" w:eastAsia="Arial" w:hAnsi="Arial"/>
+          <w:b/>
+          <w:bCs/>
+          <w:color w:val="2D3436"/>
+          <w:sz w:val="21"/>
+          <w:szCs w:val="21"/>
+        </w:rPr>
+        <w:t xml:space="preserve">Exactly one module calls an external API</w:t>
+      </w:r>
+      <w:r>
+        <w:rPr>
+          <w:rFonts w:ascii="Arial" w:cs="Arial" w:eastAsia="Arial" w:hAnsi="Arial"/>
+          <w:color w:val="2D3436"/>
+          <w:sz w:val="21"/>
+          <w:szCs w:val="21"/>
+        </w:rPr>
+        <w:t xml:space="preserve"> — SIFU (module 12), which calls the Anthropic Claude API. Every other module is fully self-contained, exactly as the brief requires: "use dummy / simulated data… no API keys."</w:t>
+      </w:r>
+    </w:p>
+    <w:p>
+      <w:pPr>
+        <w:pStyle w:val="Heading2"/>
+        <w:spacing w:after="90" w:before="260"/>
+      </w:pPr>
+      <w:r>
+        <w:rPr>
+          <w:rFonts w:ascii="Arial" w:cs="Arial" w:eastAsia="Arial" w:hAnsi="Arial"/>
+          <w:b/>
+          <w:bCs/>
+          <w:color w:val="C0392B"/>
+          <w:sz w:val="24"/>
+          <w:szCs w:val="24"/>
+        </w:rPr>
+        <w:t xml:space="preserve">Module-by-module</w:t>
+      </w:r>
+    </w:p>
+    <w:p>
+      <w:pPr>
+        <w:pStyle w:val="Heading3"/>
+        <w:spacing w:after="70" w:before="200"/>
+      </w:pPr>
+      <w:r>
+        <w:rPr>
+          <w:rFonts w:ascii="Arial" w:cs="Arial" w:eastAsia="Arial" w:hAnsi="Arial"/>
+          <w:b/>
+          <w:bCs/>
+          <w:color w:val="8A6D1F"/>
+          <w:sz w:val="22"/>
+          <w:szCs w:val="22"/>
+        </w:rPr>
+        <w:t xml:space="preserve">1. One-Click Login  ·  /login</w:t>
+      </w:r>
+    </w:p>
+    <w:p>
+      <w:pPr>
+        <w:spacing w:after="110" w:line="268"/>
+      </w:pPr>
+      <w:r>
+        <w:rPr>
+          <w:rFonts w:ascii="Arial" w:cs="Arial" w:eastAsia="Arial" w:hAnsi="Arial"/>
+          <w:b/>
+          <w:bCs/>
+          <w:color w:val="2D3436"/>
+          <w:sz w:val="21"/>
+          <w:szCs w:val="21"/>
+        </w:rPr>
+        <w:t xml:space="preserve">Purpose: </w:t>
+      </w:r>
+      <w:r>
+        <w:rPr>
+          <w:rFonts w:ascii="Arial" w:cs="Arial" w:eastAsia="Arial" w:hAnsi="Arial"/>
+          <w:color w:val="2D3436"/>
+          <w:sz w:val="21"/>
+          <w:szCs w:val="21"/>
+        </w:rPr>
+        <w:t xml:space="preserve">Remove all friction for judges and demo users.</w:t>
+      </w:r>
+    </w:p>
+    <w:p>
+      <w:pPr>
+        <w:spacing w:after="110" w:line="268"/>
+      </w:pPr>
+      <w:r>
+        <w:rPr>
+          <w:rFonts w:ascii="Arial" w:cs="Arial" w:eastAsia="Arial" w:hAnsi="Arial"/>
+          <w:b/>
+          <w:bCs/>
+          <w:color w:val="2D3436"/>
+          <w:sz w:val="21"/>
+          <w:szCs w:val="21"/>
+        </w:rPr>
+        <w:t xml:space="preserve">How it works: </w:t>
+      </w:r>
+      <w:r>
+        <w:rPr>
+          <w:rFonts w:ascii="Arial" w:cs="Arial" w:eastAsia="Arial" w:hAnsi="Arial"/>
+          <w:color w:val="2D3436"/>
+          <w:sz w:val="21"/>
+          <w:szCs w:val="21"/>
+        </w:rPr>
+        <w:t xml:space="preserve">Four role tiles; clicking one writes the role to localStorage and routes to that dashboard. No password, no form.</w:t>
+      </w:r>
+    </w:p>
+    <w:p>
+      <w:pPr>
+        <w:spacing w:after="110" w:line="268"/>
+      </w:pPr>
+      <w:r>
+        <w:rPr>
+          <w:rFonts w:ascii="Arial" w:cs="Arial" w:eastAsia="Arial" w:hAnsi="Arial"/>
+          <w:b/>
+          <w:bCs/>
+          <w:color w:val="2D3436"/>
+          <w:sz w:val="21"/>
+          <w:szCs w:val="21"/>
+        </w:rPr>
+        <w:t xml:space="preserve">Data source (inside our own code): </w:t>
+      </w:r>
+      <w:r>
+        <w:rPr>
+          <w:rFonts w:ascii="Arial" w:cs="Arial" w:eastAsia="Arial" w:hAnsi="Arial"/>
+          <w:color w:val="2D3436"/>
+          <w:sz w:val="21"/>
+          <w:szCs w:val="21"/>
+        </w:rPr>
+        <w:t xml:space="preserve">Role definitions in the page component.</w:t>
+      </w:r>
+    </w:p>
+    <w:p>
+      <w:pPr>
+        <w:spacing w:after="110" w:line="268"/>
+      </w:pPr>
+      <w:r>
+        <w:rPr>
+          <w:rFonts w:ascii="Arial" w:cs="Arial" w:eastAsia="Arial" w:hAnsi="Arial"/>
+          <w:b/>
+          <w:bCs/>
+          <w:color w:val="2D3436"/>
+          <w:sz w:val="21"/>
+          <w:szCs w:val="21"/>
+        </w:rPr>
+        <w:t xml:space="preserve">External API: </w:t>
+      </w:r>
+      <w:r>
+        <w:rPr>
+          <w:rFonts w:ascii="Arial" w:cs="Arial" w:eastAsia="Arial" w:hAnsi="Arial"/>
+          <w:b w:val="false"/>
+          <w:bCs w:val="false"/>
+          <w:color w:val="5A6570"/>
+          <w:sz w:val="21"/>
+          <w:szCs w:val="21"/>
+        </w:rPr>
+        <w:t xml:space="preserve">None — no internet call</w:t>
+      </w:r>
+    </w:p>
+    <w:p>
+      <w:pPr>
+        <w:pStyle w:val="Heading3"/>
+        <w:spacing w:after="70" w:before="200"/>
+      </w:pPr>
+      <w:r>
+        <w:rPr>
+          <w:rFonts w:ascii="Arial" w:cs="Arial" w:eastAsia="Arial" w:hAnsi="Arial"/>
+          <w:b/>
+          <w:bCs/>
+          <w:color w:val="8A6D1F"/>
+          <w:sz w:val="22"/>
+          <w:szCs w:val="22"/>
+        </w:rPr>
+        <w:t xml:space="preserve">2. Onboarding  ·  /onboarding</w:t>
+      </w:r>
+    </w:p>
+    <w:p>
+      <w:pPr>
+        <w:spacing w:after="110" w:line="268"/>
+      </w:pPr>
+      <w:r>
+        <w:rPr>
+          <w:rFonts w:ascii="Arial" w:cs="Arial" w:eastAsia="Arial" w:hAnsi="Arial"/>
+          <w:b/>
+          <w:bCs/>
+          <w:color w:val="2D3436"/>
+          <w:sz w:val="21"/>
+          <w:szCs w:val="21"/>
+        </w:rPr>
+        <w:t xml:space="preserve">Purpose: </w:t>
+      </w:r>
+      <w:r>
+        <w:rPr>
+          <w:rFonts w:ascii="Arial" w:cs="Arial" w:eastAsia="Arial" w:hAnsi="Arial"/>
+          <w:color w:val="2D3436"/>
+          <w:sz w:val="21"/>
+          <w:szCs w:val="21"/>
+        </w:rPr>
+        <w:t xml:space="preserve">Turn a blank profile into a readiness diagnosis in ~60 seconds — the emotional hook of the demo.</w:t>
+      </w:r>
+    </w:p>
+    <w:p>
+      <w:pPr>
+        <w:spacing w:after="110" w:line="268"/>
+      </w:pPr>
+      <w:r>
+        <w:rPr>
+          <w:rFonts w:ascii="Arial" w:cs="Arial" w:eastAsia="Arial" w:hAnsi="Arial"/>
+          <w:b/>
+          <w:bCs/>
+          <w:color w:val="2D3436"/>
+          <w:sz w:val="21"/>
+          <w:szCs w:val="21"/>
+        </w:rPr>
+        <w:t xml:space="preserve">How it works: </w:t>
+      </w:r>
+      <w:r>
+        <w:rPr>
+          <w:rFonts w:ascii="Arial" w:cs="Arial" w:eastAsia="Arial" w:hAnsi="Arial"/>
+          <w:color w:val="2D3436"/>
+          <w:sz w:val="21"/>
+          <w:szCs w:val="21"/>
+        </w:rPr>
+        <w:t xml:space="preserve">A gated wizard whose steps are configured by the chosen level (Internship / Fresh Grad / Mid / Senior). Each step recalculates the CRS, which animates live in the side gauge. One config object drives four journeys.</w:t>
+      </w:r>
+    </w:p>
+    <w:p>
+      <w:pPr>
+        <w:spacing w:after="110" w:line="268"/>
+      </w:pPr>
+      <w:r>
+        <w:rPr>
+          <w:rFonts w:ascii="Arial" w:cs="Arial" w:eastAsia="Arial" w:hAnsi="Arial"/>
+          <w:b/>
+          <w:bCs/>
+          <w:color w:val="2D3436"/>
+          <w:sz w:val="21"/>
+          <w:szCs w:val="21"/>
+        </w:rPr>
+        <w:t xml:space="preserve">Data source (inside our own code): </w:t>
+      </w:r>
+      <w:r>
+        <w:rPr>
+          <w:rFonts w:ascii="Arial" w:cs="Arial" w:eastAsia="Arial" w:hAnsi="Arial"/>
+          <w:color w:val="2D3436"/>
+          <w:sz w:val="21"/>
+          <w:szCs w:val="21"/>
+        </w:rPr>
+        <w:t xml:space="preserve">levels + levelByKey in lib/careerData.ts; result saved to localStorage as careerProfile.</w:t>
+      </w:r>
+    </w:p>
+    <w:p>
+      <w:pPr>
+        <w:spacing w:after="110" w:line="268"/>
+      </w:pPr>
+      <w:r>
+        <w:rPr>
+          <w:rFonts w:ascii="Arial" w:cs="Arial" w:eastAsia="Arial" w:hAnsi="Arial"/>
+          <w:b/>
+          <w:bCs/>
+          <w:color w:val="2D3436"/>
+          <w:sz w:val="21"/>
+          <w:szCs w:val="21"/>
+        </w:rPr>
+        <w:t xml:space="preserve">External API: </w:t>
+      </w:r>
+      <w:r>
+        <w:rPr>
+          <w:rFonts w:ascii="Arial" w:cs="Arial" w:eastAsia="Arial" w:hAnsi="Arial"/>
+          <w:b w:val="false"/>
+          <w:bCs w:val="false"/>
+          <w:color w:val="5A6570"/>
+          <w:sz w:val="21"/>
+          <w:szCs w:val="21"/>
+        </w:rPr>
+        <w:t xml:space="preserve">None — no internet call</w:t>
+      </w:r>
+    </w:p>
+    <w:p>
+      <w:pPr>
+        <w:pStyle w:val="Heading3"/>
+        <w:spacing w:after="70" w:before="200"/>
+      </w:pPr>
+      <w:r>
+        <w:rPr>
+          <w:rFonts w:ascii="Arial" w:cs="Arial" w:eastAsia="Arial" w:hAnsi="Arial"/>
+          <w:b/>
+          <w:bCs/>
+          <w:color w:val="8A6D1F"/>
+          <w:sz w:val="22"/>
+          <w:szCs w:val="22"/>
+        </w:rPr>
+        <w:t xml:space="preserve">3. Dashboard — CRS hub  ·  /dashboard</w:t>
+      </w:r>
+    </w:p>
+    <w:p>
+      <w:pPr>
+        <w:spacing w:after="110" w:line="268"/>
+      </w:pPr>
+      <w:r>
+        <w:rPr>
+          <w:rFonts w:ascii="Arial" w:cs="Arial" w:eastAsia="Arial" w:hAnsi="Arial"/>
+          <w:b/>
+          <w:bCs/>
+          <w:color w:val="2D3436"/>
+          <w:sz w:val="21"/>
+          <w:szCs w:val="21"/>
+        </w:rPr>
+        <w:t xml:space="preserve">Purpose: </w:t>
+      </w:r>
+      <w:r>
+        <w:rPr>
+          <w:rFonts w:ascii="Arial" w:cs="Arial" w:eastAsia="Arial" w:hAnsi="Arial"/>
+          <w:color w:val="2D3436"/>
+          <w:sz w:val="21"/>
+          <w:szCs w:val="21"/>
+        </w:rPr>
+        <w:t xml:space="preserve">Answer "how ready am I, and what is the single best thing to do next?"</w:t>
+      </w:r>
+    </w:p>
+    <w:p>
+      <w:pPr>
+        <w:spacing w:after="110" w:line="268"/>
+      </w:pPr>
+      <w:r>
+        <w:rPr>
+          <w:rFonts w:ascii="Arial" w:cs="Arial" w:eastAsia="Arial" w:hAnsi="Arial"/>
+          <w:b/>
+          <w:bCs/>
+          <w:color w:val="2D3436"/>
+          <w:sz w:val="21"/>
+          <w:szCs w:val="21"/>
+        </w:rPr>
+        <w:t xml:space="preserve">How it works: </w:t>
+      </w:r>
+      <w:r>
+        <w:rPr>
+          <w:rFonts w:ascii="Arial" w:cs="Arial" w:eastAsia="Arial" w:hAnsi="Arial"/>
+          <w:color w:val="2D3436"/>
+          <w:sz w:val="21"/>
+          <w:szCs w:val="21"/>
+        </w:rPr>
+        <w:t xml:space="preserve">Reads the saved profile, computes CRS, renders the 5-component breakdown, ranks all jobs by real skill compatibility, and surfaces an AI-style next action targeting the weakest component.</w:t>
+      </w:r>
+    </w:p>
+    <w:p>
+      <w:pPr>
+        <w:spacing w:after="110" w:line="268"/>
+      </w:pPr>
+      <w:r>
+        <w:rPr>
+          <w:rFonts w:ascii="Arial" w:cs="Arial" w:eastAsia="Arial" w:hAnsi="Arial"/>
+          <w:b/>
+          <w:bCs/>
+          <w:color w:val="2D3436"/>
+          <w:sz w:val="21"/>
+          <w:szCs w:val="21"/>
+        </w:rPr>
+        <w:t xml:space="preserve">Data source (inside our own code): </w:t>
+      </w:r>
+      <w:r>
+        <w:rPr>
+          <w:rFonts w:ascii="Arial" w:cs="Arial" w:eastAsia="Arial" w:hAnsi="Arial"/>
+          <w:color w:val="2D3436"/>
+          <w:sz w:val="21"/>
+          <w:szCs w:val="21"/>
+        </w:rPr>
+        <w:t xml:space="preserve">careerProfile (localStorage) + mockJobs (lib/mockData.ts).</w:t>
+      </w:r>
+    </w:p>
+    <w:p>
+      <w:pPr>
+        <w:spacing w:after="110" w:line="268"/>
+      </w:pPr>
+      <w:r>
+        <w:rPr>
+          <w:rFonts w:ascii="Arial" w:cs="Arial" w:eastAsia="Arial" w:hAnsi="Arial"/>
+          <w:b/>
+          <w:bCs/>
+          <w:color w:val="2D3436"/>
+          <w:sz w:val="21"/>
+          <w:szCs w:val="21"/>
+        </w:rPr>
+        <w:t xml:space="preserve">External API: </w:t>
+      </w:r>
+      <w:r>
+        <w:rPr>
+          <w:rFonts w:ascii="Arial" w:cs="Arial" w:eastAsia="Arial" w:hAnsi="Arial"/>
+          <w:b/>
+          <w:bCs/>
+          <w:color w:val="00795C"/>
+          <w:sz w:val="21"/>
+          <w:szCs w:val="21"/>
+        </w:rPr>
+        <w:t xml:space="preserve">None — text from nextActionText()</w:t>
+      </w:r>
+    </w:p>
+    <w:p>
+      <w:pPr>
+        <w:pStyle w:val="Heading3"/>
+        <w:spacing w:after="70" w:before="200"/>
+      </w:pPr>
+      <w:r>
+        <w:rPr>
+          <w:rFonts w:ascii="Arial" w:cs="Arial" w:eastAsia="Arial" w:hAnsi="Arial"/>
+          <w:b/>
+          <w:bCs/>
+          <w:color w:val="8A6D1F"/>
+          <w:sz w:val="22"/>
+          <w:szCs w:val="22"/>
+        </w:rPr>
+        <w:t xml:space="preserve">4. Course Advisor  ·  /course-advisor</w:t>
+      </w:r>
+    </w:p>
+    <w:p>
+      <w:pPr>
+        <w:spacing w:after="110" w:line="268"/>
+      </w:pPr>
+      <w:r>
+        <w:rPr>
+          <w:rFonts w:ascii="Arial" w:cs="Arial" w:eastAsia="Arial" w:hAnsi="Arial"/>
+          <w:b/>
+          <w:bCs/>
+          <w:color w:val="2D3436"/>
+          <w:sz w:val="21"/>
+          <w:szCs w:val="21"/>
+        </w:rPr>
+        <w:t xml:space="preserve">Purpose: </w:t>
+      </w:r>
+      <w:r>
+        <w:rPr>
+          <w:rFonts w:ascii="Arial" w:cs="Arial" w:eastAsia="Arial" w:hAnsi="Arial"/>
+          <w:color w:val="2D3436"/>
+          <w:sz w:val="21"/>
+          <w:szCs w:val="21"/>
+        </w:rPr>
+        <w:t xml:space="preserve">For 16–18 year olds who have not chosen a course — answered before they commit 4 years and RM40,000.</w:t>
+      </w:r>
+    </w:p>
+    <w:p>
+      <w:pPr>
+        <w:spacing w:after="110" w:line="268"/>
+      </w:pPr>
+      <w:r>
+        <w:rPr>
+          <w:rFonts w:ascii="Arial" w:cs="Arial" w:eastAsia="Arial" w:hAnsi="Arial"/>
+          <w:b/>
+          <w:bCs/>
+          <w:color w:val="2D3436"/>
+          <w:sz w:val="21"/>
+          <w:szCs w:val="21"/>
+        </w:rPr>
+        <w:t xml:space="preserve">How it works: </w:t>
+      </w:r>
+      <w:r>
+        <w:rPr>
+          <w:rFonts w:ascii="Arial" w:cs="Arial" w:eastAsia="Arial" w:hAnsi="Arial"/>
+          <w:color w:val="2D3436"/>
+          <w:sz w:val="21"/>
+          <w:szCs w:val="21"/>
+        </w:rPr>
+        <w:t xml:space="preserve">Three steps (interests → subjects → work animal) feed matchCourses(), scoring ten courses on a weighted model (interests 55%, subjects 30%, animal 15%). Each card also shows a non-degree route.</w:t>
+      </w:r>
+    </w:p>
+    <w:p>
+      <w:pPr>
+        <w:spacing w:after="110" w:line="268"/>
+      </w:pPr>
+      <w:r>
+        <w:rPr>
+          <w:rFonts w:ascii="Arial" w:cs="Arial" w:eastAsia="Arial" w:hAnsi="Arial"/>
+          <w:b/>
+          <w:bCs/>
+          <w:color w:val="2D3436"/>
+          <w:sz w:val="21"/>
+          <w:szCs w:val="21"/>
+        </w:rPr>
+        <w:t xml:space="preserve">Data source (inside our own code): </w:t>
+      </w:r>
+      <w:r>
+        <w:rPr>
+          <w:rFonts w:ascii="Arial" w:cs="Arial" w:eastAsia="Arial" w:hAnsi="Arial"/>
+          <w:color w:val="2D3436"/>
+          <w:sz w:val="21"/>
+          <w:szCs w:val="21"/>
+        </w:rPr>
+        <w:t xml:space="preserve">lib/courseAdvisor.ts — courses, demand signals, salary ranges, durability notes, skills routes.</w:t>
+      </w:r>
+    </w:p>
+    <w:p>
+      <w:pPr>
+        <w:spacing w:after="110" w:line="268"/>
+      </w:pPr>
+      <w:r>
+        <w:rPr>
+          <w:rFonts w:ascii="Arial" w:cs="Arial" w:eastAsia="Arial" w:hAnsi="Arial"/>
+          <w:b/>
+          <w:bCs/>
+          <w:color w:val="2D3436"/>
+          <w:sz w:val="21"/>
+          <w:szCs w:val="21"/>
+        </w:rPr>
+        <w:t xml:space="preserve">External API: </w:t>
+      </w:r>
+      <w:r>
+        <w:rPr>
+          <w:rFonts w:ascii="Arial" w:cs="Arial" w:eastAsia="Arial" w:hAnsi="Arial"/>
+          <w:b w:val="false"/>
+          <w:bCs w:val="false"/>
+          <w:color w:val="5A6570"/>
+          <w:sz w:val="21"/>
+          <w:szCs w:val="21"/>
+        </w:rPr>
+        <w:t xml:space="preserve">None — no internet call</w:t>
+      </w:r>
+    </w:p>
+    <w:p>
+      <w:pPr>
+        <w:pStyle w:val="Heading3"/>
+        <w:spacing w:after="70" w:before="200"/>
+      </w:pPr>
+      <w:r>
+        <w:rPr>
+          <w:rFonts w:ascii="Arial" w:cs="Arial" w:eastAsia="Arial" w:hAnsi="Arial"/>
+          <w:b/>
+          <w:bCs/>
+          <w:color w:val="8A6D1F"/>
+          <w:sz w:val="22"/>
+          <w:szCs w:val="22"/>
+        </w:rPr>
+        <w:t xml:space="preserve">5. Career Path  ·  /career-path</w:t>
+      </w:r>
+    </w:p>
+    <w:p>
+      <w:pPr>
+        <w:spacing w:after="110" w:line="268"/>
+      </w:pPr>
+      <w:r>
+        <w:rPr>
+          <w:rFonts w:ascii="Arial" w:cs="Arial" w:eastAsia="Arial" w:hAnsi="Arial"/>
+          <w:b/>
+          <w:bCs/>
+          <w:color w:val="2D3436"/>
+          <w:sz w:val="21"/>
+          <w:szCs w:val="21"/>
+        </w:rPr>
+        <w:t xml:space="preserve">Purpose: </w:t>
+      </w:r>
+      <w:r>
+        <w:rPr>
+          <w:rFonts w:ascii="Arial" w:cs="Arial" w:eastAsia="Arial" w:hAnsi="Arial"/>
+          <w:color w:val="2D3436"/>
+          <w:sz w:val="21"/>
+          <w:szCs w:val="21"/>
+        </w:rPr>
+        <w:t xml:space="preserve">A plan a person can act on. Deliberately not a 40-year fantasy.</w:t>
+      </w:r>
+    </w:p>
+    <w:p>
+      <w:pPr>
+        <w:spacing w:after="110" w:line="268"/>
+      </w:pPr>
+      <w:r>
+        <w:rPr>
+          <w:rFonts w:ascii="Arial" w:cs="Arial" w:eastAsia="Arial" w:hAnsi="Arial"/>
+          <w:b/>
+          <w:bCs/>
+          <w:color w:val="2D3436"/>
+          <w:sz w:val="21"/>
+          <w:szCs w:val="21"/>
+        </w:rPr>
+        <w:t xml:space="preserve">How it works: </w:t>
+      </w:r>
+      <w:r>
+        <w:rPr>
+          <w:rFonts w:ascii="Arial" w:cs="Arial" w:eastAsia="Arial" w:hAnsi="Arial"/>
+          <w:color w:val="2D3436"/>
+          <w:sz w:val="21"/>
+          <w:szCs w:val="21"/>
+        </w:rPr>
+        <w:t xml:space="preserve">Three tracks. Each shows a concrete 4-year plan of what to DO each year, then clearly-labelled 2030/2040 scenarios, then a Future-Proof Check of durable vs automatable skills.</w:t>
+      </w:r>
+    </w:p>
+    <w:p>
+      <w:pPr>
+        <w:spacing w:after="110" w:line="268"/>
+      </w:pPr>
+      <w:r>
+        <w:rPr>
+          <w:rFonts w:ascii="Arial" w:cs="Arial" w:eastAsia="Arial" w:hAnsi="Arial"/>
+          <w:b/>
+          <w:bCs/>
+          <w:color w:val="2D3436"/>
+          <w:sz w:val="21"/>
+          <w:szCs w:val="21"/>
+        </w:rPr>
+        <w:t xml:space="preserve">Data source (inside our own code): </w:t>
+      </w:r>
+      <w:r>
+        <w:rPr>
+          <w:rFonts w:ascii="Arial" w:cs="Arial" w:eastAsia="Arial" w:hAnsi="Arial"/>
+          <w:color w:val="2D3436"/>
+          <w:sz w:val="21"/>
+          <w:szCs w:val="21"/>
+        </w:rPr>
+        <w:t xml:space="preserve">careerPathData + futureProof (lib/mockData.ts).</w:t>
+      </w:r>
+    </w:p>
+    <w:p>
+      <w:pPr>
+        <w:spacing w:after="110" w:line="268"/>
+      </w:pPr>
+      <w:r>
+        <w:rPr>
+          <w:rFonts w:ascii="Arial" w:cs="Arial" w:eastAsia="Arial" w:hAnsi="Arial"/>
+          <w:b/>
+          <w:bCs/>
+          <w:color w:val="2D3436"/>
+          <w:sz w:val="21"/>
+          <w:szCs w:val="21"/>
+        </w:rPr>
+        <w:t xml:space="preserve">External API: </w:t>
+      </w:r>
+      <w:r>
+        <w:rPr>
+          <w:rFonts w:ascii="Arial" w:cs="Arial" w:eastAsia="Arial" w:hAnsi="Arial"/>
+          <w:b w:val="false"/>
+          <w:bCs w:val="false"/>
+          <w:color w:val="5A6570"/>
+          <w:sz w:val="21"/>
+          <w:szCs w:val="21"/>
+        </w:rPr>
+        <w:t xml:space="preserve">None — no internet call</w:t>
+      </w:r>
+    </w:p>
+    <w:p>
+      <w:pPr>
+        <w:pStyle w:val="Heading3"/>
+        <w:spacing w:after="70" w:before="200"/>
+      </w:pPr>
+      <w:r>
+        <w:rPr>
+          <w:rFonts w:ascii="Arial" w:cs="Arial" w:eastAsia="Arial" w:hAnsi="Arial"/>
+          <w:b/>
+          <w:bCs/>
+          <w:color w:val="8A6D1F"/>
+          <w:sz w:val="22"/>
+          <w:szCs w:val="22"/>
+        </w:rPr>
+        <w:t xml:space="preserve">6. Job Search  ·  /jobs</w:t>
+      </w:r>
+    </w:p>
+    <w:p>
+      <w:pPr>
+        <w:spacing w:after="110" w:line="268"/>
+      </w:pPr>
+      <w:r>
+        <w:rPr>
+          <w:rFonts w:ascii="Arial" w:cs="Arial" w:eastAsia="Arial" w:hAnsi="Arial"/>
+          <w:b/>
+          <w:bCs/>
+          <w:color w:val="2D3436"/>
+          <w:sz w:val="21"/>
+          <w:szCs w:val="21"/>
+        </w:rPr>
+        <w:t xml:space="preserve">Purpose: </w:t>
+      </w:r>
+      <w:r>
+        <w:rPr>
+          <w:rFonts w:ascii="Arial" w:cs="Arial" w:eastAsia="Arial" w:hAnsi="Arial"/>
+          <w:color w:val="2D3436"/>
+          <w:sz w:val="21"/>
+          <w:szCs w:val="21"/>
+        </w:rPr>
+        <w:t xml:space="preserve">Make browsing decision-focused rather than a list to scroll.</w:t>
+      </w:r>
+    </w:p>
+    <w:p>
+      <w:pPr>
+        <w:spacing w:after="110" w:line="268"/>
+      </w:pPr>
+      <w:r>
+        <w:rPr>
+          <w:rFonts w:ascii="Arial" w:cs="Arial" w:eastAsia="Arial" w:hAnsi="Arial"/>
+          <w:b/>
+          <w:bCs/>
+          <w:color w:val="2D3436"/>
+          <w:sz w:val="21"/>
+          <w:szCs w:val="21"/>
+        </w:rPr>
+        <w:t xml:space="preserve">How it works: </w:t>
+      </w:r>
+      <w:r>
+        <w:rPr>
+          <w:rFonts w:ascii="Arial" w:cs="Arial" w:eastAsia="Arial" w:hAnsi="Arial"/>
+          <w:color w:val="2D3436"/>
+          <w:sz w:val="21"/>
+          <w:szCs w:val="21"/>
+        </w:rPr>
+        <w:t xml:space="preserve">Every card computes a live Match Score against the real profile, sorts by it, shows missing skills in red, and carries the Anti-Ghost rating.</w:t>
+      </w:r>
+    </w:p>
+    <w:p>
+      <w:pPr>
+        <w:spacing w:after="110" w:line="268"/>
+      </w:pPr>
+      <w:r>
+        <w:rPr>
+          <w:rFonts w:ascii="Arial" w:cs="Arial" w:eastAsia="Arial" w:hAnsi="Arial"/>
+          <w:b/>
+          <w:bCs/>
+          <w:color w:val="2D3436"/>
+          <w:sz w:val="21"/>
+          <w:szCs w:val="21"/>
+        </w:rPr>
+        <w:t xml:space="preserve">Data source (inside our own code): </w:t>
+      </w:r>
+      <w:r>
+        <w:rPr>
+          <w:rFonts w:ascii="Arial" w:cs="Arial" w:eastAsia="Arial" w:hAnsi="Arial"/>
+          <w:color w:val="2D3436"/>
+          <w:sz w:val="21"/>
+          <w:szCs w:val="21"/>
+        </w:rPr>
+        <w:t xml:space="preserve">mockJobs + jobDetails.</w:t>
+      </w:r>
+    </w:p>
+    <w:p>
+      <w:pPr>
+        <w:spacing w:after="110" w:line="268"/>
+      </w:pPr>
+      <w:r>
+        <w:rPr>
+          <w:rFonts w:ascii="Arial" w:cs="Arial" w:eastAsia="Arial" w:hAnsi="Arial"/>
+          <w:b/>
+          <w:bCs/>
+          <w:color w:val="2D3436"/>
+          <w:sz w:val="21"/>
+          <w:szCs w:val="21"/>
+        </w:rPr>
+        <w:t xml:space="preserve">External API: </w:t>
+      </w:r>
+      <w:r>
+        <w:rPr>
+          <w:rFonts w:ascii="Arial" w:cs="Arial" w:eastAsia="Arial" w:hAnsi="Arial"/>
+          <w:b w:val="false"/>
+          <w:bCs w:val="false"/>
+          <w:color w:val="5A6570"/>
+          <w:sz w:val="21"/>
+          <w:szCs w:val="21"/>
+        </w:rPr>
+        <w:t xml:space="preserve">None — no internet call</w:t>
+      </w:r>
+    </w:p>
+    <w:p>
+      <w:pPr>
+        <w:pStyle w:val="Heading3"/>
+        <w:spacing w:after="70" w:before="200"/>
+      </w:pPr>
+      <w:r>
+        <w:rPr>
+          <w:rFonts w:ascii="Arial" w:cs="Arial" w:eastAsia="Arial" w:hAnsi="Arial"/>
+          <w:b/>
+          <w:bCs/>
+          <w:color w:val="8A6D1F"/>
+          <w:sz w:val="22"/>
+          <w:szCs w:val="22"/>
+        </w:rPr>
+        <w:t xml:space="preserve">7. Job Detail — Match Score  ·  /jobs/[id]</w:t>
+      </w:r>
+    </w:p>
+    <w:p>
+      <w:pPr>
+        <w:spacing w:after="110" w:line="268"/>
+      </w:pPr>
+      <w:r>
+        <w:rPr>
+          <w:rFonts w:ascii="Arial" w:cs="Arial" w:eastAsia="Arial" w:hAnsi="Arial"/>
+          <w:b/>
+          <w:bCs/>
+          <w:color w:val="2D3436"/>
+          <w:sz w:val="21"/>
+          <w:szCs w:val="21"/>
+        </w:rPr>
+        <w:t xml:space="preserve">Purpose: </w:t>
+      </w:r>
+      <w:r>
+        <w:rPr>
+          <w:rFonts w:ascii="Arial" w:cs="Arial" w:eastAsia="Arial" w:hAnsi="Arial"/>
+          <w:color w:val="2D3436"/>
+          <w:sz w:val="21"/>
+          <w:szCs w:val="21"/>
+        </w:rPr>
+        <w:t xml:space="preserve">Answer "do I fit THIS role, and why?" — not just a skills tick-list.</w:t>
+      </w:r>
+    </w:p>
+    <w:p>
+      <w:pPr>
+        <w:spacing w:after="110" w:line="268"/>
+      </w:pPr>
+      <w:r>
+        <w:rPr>
+          <w:rFonts w:ascii="Arial" w:cs="Arial" w:eastAsia="Arial" w:hAnsi="Arial"/>
+          <w:b/>
+          <w:bCs/>
+          <w:color w:val="2D3436"/>
+          <w:sz w:val="21"/>
+          <w:szCs w:val="21"/>
+        </w:rPr>
+        <w:t xml:space="preserve">How it works: </w:t>
+      </w:r>
+      <w:r>
+        <w:rPr>
+          <w:rFonts w:ascii="Arial" w:cs="Arial" w:eastAsia="Arial" w:hAnsi="Arial"/>
+          <w:color w:val="2D3436"/>
+          <w:sz w:val="21"/>
+          <w:szCs w:val="21"/>
+        </w:rPr>
+        <w:t xml:space="preserve">matchScore() scores six weighted dimensions with a reason for each, then lists matched/missing skills and an apply verdict (Strong apply / Close 1 gap / Stretch).</w:t>
+      </w:r>
+    </w:p>
+    <w:p>
+      <w:pPr>
+        <w:spacing w:after="110" w:line="268"/>
+      </w:pPr>
+      <w:r>
+        <w:rPr>
+          <w:rFonts w:ascii="Arial" w:cs="Arial" w:eastAsia="Arial" w:hAnsi="Arial"/>
+          <w:b/>
+          <w:bCs/>
+          <w:color w:val="2D3436"/>
+          <w:sz w:val="21"/>
+          <w:szCs w:val="21"/>
+        </w:rPr>
+        <w:t xml:space="preserve">Data source (inside our own code): </w:t>
+      </w:r>
+      <w:r>
+        <w:rPr>
+          <w:rFonts w:ascii="Arial" w:cs="Arial" w:eastAsia="Arial" w:hAnsi="Arial"/>
+          <w:color w:val="2D3436"/>
+          <w:sz w:val="21"/>
+          <w:szCs w:val="21"/>
+        </w:rPr>
+        <w:t xml:space="preserve">mockJobs + jobDetails + careerProfile.</w:t>
+      </w:r>
+    </w:p>
+    <w:p>
+      <w:pPr>
+        <w:spacing w:after="110" w:line="268"/>
+      </w:pPr>
+      <w:r>
+        <w:rPr>
+          <w:rFonts w:ascii="Arial" w:cs="Arial" w:eastAsia="Arial" w:hAnsi="Arial"/>
+          <w:b/>
+          <w:bCs/>
+          <w:color w:val="2D3436"/>
+          <w:sz w:val="21"/>
+          <w:szCs w:val="21"/>
+        </w:rPr>
+        <w:t xml:space="preserve">External API: </w:t>
+      </w:r>
+      <w:r>
+        <w:rPr>
+          <w:rFonts w:ascii="Arial" w:cs="Arial" w:eastAsia="Arial" w:hAnsi="Arial"/>
+          <w:b/>
+          <w:bCs/>
+          <w:color w:val="00795C"/>
+          <w:sz w:val="21"/>
+          <w:szCs w:val="21"/>
+        </w:rPr>
+        <w:t xml:space="preserve">None — deterministic and explainable</w:t>
+      </w:r>
+    </w:p>
+    <w:p>
+      <w:pPr>
+        <w:pStyle w:val="Heading3"/>
+        <w:spacing w:after="70" w:before="200"/>
+      </w:pPr>
+      <w:r>
+        <w:rPr>
+          <w:rFonts w:ascii="Arial" w:cs="Arial" w:eastAsia="Arial" w:hAnsi="Arial"/>
+          <w:b/>
+          <w:bCs/>
+          <w:color w:val="8A6D1F"/>
+          <w:sz w:val="22"/>
+          <w:szCs w:val="22"/>
+        </w:rPr>
+        <w:t xml:space="preserve">8. My Applications  ·  /applications</w:t>
+      </w:r>
+    </w:p>
+    <w:p>
+      <w:pPr>
+        <w:spacing w:after="110" w:line="268"/>
+      </w:pPr>
+      <w:r>
+        <w:rPr>
+          <w:rFonts w:ascii="Arial" w:cs="Arial" w:eastAsia="Arial" w:hAnsi="Arial"/>
+          <w:b/>
+          <w:bCs/>
+          <w:color w:val="2D3436"/>
+          <w:sz w:val="21"/>
+          <w:szCs w:val="21"/>
+        </w:rPr>
+        <w:t xml:space="preserve">Purpose: </w:t>
+      </w:r>
+      <w:r>
+        <w:rPr>
+          <w:rFonts w:ascii="Arial" w:cs="Arial" w:eastAsia="Arial" w:hAnsi="Arial"/>
+          <w:color w:val="2D3436"/>
+          <w:sz w:val="21"/>
+          <w:szCs w:val="21"/>
+        </w:rPr>
+        <w:t xml:space="preserve">Close the loop after applying — no more black hole.</w:t>
+      </w:r>
+    </w:p>
+    <w:p>
+      <w:pPr>
+        <w:spacing w:after="110" w:line="268"/>
+      </w:pPr>
+      <w:r>
+        <w:rPr>
+          <w:rFonts w:ascii="Arial" w:cs="Arial" w:eastAsia="Arial" w:hAnsi="Arial"/>
+          <w:b/>
+          <w:bCs/>
+          <w:color w:val="2D3436"/>
+          <w:sz w:val="21"/>
+          <w:szCs w:val="21"/>
+        </w:rPr>
+        <w:t xml:space="preserve">How it works: </w:t>
+      </w:r>
+      <w:r>
+        <w:rPr>
+          <w:rFonts w:ascii="Arial" w:cs="Arial" w:eastAsia="Arial" w:hAnsi="Arial"/>
+          <w:color w:val="2D3436"/>
+          <w:sz w:val="21"/>
+          <w:szCs w:val="21"/>
+        </w:rPr>
+        <w:t xml:space="preserve">Applications persist to localStorage; each row shows a 4-stage pipeline (Applied → Under Review → Interview → Offer), the Anti-Ghost rating and a next step. Stalled ones flagged amber.</w:t>
+      </w:r>
+    </w:p>
+    <w:p>
+      <w:pPr>
+        <w:spacing w:after="110" w:line="268"/>
+      </w:pPr>
+      <w:r>
+        <w:rPr>
+          <w:rFonts w:ascii="Arial" w:cs="Arial" w:eastAsia="Arial" w:hAnsi="Arial"/>
+          <w:b/>
+          <w:bCs/>
+          <w:color w:val="2D3436"/>
+          <w:sz w:val="21"/>
+          <w:szCs w:val="21"/>
+        </w:rPr>
+        <w:t xml:space="preserve">Data source (inside our own code): </w:t>
+      </w:r>
+      <w:r>
+        <w:rPr>
+          <w:rFonts w:ascii="Arial" w:cs="Arial" w:eastAsia="Arial" w:hAnsi="Arial"/>
+          <w:color w:val="2D3436"/>
+          <w:sz w:val="21"/>
+          <w:szCs w:val="21"/>
+        </w:rPr>
+        <w:t xml:space="preserve">myApplications (localStorage) + mockApplications for varied demo stages.</w:t>
+      </w:r>
+    </w:p>
+    <w:p>
+      <w:pPr>
+        <w:spacing w:after="110" w:line="268"/>
+      </w:pPr>
+      <w:r>
+        <w:rPr>
+          <w:rFonts w:ascii="Arial" w:cs="Arial" w:eastAsia="Arial" w:hAnsi="Arial"/>
+          <w:b/>
+          <w:bCs/>
+          <w:color w:val="2D3436"/>
+          <w:sz w:val="21"/>
+          <w:szCs w:val="21"/>
+        </w:rPr>
+        <w:t xml:space="preserve">External API: </w:t>
+      </w:r>
+      <w:r>
+        <w:rPr>
+          <w:rFonts w:ascii="Arial" w:cs="Arial" w:eastAsia="Arial" w:hAnsi="Arial"/>
+          <w:b w:val="false"/>
+          <w:bCs w:val="false"/>
+          <w:color w:val="5A6570"/>
+          <w:sz w:val="21"/>
+          <w:szCs w:val="21"/>
+        </w:rPr>
+        <w:t xml:space="preserve">None — no internet call</w:t>
+      </w:r>
+    </w:p>
+    <w:p>
+      <w:pPr>
+        <w:pStyle w:val="Heading3"/>
+        <w:spacing w:after="70" w:before="200"/>
+      </w:pPr>
+      <w:r>
+        <w:rPr>
+          <w:rFonts w:ascii="Arial" w:cs="Arial" w:eastAsia="Arial" w:hAnsi="Arial"/>
+          <w:b/>
+          <w:bCs/>
+          <w:color w:val="8A6D1F"/>
+          <w:sz w:val="22"/>
+          <w:szCs w:val="22"/>
+        </w:rPr>
+        <w:t xml:space="preserve">9. Company Directory  ·  /companies</w:t>
+      </w:r>
+    </w:p>
+    <w:p>
+      <w:pPr>
+        <w:spacing w:after="110" w:line="268"/>
+      </w:pPr>
+      <w:r>
+        <w:rPr>
+          <w:rFonts w:ascii="Arial" w:cs="Arial" w:eastAsia="Arial" w:hAnsi="Arial"/>
+          <w:b/>
+          <w:bCs/>
+          <w:color w:val="2D3436"/>
+          <w:sz w:val="21"/>
+          <w:szCs w:val="21"/>
+        </w:rPr>
+        <w:t xml:space="preserve">Purpose: </w:t>
+      </w:r>
+      <w:r>
+        <w:rPr>
+          <w:rFonts w:ascii="Arial" w:cs="Arial" w:eastAsia="Arial" w:hAnsi="Arial"/>
+          <w:color w:val="2D3436"/>
+          <w:sz w:val="21"/>
+          <w:szCs w:val="21"/>
+        </w:rPr>
+        <w:t xml:space="preserve">Let candidates judge an employer before applying.</w:t>
+      </w:r>
+    </w:p>
+    <w:p>
+      <w:pPr>
+        <w:spacing w:after="110" w:line="268"/>
+      </w:pPr>
+      <w:r>
+        <w:rPr>
+          <w:rFonts w:ascii="Arial" w:cs="Arial" w:eastAsia="Arial" w:hAnsi="Arial"/>
+          <w:b/>
+          <w:bCs/>
+          <w:color w:val="2D3436"/>
+          <w:sz w:val="21"/>
+          <w:szCs w:val="21"/>
+        </w:rPr>
+        <w:t xml:space="preserve">How it works: </w:t>
+      </w:r>
+      <w:r>
+        <w:rPr>
+          <w:rFonts w:ascii="Arial" w:cs="Arial" w:eastAsia="Arial" w:hAnsi="Arial"/>
+          <w:color w:val="2D3436"/>
+          <w:sz w:val="21"/>
+          <w:szCs w:val="21"/>
+        </w:rPr>
+        <w:t xml:space="preserve">Verified badges, years as Talentbank partner, ratings, Anti-Ghost scores, culture signals, candidate reviews and open roles. Links out to Glassdoor.</w:t>
+      </w:r>
+    </w:p>
+    <w:p>
+      <w:pPr>
+        <w:spacing w:after="110" w:line="268"/>
+      </w:pPr>
+      <w:r>
+        <w:rPr>
+          <w:rFonts w:ascii="Arial" w:cs="Arial" w:eastAsia="Arial" w:hAnsi="Arial"/>
+          <w:b/>
+          <w:bCs/>
+          <w:color w:val="2D3436"/>
+          <w:sz w:val="21"/>
+          <w:szCs w:val="21"/>
+        </w:rPr>
+        <w:t xml:space="preserve">Data source (inside our own code): </w:t>
+      </w:r>
+      <w:r>
+        <w:rPr>
+          <w:rFonts w:ascii="Arial" w:cs="Arial" w:eastAsia="Arial" w:hAnsi="Arial"/>
+          <w:color w:val="2D3436"/>
+          <w:sz w:val="21"/>
+          <w:szCs w:val="21"/>
+        </w:rPr>
+        <w:t xml:space="preserve">mockCompanies; reviews from getCompanyReviews().</w:t>
+      </w:r>
+    </w:p>
+    <w:p>
+      <w:pPr>
+        <w:spacing w:after="110" w:line="268"/>
+      </w:pPr>
+      <w:r>
+        <w:rPr>
+          <w:rFonts w:ascii="Arial" w:cs="Arial" w:eastAsia="Arial" w:hAnsi="Arial"/>
+          <w:b/>
+          <w:bCs/>
+          <w:color w:val="2D3436"/>
+          <w:sz w:val="21"/>
+          <w:szCs w:val="21"/>
+        </w:rPr>
+        <w:t xml:space="preserve">External API: </w:t>
+      </w:r>
+      <w:r>
+        <w:rPr>
+          <w:rFonts w:ascii="Arial" w:cs="Arial" w:eastAsia="Arial" w:hAnsi="Arial"/>
+          <w:b/>
+          <w:bCs/>
+          <w:color w:val="00795C"/>
+          <w:sz w:val="21"/>
+          <w:szCs w:val="21"/>
+        </w:rPr>
+        <w:t xml:space="preserve">None (Glassdoor is an outbound link)</w:t>
+      </w:r>
+    </w:p>
+    <w:p>
+      <w:pPr>
+        <w:pStyle w:val="Heading3"/>
+        <w:spacing w:after="70" w:before="200"/>
+      </w:pPr>
+      <w:r>
+        <w:rPr>
+          <w:rFonts w:ascii="Arial" w:cs="Arial" w:eastAsia="Arial" w:hAnsi="Arial"/>
+          <w:b/>
+          <w:bCs/>
+          <w:color w:val="8A6D1F"/>
+          <w:sz w:val="22"/>
+          <w:szCs w:val="22"/>
+        </w:rPr>
+        <w:t xml:space="preserve">10. YourAnimal Test  ·  /aptitude-test</w:t>
+      </w:r>
+    </w:p>
+    <w:p>
+      <w:pPr>
+        <w:spacing w:after="110" w:line="268"/>
+      </w:pPr>
+      <w:r>
+        <w:rPr>
+          <w:rFonts w:ascii="Arial" w:cs="Arial" w:eastAsia="Arial" w:hAnsi="Arial"/>
+          <w:b/>
+          <w:bCs/>
+          <w:color w:val="2D3436"/>
+          <w:sz w:val="21"/>
+          <w:szCs w:val="21"/>
+        </w:rPr>
+        <w:t xml:space="preserve">Purpose: </w:t>
+      </w:r>
+      <w:r>
+        <w:rPr>
+          <w:rFonts w:ascii="Arial" w:cs="Arial" w:eastAsia="Arial" w:hAnsi="Arial"/>
+          <w:color w:val="2D3436"/>
+          <w:sz w:val="21"/>
+          <w:szCs w:val="21"/>
+        </w:rPr>
+        <w:t xml:space="preserve">Talentbank's mandatory personality assessment, used as a career-fit and culture signal.</w:t>
+      </w:r>
+    </w:p>
+    <w:p>
+      <w:pPr>
+        <w:spacing w:after="110" w:line="268"/>
+      </w:pPr>
+      <w:r>
+        <w:rPr>
+          <w:rFonts w:ascii="Arial" w:cs="Arial" w:eastAsia="Arial" w:hAnsi="Arial"/>
+          <w:b/>
+          <w:bCs/>
+          <w:color w:val="2D3436"/>
+          <w:sz w:val="21"/>
+          <w:szCs w:val="21"/>
+        </w:rPr>
+        <w:t xml:space="preserve">How it works: </w:t>
+      </w:r>
+      <w:r>
+        <w:rPr>
+          <w:rFonts w:ascii="Arial" w:cs="Arial" w:eastAsia="Arial" w:hAnsi="Arial"/>
+          <w:color w:val="2D3436"/>
+          <w:sz w:val="21"/>
+          <w:szCs w:val="21"/>
+        </w:rPr>
+        <w:t xml:space="preserve">The full 40-question assessment mapping to five work animals (Lion, Owl, Dolphin, Fox, Wolf), each with work style, predicted trajectory and best-fit roles. Saved to the profile and shown to employers.</w:t>
+      </w:r>
+    </w:p>
+    <w:p>
+      <w:pPr>
+        <w:spacing w:after="110" w:line="268"/>
+      </w:pPr>
+      <w:r>
+        <w:rPr>
+          <w:rFonts w:ascii="Arial" w:cs="Arial" w:eastAsia="Arial" w:hAnsi="Arial"/>
+          <w:b/>
+          <w:bCs/>
+          <w:color w:val="2D3436"/>
+          <w:sz w:val="21"/>
+          <w:szCs w:val="21"/>
+        </w:rPr>
+        <w:t xml:space="preserve">Data source (inside our own code): </w:t>
+      </w:r>
+      <w:r>
+        <w:rPr>
+          <w:rFonts w:ascii="Arial" w:cs="Arial" w:eastAsia="Arial" w:hAnsi="Arial"/>
+          <w:color w:val="2D3436"/>
+          <w:sz w:val="21"/>
+          <w:szCs w:val="21"/>
+        </w:rPr>
+        <w:t xml:space="preserve">lib/animalTest.ts. Attribution to yourworkanimal.com.</w:t>
+      </w:r>
+    </w:p>
+    <w:p>
+      <w:pPr>
+        <w:spacing w:after="110" w:line="268"/>
+      </w:pPr>
+      <w:r>
+        <w:rPr>
+          <w:rFonts w:ascii="Arial" w:cs="Arial" w:eastAsia="Arial" w:hAnsi="Arial"/>
+          <w:b/>
+          <w:bCs/>
+          <w:color w:val="2D3436"/>
+          <w:sz w:val="21"/>
+          <w:szCs w:val="21"/>
+        </w:rPr>
+        <w:t xml:space="preserve">External API: </w:t>
+      </w:r>
+      <w:r>
+        <w:rPr>
+          <w:rFonts w:ascii="Arial" w:cs="Arial" w:eastAsia="Arial" w:hAnsi="Arial"/>
+          <w:b w:val="false"/>
+          <w:bCs w:val="false"/>
+          <w:color w:val="5A6570"/>
+          <w:sz w:val="21"/>
+          <w:szCs w:val="21"/>
+        </w:rPr>
+        <w:t xml:space="preserve">None — no internet call</w:t>
+      </w:r>
+    </w:p>
+    <w:p>
+      <w:pPr>
+        <w:pStyle w:val="Heading3"/>
+        <w:spacing w:after="70" w:before="200"/>
+      </w:pPr>
+      <w:r>
+        <w:rPr>
+          <w:rFonts w:ascii="Arial" w:cs="Arial" w:eastAsia="Arial" w:hAnsi="Arial"/>
+          <w:b/>
+          <w:bCs/>
+          <w:color w:val="8A6D1F"/>
+          <w:sz w:val="22"/>
+          <w:szCs w:val="22"/>
+        </w:rPr>
+        <w:t xml:space="preserve">11. My Story Video  ·  /story-video</w:t>
+      </w:r>
+    </w:p>
+    <w:p>
+      <w:pPr>
+        <w:spacing w:after="110" w:line="268"/>
+      </w:pPr>
+      <w:r>
+        <w:rPr>
+          <w:rFonts w:ascii="Arial" w:cs="Arial" w:eastAsia="Arial" w:hAnsi="Arial"/>
+          <w:b/>
+          <w:bCs/>
+          <w:color w:val="2D3436"/>
+          <w:sz w:val="21"/>
+          <w:szCs w:val="21"/>
+        </w:rPr>
+        <w:t xml:space="preserve">Purpose: </w:t>
+      </w:r>
+      <w:r>
+        <w:rPr>
+          <w:rFonts w:ascii="Arial" w:cs="Arial" w:eastAsia="Arial" w:hAnsi="Arial"/>
+          <w:color w:val="2D3436"/>
+          <w:sz w:val="21"/>
+          <w:szCs w:val="21"/>
+        </w:rPr>
+        <w:t xml:space="preserve">The one place a candidate stops being a score and becomes a person.</w:t>
+      </w:r>
+    </w:p>
+    <w:p>
+      <w:pPr>
+        <w:spacing w:after="110" w:line="268"/>
+      </w:pPr>
+      <w:r>
+        <w:rPr>
+          <w:rFonts w:ascii="Arial" w:cs="Arial" w:eastAsia="Arial" w:hAnsi="Arial"/>
+          <w:b/>
+          <w:bCs/>
+          <w:color w:val="2D3436"/>
+          <w:sz w:val="21"/>
+          <w:szCs w:val="21"/>
+        </w:rPr>
+        <w:t xml:space="preserve">How it works: </w:t>
+      </w:r>
+      <w:r>
+        <w:rPr>
+          <w:rFonts w:ascii="Arial" w:cs="Arial" w:eastAsia="Arial" w:hAnsi="Arial"/>
+          <w:color w:val="2D3436"/>
+          <w:sz w:val="21"/>
+          <w:szCs w:val="21"/>
+        </w:rPr>
+        <w:t xml:space="preserve">A guided 60-second video with four prompts that advance as a teleprompter. Uses the real camera (getUserMedia + MediaRecorder); if denied it runs a simulated recording so the demo never breaks. Privacy toggles control visibility.</w:t>
+      </w:r>
+    </w:p>
+    <w:p>
+      <w:pPr>
+        <w:spacing w:after="110" w:line="268"/>
+      </w:pPr>
+      <w:r>
+        <w:rPr>
+          <w:rFonts w:ascii="Arial" w:cs="Arial" w:eastAsia="Arial" w:hAnsi="Arial"/>
+          <w:b/>
+          <w:bCs/>
+          <w:color w:val="2D3436"/>
+          <w:sz w:val="21"/>
+          <w:szCs w:val="21"/>
+        </w:rPr>
+        <w:t xml:space="preserve">Data source (inside our own code): </w:t>
+      </w:r>
+      <w:r>
+        <w:rPr>
+          <w:rFonts w:ascii="Arial" w:cs="Arial" w:eastAsia="Arial" w:hAnsi="Arial"/>
+          <w:color w:val="2D3436"/>
+          <w:sz w:val="21"/>
+          <w:szCs w:val="21"/>
+        </w:rPr>
+        <w:t xml:space="preserve">Prompts/metadata in lib/storyVideo.ts; recording held in browser memory only — nothing uploaded.</w:t>
+      </w:r>
+    </w:p>
+    <w:p>
+      <w:pPr>
+        <w:spacing w:after="110" w:line="268"/>
+      </w:pPr>
+      <w:r>
+        <w:rPr>
+          <w:rFonts w:ascii="Arial" w:cs="Arial" w:eastAsia="Arial" w:hAnsi="Arial"/>
+          <w:b/>
+          <w:bCs/>
+          <w:color w:val="2D3436"/>
+          <w:sz w:val="21"/>
+          <w:szCs w:val="21"/>
+        </w:rPr>
+        <w:t xml:space="preserve">External API: </w:t>
+      </w:r>
+      <w:r>
+        <w:rPr>
+          <w:rFonts w:ascii="Arial" w:cs="Arial" w:eastAsia="Arial" w:hAnsi="Arial"/>
+          <w:b w:val="false"/>
+          <w:bCs w:val="false"/>
+          <w:color w:val="5A6570"/>
+          <w:sz w:val="21"/>
+          <w:szCs w:val="21"/>
+        </w:rPr>
+        <w:t xml:space="preserve">None — no internet call</w:t>
+      </w:r>
+    </w:p>
+    <w:p>
+      <w:pPr>
+        <w:pStyle w:val="Heading3"/>
+        <w:spacing w:after="70" w:before="200"/>
+      </w:pPr>
+      <w:r>
+        <w:rPr>
+          <w:rFonts w:ascii="Arial" w:cs="Arial" w:eastAsia="Arial" w:hAnsi="Arial"/>
+          <w:b/>
+          <w:bCs/>
+          <w:color w:val="8A6D1F"/>
+          <w:sz w:val="22"/>
+          <w:szCs w:val="22"/>
+        </w:rPr>
+        <w:t xml:space="preserve">13. Employer Dashboard  ·  /employer</w:t>
+      </w:r>
+    </w:p>
+    <w:p>
+      <w:pPr>
+        <w:spacing w:after="110" w:line="268"/>
+      </w:pPr>
+      <w:r>
+        <w:rPr>
+          <w:rFonts w:ascii="Arial" w:cs="Arial" w:eastAsia="Arial" w:hAnsi="Arial"/>
+          <w:b/>
+          <w:bCs/>
+          <w:color w:val="2D3436"/>
+          <w:sz w:val="21"/>
+          <w:szCs w:val="21"/>
+        </w:rPr>
+        <w:t xml:space="preserve">Purpose: </w:t>
+      </w:r>
+      <w:r>
+        <w:rPr>
+          <w:rFonts w:ascii="Arial" w:cs="Arial" w:eastAsia="Arial" w:hAnsi="Arial"/>
+          <w:color w:val="2D3436"/>
+          <w:sz w:val="21"/>
+          <w:szCs w:val="21"/>
+        </w:rPr>
+        <w:t xml:space="preserve">Make hiring accountable, not just efficient.</w:t>
+      </w:r>
+    </w:p>
+    <w:p>
+      <w:pPr>
+        <w:spacing w:after="110" w:line="268"/>
+      </w:pPr>
+      <w:r>
+        <w:rPr>
+          <w:rFonts w:ascii="Arial" w:cs="Arial" w:eastAsia="Arial" w:hAnsi="Arial"/>
+          <w:b/>
+          <w:bCs/>
+          <w:color w:val="2D3436"/>
+          <w:sz w:val="21"/>
+          <w:szCs w:val="21"/>
+        </w:rPr>
+        <w:t xml:space="preserve">How it works: </w:t>
+      </w:r>
+      <w:r>
+        <w:rPr>
+          <w:rFonts w:ascii="Arial" w:cs="Arial" w:eastAsia="Arial" w:hAnsi="Arial"/>
+          <w:color w:val="2D3436"/>
+          <w:sz w:val="21"/>
+          <w:szCs w:val="21"/>
+        </w:rPr>
+        <w:t xml:space="preserve">Shows the employer's own Anti-Ghost score (response time, ghosting rate, 6-week trend) alongside applicants ranked by CRS and tagged with YourAnimal culture fit.</w:t>
+      </w:r>
+    </w:p>
+    <w:p>
+      <w:pPr>
+        <w:spacing w:after="110" w:line="268"/>
+      </w:pPr>
+      <w:r>
+        <w:rPr>
+          <w:rFonts w:ascii="Arial" w:cs="Arial" w:eastAsia="Arial" w:hAnsi="Arial"/>
+          <w:b/>
+          <w:bCs/>
+          <w:color w:val="2D3436"/>
+          <w:sz w:val="21"/>
+          <w:szCs w:val="21"/>
+        </w:rPr>
+        <w:t xml:space="preserve">Data source (inside our own code): </w:t>
+      </w:r>
+      <w:r>
+        <w:rPr>
+          <w:rFonts w:ascii="Arial" w:cs="Arial" w:eastAsia="Arial" w:hAnsi="Arial"/>
+          <w:color w:val="2D3436"/>
+          <w:sz w:val="21"/>
+          <w:szCs w:val="21"/>
+        </w:rPr>
+        <w:t xml:space="preserve">mockEmployerStats + the shared candidate pool — the same people the university sees.</w:t>
+      </w:r>
+    </w:p>
+    <w:p>
+      <w:pPr>
+        <w:spacing w:after="110" w:line="268"/>
+      </w:pPr>
+      <w:r>
+        <w:rPr>
+          <w:rFonts w:ascii="Arial" w:cs="Arial" w:eastAsia="Arial" w:hAnsi="Arial"/>
+          <w:b/>
+          <w:bCs/>
+          <w:color w:val="2D3436"/>
+          <w:sz w:val="21"/>
+          <w:szCs w:val="21"/>
+        </w:rPr>
+        <w:t xml:space="preserve">External API: </w:t>
+      </w:r>
+      <w:r>
+        <w:rPr>
+          <w:rFonts w:ascii="Arial" w:cs="Arial" w:eastAsia="Arial" w:hAnsi="Arial"/>
+          <w:b w:val="false"/>
+          <w:bCs w:val="false"/>
+          <w:color w:val="5A6570"/>
+          <w:sz w:val="21"/>
+          <w:szCs w:val="21"/>
+        </w:rPr>
+        <w:t xml:space="preserve">None — no internet call</w:t>
+      </w:r>
+    </w:p>
+    <w:p>
+      <w:pPr>
+        <w:pStyle w:val="Heading3"/>
+        <w:spacing w:after="70" w:before="200"/>
+      </w:pPr>
+      <w:r>
+        <w:rPr>
+          <w:rFonts w:ascii="Arial" w:cs="Arial" w:eastAsia="Arial" w:hAnsi="Arial"/>
+          <w:b/>
+          <w:bCs/>
+          <w:color w:val="8A6D1F"/>
+          <w:sz w:val="22"/>
+          <w:szCs w:val="22"/>
+        </w:rPr>
+        <w:t xml:space="preserve">14. Applicant Detail  ·  /employer/applicants/[id]</w:t>
+      </w:r>
+    </w:p>
+    <w:p>
+      <w:pPr>
+        <w:spacing w:after="110" w:line="268"/>
+      </w:pPr>
+      <w:r>
+        <w:rPr>
+          <w:rFonts w:ascii="Arial" w:cs="Arial" w:eastAsia="Arial" w:hAnsi="Arial"/>
+          <w:b/>
+          <w:bCs/>
+          <w:color w:val="2D3436"/>
+          <w:sz w:val="21"/>
+          <w:szCs w:val="21"/>
+        </w:rPr>
+        <w:t xml:space="preserve">Purpose: </w:t>
+      </w:r>
+      <w:r>
+        <w:rPr>
+          <w:rFonts w:ascii="Arial" w:cs="Arial" w:eastAsia="Arial" w:hAnsi="Arial"/>
+          <w:color w:val="2D3436"/>
+          <w:sz w:val="21"/>
+          <w:szCs w:val="21"/>
+        </w:rPr>
+        <w:t xml:space="preserve">Everything a hiring manager needs on one screen.</w:t>
+      </w:r>
+    </w:p>
+    <w:p>
+      <w:pPr>
+        <w:spacing w:after="110" w:line="268"/>
+      </w:pPr>
+      <w:r>
+        <w:rPr>
+          <w:rFonts w:ascii="Arial" w:cs="Arial" w:eastAsia="Arial" w:hAnsi="Arial"/>
+          <w:b/>
+          <w:bCs/>
+          <w:color w:val="2D3436"/>
+          <w:sz w:val="21"/>
+          <w:szCs w:val="21"/>
+        </w:rPr>
+        <w:t xml:space="preserve">How it works: </w:t>
+      </w:r>
+      <w:r>
+        <w:rPr>
+          <w:rFonts w:ascii="Arial" w:cs="Arial" w:eastAsia="Arial" w:hAnsi="Arial"/>
+          <w:color w:val="2D3436"/>
+          <w:sz w:val="21"/>
+          <w:szCs w:val="21"/>
+        </w:rPr>
+        <w:t xml:space="preserve">Readiness score and risk band, a "Match to this role" card scoring the candidate against the job they applied for, ending with gaps to probe in interview, plus their Story Video and an A4-style resume.</w:t>
+      </w:r>
+    </w:p>
+    <w:p>
+      <w:pPr>
+        <w:spacing w:after="110" w:line="268"/>
+      </w:pPr>
+      <w:r>
+        <w:rPr>
+          <w:rFonts w:ascii="Arial" w:cs="Arial" w:eastAsia="Arial" w:hAnsi="Arial"/>
+          <w:b/>
+          <w:bCs/>
+          <w:color w:val="2D3436"/>
+          <w:sz w:val="21"/>
+          <w:szCs w:val="21"/>
+        </w:rPr>
+        <w:t xml:space="preserve">Data source (inside our own code): </w:t>
+      </w:r>
+      <w:r>
+        <w:rPr>
+          <w:rFonts w:ascii="Arial" w:cs="Arial" w:eastAsia="Arial" w:hAnsi="Arial"/>
+          <w:color w:val="2D3436"/>
+          <w:sz w:val="21"/>
+          <w:szCs w:val="21"/>
+        </w:rPr>
+        <w:t xml:space="preserve">Shared candidates array + applicantRoles mapping.</w:t>
+      </w:r>
+    </w:p>
+    <w:p>
+      <w:pPr>
+        <w:spacing w:after="110" w:line="268"/>
+      </w:pPr>
+      <w:r>
+        <w:rPr>
+          <w:rFonts w:ascii="Arial" w:cs="Arial" w:eastAsia="Arial" w:hAnsi="Arial"/>
+          <w:b/>
+          <w:bCs/>
+          <w:color w:val="2D3436"/>
+          <w:sz w:val="21"/>
+          <w:szCs w:val="21"/>
+        </w:rPr>
+        <w:t xml:space="preserve">External API: </w:t>
+      </w:r>
+      <w:r>
+        <w:rPr>
+          <w:rFonts w:ascii="Arial" w:cs="Arial" w:eastAsia="Arial" w:hAnsi="Arial"/>
+          <w:b w:val="false"/>
+          <w:bCs w:val="false"/>
+          <w:color w:val="5A6570"/>
+          <w:sz w:val="21"/>
+          <w:szCs w:val="21"/>
+        </w:rPr>
+        <w:t xml:space="preserve">None — no internet call</w:t>
+      </w:r>
+    </w:p>
+    <w:p>
+      <w:pPr>
+        <w:pStyle w:val="Heading3"/>
+        <w:spacing w:after="70" w:before="200"/>
+      </w:pPr>
+      <w:r>
+        <w:rPr>
+          <w:rFonts w:ascii="Arial" w:cs="Arial" w:eastAsia="Arial" w:hAnsi="Arial"/>
+          <w:b/>
+          <w:bCs/>
+          <w:color w:val="8A6D1F"/>
+          <w:sz w:val="22"/>
+          <w:szCs w:val="22"/>
+        </w:rPr>
+        <w:t xml:space="preserve">15. Employability Dashboard  ·  /university</w:t>
+      </w:r>
+    </w:p>
+    <w:p>
+      <w:pPr>
+        <w:spacing w:after="110" w:line="268"/>
+      </w:pPr>
+      <w:r>
+        <w:rPr>
+          <w:rFonts w:ascii="Arial" w:cs="Arial" w:eastAsia="Arial" w:hAnsi="Arial"/>
+          <w:b/>
+          <w:bCs/>
+          <w:color w:val="2D3436"/>
+          <w:sz w:val="21"/>
+          <w:szCs w:val="21"/>
+        </w:rPr>
+        <w:t xml:space="preserve">Purpose: </w:t>
+      </w:r>
+      <w:r>
+        <w:rPr>
+          <w:rFonts w:ascii="Arial" w:cs="Arial" w:eastAsia="Arial" w:hAnsi="Arial"/>
+          <w:color w:val="2D3436"/>
+          <w:sz w:val="21"/>
+          <w:szCs w:val="21"/>
+        </w:rPr>
+        <w:t xml:space="preserve">Answer "which students are career-ready, and which are at risk?" — while there is still time to help.</w:t>
+      </w:r>
+    </w:p>
+    <w:p>
+      <w:pPr>
+        <w:spacing w:after="110" w:line="268"/>
+      </w:pPr>
+      <w:r>
+        <w:rPr>
+          <w:rFonts w:ascii="Arial" w:cs="Arial" w:eastAsia="Arial" w:hAnsi="Arial"/>
+          <w:b/>
+          <w:bCs/>
+          <w:color w:val="2D3436"/>
+          <w:sz w:val="21"/>
+          <w:szCs w:val="21"/>
+        </w:rPr>
+        <w:t xml:space="preserve">How it works: </w:t>
+      </w:r>
+      <w:r>
+        <w:rPr>
+          <w:rFonts w:ascii="Arial" w:cs="Arial" w:eastAsia="Arial" w:hAnsi="Arial"/>
+          <w:color w:val="2D3436"/>
+          <w:sz w:val="21"/>
+          <w:szCs w:val="21"/>
+        </w:rPr>
+        <w:t xml:space="preserve">Aggregates the same candidate pool into cohort readiness, at-risk counts, average ATS, portfolio completion and 12-month retention, plus an AI-style insight naming the programme needing most support.</w:t>
+      </w:r>
+    </w:p>
+    <w:p>
+      <w:pPr>
+        <w:spacing w:after="110" w:line="268"/>
+      </w:pPr>
+      <w:r>
+        <w:rPr>
+          <w:rFonts w:ascii="Arial" w:cs="Arial" w:eastAsia="Arial" w:hAnsi="Arial"/>
+          <w:b/>
+          <w:bCs/>
+          <w:color w:val="2D3436"/>
+          <w:sz w:val="21"/>
+          <w:szCs w:val="21"/>
+        </w:rPr>
+        <w:t xml:space="preserve">Data source (inside our own code): </w:t>
+      </w:r>
+      <w:r>
+        <w:rPr>
+          <w:rFonts w:ascii="Arial" w:cs="Arial" w:eastAsia="Arial" w:hAnsi="Arial"/>
+          <w:color w:val="2D3436"/>
+          <w:sz w:val="21"/>
+          <w:szCs w:val="21"/>
+        </w:rPr>
+        <w:t xml:space="preserve">Derived live from candidates + mockUniversityStats.</w:t>
+      </w:r>
+    </w:p>
+    <w:p>
+      <w:pPr>
+        <w:spacing w:after="110" w:line="268"/>
+      </w:pPr>
+      <w:r>
+        <w:rPr>
+          <w:rFonts w:ascii="Arial" w:cs="Arial" w:eastAsia="Arial" w:hAnsi="Arial"/>
+          <w:b/>
+          <w:bCs/>
+          <w:color w:val="2D3436"/>
+          <w:sz w:val="21"/>
+          <w:szCs w:val="21"/>
+        </w:rPr>
+        <w:t xml:space="preserve">External API: </w:t>
+      </w:r>
+      <w:r>
+        <w:rPr>
+          <w:rFonts w:ascii="Arial" w:cs="Arial" w:eastAsia="Arial" w:hAnsi="Arial"/>
+          <w:b w:val="false"/>
+          <w:bCs w:val="false"/>
+          <w:color w:val="5A6570"/>
+          <w:sz w:val="21"/>
+          <w:szCs w:val="21"/>
+        </w:rPr>
+        <w:t xml:space="preserve">None — no internet call</w:t>
+      </w:r>
+    </w:p>
+    <w:p>
+      <w:pPr>
+        <w:pStyle w:val="Heading3"/>
+        <w:spacing w:after="70" w:before="200"/>
+      </w:pPr>
+      <w:r>
+        <w:rPr>
+          <w:rFonts w:ascii="Arial" w:cs="Arial" w:eastAsia="Arial" w:hAnsi="Arial"/>
+          <w:b/>
+          <w:bCs/>
+          <w:color w:val="8A6D1F"/>
+          <w:sz w:val="22"/>
+          <w:szCs w:val="22"/>
+        </w:rPr>
+        <w:t xml:space="preserve">16. Intervention Queue  ·  /university/interventions</w:t>
+      </w:r>
+    </w:p>
+    <w:p>
+      <w:pPr>
+        <w:spacing w:after="110" w:line="268"/>
+      </w:pPr>
+      <w:r>
+        <w:rPr>
+          <w:rFonts w:ascii="Arial" w:cs="Arial" w:eastAsia="Arial" w:hAnsi="Arial"/>
+          <w:b/>
+          <w:bCs/>
+          <w:color w:val="2D3436"/>
+          <w:sz w:val="21"/>
+          <w:szCs w:val="21"/>
+        </w:rPr>
+        <w:t xml:space="preserve">Purpose: </w:t>
+      </w:r>
+      <w:r>
+        <w:rPr>
+          <w:rFonts w:ascii="Arial" w:cs="Arial" w:eastAsia="Arial" w:hAnsi="Arial"/>
+          <w:color w:val="2D3436"/>
+          <w:sz w:val="21"/>
+          <w:szCs w:val="21"/>
+        </w:rPr>
+        <w:t xml:space="preserve">Turn analysis into action — the university's to-do list.</w:t>
+      </w:r>
+    </w:p>
+    <w:p>
+      <w:pPr>
+        <w:spacing w:after="110" w:line="268"/>
+      </w:pPr>
+      <w:r>
+        <w:rPr>
+          <w:rFonts w:ascii="Arial" w:cs="Arial" w:eastAsia="Arial" w:hAnsi="Arial"/>
+          <w:b/>
+          <w:bCs/>
+          <w:color w:val="2D3436"/>
+          <w:sz w:val="21"/>
+          <w:szCs w:val="21"/>
+        </w:rPr>
+        <w:t xml:space="preserve">How it works: </w:t>
+      </w:r>
+      <w:r>
+        <w:rPr>
+          <w:rFonts w:ascii="Arial" w:cs="Arial" w:eastAsia="Arial" w:hAnsi="Arial"/>
+          <w:color w:val="2D3436"/>
+          <w:sz w:val="21"/>
+          <w:szCs w:val="21"/>
+        </w:rPr>
+        <w:t xml:space="preserve">Students sorted lowest-readiness first, each with the detected issue (low ATS, no portfolio, few applications) and a recommended intervention. A "Why this recommendation?" panel shows the breakdown and the rule that fired.</w:t>
+      </w:r>
+    </w:p>
+    <w:p>
+      <w:pPr>
+        <w:spacing w:after="110" w:line="268"/>
+      </w:pPr>
+      <w:r>
+        <w:rPr>
+          <w:rFonts w:ascii="Arial" w:cs="Arial" w:eastAsia="Arial" w:hAnsi="Arial"/>
+          <w:b/>
+          <w:bCs/>
+          <w:color w:val="2D3436"/>
+          <w:sz w:val="21"/>
+          <w:szCs w:val="21"/>
+        </w:rPr>
+        <w:t xml:space="preserve">Data source (inside our own code): </w:t>
+      </w:r>
+      <w:r>
+        <w:rPr>
+          <w:rFonts w:ascii="Arial" w:cs="Arial" w:eastAsia="Arial" w:hAnsi="Arial"/>
+          <w:color w:val="2D3436"/>
+          <w:sz w:val="21"/>
+          <w:szCs w:val="21"/>
+        </w:rPr>
+        <w:t xml:space="preserve">Shared candidate pool; issue/action derived from each weakest CRS component.</w:t>
+      </w:r>
+    </w:p>
+    <w:p>
+      <w:pPr>
+        <w:spacing w:after="110" w:line="268"/>
+      </w:pPr>
+      <w:r>
+        <w:rPr>
+          <w:rFonts w:ascii="Arial" w:cs="Arial" w:eastAsia="Arial" w:hAnsi="Arial"/>
+          <w:b/>
+          <w:bCs/>
+          <w:color w:val="2D3436"/>
+          <w:sz w:val="21"/>
+          <w:szCs w:val="21"/>
+        </w:rPr>
+        <w:t xml:space="preserve">External API: </w:t>
+      </w:r>
+      <w:r>
+        <w:rPr>
+          <w:rFonts w:ascii="Arial" w:cs="Arial" w:eastAsia="Arial" w:hAnsi="Arial"/>
+          <w:b w:val="false"/>
+          <w:bCs w:val="false"/>
+          <w:color w:val="5A6570"/>
+          <w:sz w:val="21"/>
+          <w:szCs w:val="21"/>
+        </w:rPr>
+        <w:t xml:space="preserve">None — no internet call</w:t>
+      </w:r>
+    </w:p>
+    <w:p>
+      <w:pPr>
+        <w:pStyle w:val="Heading3"/>
+        <w:spacing w:after="70" w:before="200"/>
+      </w:pPr>
+      <w:r>
+        <w:rPr>
+          <w:rFonts w:ascii="Arial" w:cs="Arial" w:eastAsia="Arial" w:hAnsi="Arial"/>
+          <w:b/>
+          <w:bCs/>
+          <w:color w:val="8A6D1F"/>
+          <w:sz w:val="22"/>
+          <w:szCs w:val="22"/>
+        </w:rPr>
+        <w:t xml:space="preserve">17. Faculty Skill Gaps  ·  /university/skill-gaps</w:t>
+      </w:r>
+    </w:p>
+    <w:p>
+      <w:pPr>
+        <w:spacing w:after="110" w:line="268"/>
+      </w:pPr>
+      <w:r>
+        <w:rPr>
+          <w:rFonts w:ascii="Arial" w:cs="Arial" w:eastAsia="Arial" w:hAnsi="Arial"/>
+          <w:b/>
+          <w:bCs/>
+          <w:color w:val="2D3436"/>
+          <w:sz w:val="21"/>
+          <w:szCs w:val="21"/>
+        </w:rPr>
+        <w:t xml:space="preserve">Purpose: </w:t>
+      </w:r>
+      <w:r>
+        <w:rPr>
+          <w:rFonts w:ascii="Arial" w:cs="Arial" w:eastAsia="Arial" w:hAnsi="Arial"/>
+          <w:color w:val="2D3436"/>
+          <w:sz w:val="21"/>
+          <w:szCs w:val="21"/>
+        </w:rPr>
+        <w:t xml:space="preserve">Show curriculum leaders which skills to close, at scale.</w:t>
+      </w:r>
+    </w:p>
+    <w:p>
+      <w:pPr>
+        <w:spacing w:after="110" w:line="268"/>
+      </w:pPr>
+      <w:r>
+        <w:rPr>
+          <w:rFonts w:ascii="Arial" w:cs="Arial" w:eastAsia="Arial" w:hAnsi="Arial"/>
+          <w:b/>
+          <w:bCs/>
+          <w:color w:val="2D3436"/>
+          <w:sz w:val="21"/>
+          <w:szCs w:val="21"/>
+        </w:rPr>
+        <w:t xml:space="preserve">How it works: </w:t>
+      </w:r>
+      <w:r>
+        <w:rPr>
+          <w:rFonts w:ascii="Arial" w:cs="Arial" w:eastAsia="Arial" w:hAnsi="Arial"/>
+          <w:color w:val="2D3436"/>
+          <w:sz w:val="21"/>
+          <w:szCs w:val="21"/>
+        </w:rPr>
+        <w:t xml:space="preserve">Each gap lists target roles it blocks, students affected, a recommended intervention (SQL clinic, cloud bootcamp, Power BI) and estimated readiness uplift.</w:t>
+      </w:r>
+    </w:p>
+    <w:p>
+      <w:pPr>
+        <w:spacing w:after="110" w:line="268"/>
+      </w:pPr>
+      <w:r>
+        <w:rPr>
+          <w:rFonts w:ascii="Arial" w:cs="Arial" w:eastAsia="Arial" w:hAnsi="Arial"/>
+          <w:b/>
+          <w:bCs/>
+          <w:color w:val="2D3436"/>
+          <w:sz w:val="21"/>
+          <w:szCs w:val="21"/>
+        </w:rPr>
+        <w:t xml:space="preserve">Data source (inside our own code): </w:t>
+      </w:r>
+      <w:r>
+        <w:rPr>
+          <w:rFonts w:ascii="Arial" w:cs="Arial" w:eastAsia="Arial" w:hAnsi="Arial"/>
+          <w:color w:val="2D3436"/>
+          <w:sz w:val="21"/>
+          <w:szCs w:val="21"/>
+        </w:rPr>
+        <w:t xml:space="preserve">skillGaps + programmesSummary.</w:t>
+      </w:r>
+    </w:p>
+    <w:p>
+      <w:pPr>
+        <w:spacing w:after="110" w:line="268"/>
+      </w:pPr>
+      <w:r>
+        <w:rPr>
+          <w:rFonts w:ascii="Arial" w:cs="Arial" w:eastAsia="Arial" w:hAnsi="Arial"/>
+          <w:b/>
+          <w:bCs/>
+          <w:color w:val="2D3436"/>
+          <w:sz w:val="21"/>
+          <w:szCs w:val="21"/>
+        </w:rPr>
+        <w:t xml:space="preserve">External API: </w:t>
+      </w:r>
+      <w:r>
+        <w:rPr>
+          <w:rFonts w:ascii="Arial" w:cs="Arial" w:eastAsia="Arial" w:hAnsi="Arial"/>
+          <w:b w:val="false"/>
+          <w:bCs w:val="false"/>
+          <w:color w:val="5A6570"/>
+          <w:sz w:val="21"/>
+          <w:szCs w:val="21"/>
+        </w:rPr>
+        <w:t xml:space="preserve">None — no internet call</w:t>
+      </w:r>
+    </w:p>
+    <w:p>
+      <w:pPr>
+        <w:pStyle w:val="Heading3"/>
+        <w:spacing w:after="70" w:before="200"/>
+      </w:pPr>
+      <w:r>
+        <w:rPr>
+          <w:rFonts w:ascii="Arial" w:cs="Arial" w:eastAsia="Arial" w:hAnsi="Arial"/>
+          <w:b/>
+          <w:bCs/>
+          <w:color w:val="8A6D1F"/>
+          <w:sz w:val="22"/>
+          <w:szCs w:val="22"/>
+        </w:rPr>
+        <w:t xml:space="preserve">18. Ministry Dashboard  ·  /ministry</w:t>
+      </w:r>
+    </w:p>
+    <w:p>
+      <w:pPr>
+        <w:spacing w:after="110" w:line="268"/>
+      </w:pPr>
+      <w:r>
+        <w:rPr>
+          <w:rFonts w:ascii="Arial" w:cs="Arial" w:eastAsia="Arial" w:hAnsi="Arial"/>
+          <w:b/>
+          <w:bCs/>
+          <w:color w:val="2D3436"/>
+          <w:sz w:val="21"/>
+          <w:szCs w:val="21"/>
+        </w:rPr>
+        <w:t xml:space="preserve">Purpose: </w:t>
+      </w:r>
+      <w:r>
+        <w:rPr>
+          <w:rFonts w:ascii="Arial" w:cs="Arial" w:eastAsia="Arial" w:hAnsi="Arial"/>
+          <w:color w:val="2D3436"/>
+          <w:sz w:val="21"/>
+          <w:szCs w:val="21"/>
+        </w:rPr>
+        <w:t xml:space="preserve">National graduate employability for policy and planning (MOHE).</w:t>
+      </w:r>
+    </w:p>
+    <w:p>
+      <w:pPr>
+        <w:spacing w:after="110" w:line="268"/>
+      </w:pPr>
+      <w:r>
+        <w:rPr>
+          <w:rFonts w:ascii="Arial" w:cs="Arial" w:eastAsia="Arial" w:hAnsi="Arial"/>
+          <w:b/>
+          <w:bCs/>
+          <w:color w:val="2D3436"/>
+          <w:sz w:val="21"/>
+          <w:szCs w:val="21"/>
+        </w:rPr>
+        <w:t xml:space="preserve">How it works: </w:t>
+      </w:r>
+      <w:r>
+        <w:rPr>
+          <w:rFonts w:ascii="Arial" w:cs="Arial" w:eastAsia="Arial" w:hAnsi="Arial"/>
+          <w:color w:val="2D3436"/>
+          <w:sz w:val="21"/>
+          <w:szCs w:val="21"/>
+        </w:rPr>
+        <w:t xml:space="preserve">National KPIs, employability by field, 3-year trend, hiring sectors — and the differentiator, "Speed vs Stickiness": today the system measures how fast graduates are hired, nobody measures whether they stayed.</w:t>
+      </w:r>
+    </w:p>
+    <w:p>
+      <w:pPr>
+        <w:spacing w:after="110" w:line="268"/>
+      </w:pPr>
+      <w:r>
+        <w:rPr>
+          <w:rFonts w:ascii="Arial" w:cs="Arial" w:eastAsia="Arial" w:hAnsi="Arial"/>
+          <w:b/>
+          <w:bCs/>
+          <w:color w:val="2D3436"/>
+          <w:sz w:val="21"/>
+          <w:szCs w:val="21"/>
+        </w:rPr>
+        <w:t xml:space="preserve">Data source (inside our own code): </w:t>
+      </w:r>
+      <w:r>
+        <w:rPr>
+          <w:rFonts w:ascii="Arial" w:cs="Arial" w:eastAsia="Arial" w:hAnsi="Arial"/>
+          <w:color w:val="2D3436"/>
+          <w:sz w:val="21"/>
+          <w:szCs w:val="21"/>
+        </w:rPr>
+        <w:t xml:space="preserve">mockMinistryStats including speedVsFit.</w:t>
+      </w:r>
+    </w:p>
+    <w:p>
+      <w:pPr>
+        <w:spacing w:after="110" w:line="268"/>
+      </w:pPr>
+      <w:r>
+        <w:rPr>
+          <w:rFonts w:ascii="Arial" w:cs="Arial" w:eastAsia="Arial" w:hAnsi="Arial"/>
+          <w:b/>
+          <w:bCs/>
+          <w:color w:val="2D3436"/>
+          <w:sz w:val="21"/>
+          <w:szCs w:val="21"/>
+        </w:rPr>
+        <w:t xml:space="preserve">External API: </w:t>
+      </w:r>
+      <w:r>
+        <w:rPr>
+          <w:rFonts w:ascii="Arial" w:cs="Arial" w:eastAsia="Arial" w:hAnsi="Arial"/>
+          <w:b w:val="false"/>
+          <w:bCs w:val="false"/>
+          <w:color w:val="5A6570"/>
+          <w:sz w:val="21"/>
+          <w:szCs w:val="21"/>
+        </w:rPr>
+        <w:t xml:space="preserve">None — no internet call</w:t>
+      </w:r>
+    </w:p>
+    <w:p>
+      <w:pPr>
+        <w:pStyle w:val="Heading3"/>
+        <w:spacing w:after="70" w:before="200"/>
+      </w:pPr>
+      <w:r>
+        <w:rPr>
+          <w:rFonts w:ascii="Arial" w:cs="Arial" w:eastAsia="Arial" w:hAnsi="Arial"/>
+          <w:b/>
+          <w:bCs/>
+          <w:color w:val="8A6D1F"/>
+          <w:sz w:val="22"/>
+          <w:szCs w:val="22"/>
+        </w:rPr>
+        <w:t xml:space="preserve">19. Impact &amp; SDG  ·  /impact</w:t>
+      </w:r>
+    </w:p>
+    <w:p>
+      <w:pPr>
+        <w:spacing w:after="110" w:line="268"/>
+      </w:pPr>
+      <w:r>
+        <w:rPr>
+          <w:rFonts w:ascii="Arial" w:cs="Arial" w:eastAsia="Arial" w:hAnsi="Arial"/>
+          <w:b/>
+          <w:bCs/>
+          <w:color w:val="2D3436"/>
+          <w:sz w:val="21"/>
+          <w:szCs w:val="21"/>
+        </w:rPr>
+        <w:t xml:space="preserve">Purpose: </w:t>
+      </w:r>
+      <w:r>
+        <w:rPr>
+          <w:rFonts w:ascii="Arial" w:cs="Arial" w:eastAsia="Arial" w:hAnsi="Arial"/>
+          <w:color w:val="2D3436"/>
+          <w:sz w:val="21"/>
+          <w:szCs w:val="21"/>
+        </w:rPr>
+        <w:t xml:space="preserve">Show impact, not just features — the judging criterion that matters most.</w:t>
+      </w:r>
+    </w:p>
+    <w:p>
+      <w:pPr>
+        <w:spacing w:after="110" w:line="268"/>
+      </w:pPr>
+      <w:r>
+        <w:rPr>
+          <w:rFonts w:ascii="Arial" w:cs="Arial" w:eastAsia="Arial" w:hAnsi="Arial"/>
+          <w:b/>
+          <w:bCs/>
+          <w:color w:val="2D3436"/>
+          <w:sz w:val="21"/>
+          <w:szCs w:val="21"/>
+        </w:rPr>
+        <w:t xml:space="preserve">How it works: </w:t>
+      </w:r>
+      <w:r>
+        <w:rPr>
+          <w:rFonts w:ascii="Arial" w:cs="Arial" w:eastAsia="Arial" w:hAnsi="Arial"/>
+          <w:color w:val="2D3436"/>
+          <w:sz w:val="21"/>
+          <w:szCs w:val="21"/>
+        </w:rPr>
+        <w:t xml:space="preserve">Headline impact metrics plus the three UN SDGs CareerArc moves (4 Quality Education, 8 Decent Work, 17 Partnerships), each mapped to the features that deliver them.</w:t>
+      </w:r>
+    </w:p>
+    <w:p>
+      <w:pPr>
+        <w:spacing w:after="110" w:line="268"/>
+      </w:pPr>
+      <w:r>
+        <w:rPr>
+          <w:rFonts w:ascii="Arial" w:cs="Arial" w:eastAsia="Arial" w:hAnsi="Arial"/>
+          <w:b/>
+          <w:bCs/>
+          <w:color w:val="2D3436"/>
+          <w:sz w:val="21"/>
+          <w:szCs w:val="21"/>
+        </w:rPr>
+        <w:t xml:space="preserve">Data source (inside our own code): </w:t>
+      </w:r>
+      <w:r>
+        <w:rPr>
+          <w:rFonts w:ascii="Arial" w:cs="Arial" w:eastAsia="Arial" w:hAnsi="Arial"/>
+          <w:color w:val="2D3436"/>
+          <w:sz w:val="21"/>
+          <w:szCs w:val="21"/>
+        </w:rPr>
+        <w:t xml:space="preserve">sdgGoals + mockImpactMetrics.</w:t>
+      </w:r>
+    </w:p>
+    <w:p>
+      <w:pPr>
+        <w:spacing w:after="110" w:line="268"/>
+      </w:pPr>
+      <w:r>
+        <w:rPr>
+          <w:rFonts w:ascii="Arial" w:cs="Arial" w:eastAsia="Arial" w:hAnsi="Arial"/>
+          <w:b/>
+          <w:bCs/>
+          <w:color w:val="2D3436"/>
+          <w:sz w:val="21"/>
+          <w:szCs w:val="21"/>
+        </w:rPr>
+        <w:t xml:space="preserve">External API: </w:t>
+      </w:r>
+      <w:r>
+        <w:rPr>
+          <w:rFonts w:ascii="Arial" w:cs="Arial" w:eastAsia="Arial" w:hAnsi="Arial"/>
+          <w:b w:val="false"/>
+          <w:bCs w:val="false"/>
+          <w:color w:val="5A6570"/>
+          <w:sz w:val="21"/>
+          <w:szCs w:val="21"/>
+        </w:rPr>
+        <w:t xml:space="preserve">None — no internet call</w:t>
+      </w:r>
+    </w:p>
+    <w:p>
+      <w:pPr>
+        <w:pStyle w:val="Heading3"/>
+        <w:spacing w:after="70" w:before="200"/>
+      </w:pPr>
+      <w:r>
+        <w:rPr>
+          <w:rFonts w:ascii="Arial" w:cs="Arial" w:eastAsia="Arial" w:hAnsi="Arial"/>
+          <w:b/>
+          <w:bCs/>
+          <w:color w:val="8A6D1F"/>
+          <w:sz w:val="22"/>
+          <w:szCs w:val="22"/>
+        </w:rPr>
+        <w:t xml:space="preserve">12. SIFU Interview Coach  ·  /interview-coach   ★ REAL AI</w:t>
+      </w:r>
+    </w:p>
+    <w:p>
+      <w:pPr>
+        <w:spacing w:after="110" w:line="268"/>
+      </w:pPr>
+      <w:r>
+        <w:rPr>
+          <w:rFonts w:ascii="Arial" w:cs="Arial" w:eastAsia="Arial" w:hAnsi="Arial"/>
+          <w:b/>
+          <w:bCs/>
+          <w:color w:val="2D3436"/>
+          <w:sz w:val="21"/>
+          <w:szCs w:val="21"/>
+        </w:rPr>
+        <w:t xml:space="preserve">Purpose: </w:t>
+      </w:r>
+      <w:r>
+        <w:rPr>
+          <w:rFonts w:ascii="Arial" w:cs="Arial" w:eastAsia="Arial" w:hAnsi="Arial"/>
+          <w:color w:val="2D3436"/>
+          <w:sz w:val="21"/>
+          <w:szCs w:val="21"/>
+        </w:rPr>
+        <w:t xml:space="preserve">Smart Interview Feedback &amp; Upskilling. Practice interviews and get honest, specific coaching. ("Sifu" = master/mentor.)</w:t>
+      </w:r>
+    </w:p>
+    <w:p>
+      <w:pPr>
+        <w:spacing w:after="110" w:line="268"/>
+      </w:pPr>
+      <w:r>
+        <w:rPr>
+          <w:rFonts w:ascii="Arial" w:cs="Arial" w:eastAsia="Arial" w:hAnsi="Arial"/>
+          <w:b/>
+          <w:bCs/>
+          <w:color w:val="2D3436"/>
+          <w:sz w:val="21"/>
+          <w:szCs w:val="21"/>
+        </w:rPr>
+        <w:t xml:space="preserve">How it works: </w:t>
+      </w:r>
+      <w:r>
+        <w:rPr>
+          <w:rFonts w:ascii="Arial" w:cs="Arial" w:eastAsia="Arial" w:hAnsi="Arial"/>
+          <w:color w:val="2D3436"/>
+          <w:sz w:val="21"/>
+          <w:szCs w:val="21"/>
+        </w:rPr>
+        <w:t xml:space="preserve">Two real Claude API calls behind Next.js server routes:</w:t>
+      </w:r>
+    </w:p>
+    <w:p>
+      <w:pPr>
+        <w:pStyle w:val="ListParagraph"/>
+        <w:numPr>
+          <w:ilvl w:val="0"/>
+          <w:numId w:val="3"/>
+        </w:numPr>
+        <w:spacing w:after="55" w:line="260"/>
+      </w:pPr>
+      <w:r>
+        <w:rPr>
+          <w:rFonts w:ascii="Arial" w:cs="Arial" w:eastAsia="Arial" w:hAnsi="Arial"/>
+          <w:b/>
+          <w:bCs/>
+          <w:color w:val="2D3436"/>
+          <w:sz w:val="21"/>
+          <w:szCs w:val="21"/>
+        </w:rPr>
+        <w:t xml:space="preserve">POST /api/interview-questions </w:t>
+      </w:r>
+      <w:r>
+        <w:rPr>
+          <w:rFonts w:ascii="Arial" w:cs="Arial" w:eastAsia="Arial" w:hAnsi="Arial"/>
+          <w:color w:val="2D3436"/>
+          <w:sz w:val="21"/>
+          <w:szCs w:val="21"/>
+        </w:rPr>
+        <w:t xml:space="preserve">→ generates 5 questions plus model answers, tailored to the chosen role, company type, seniority and question type.</w:t>
+      </w:r>
+    </w:p>
+    <w:p>
+      <w:pPr>
+        <w:pStyle w:val="ListParagraph"/>
+        <w:numPr>
+          <w:ilvl w:val="0"/>
+          <w:numId w:val="3"/>
+        </w:numPr>
+        <w:spacing w:after="55" w:line="260"/>
+      </w:pPr>
+      <w:r>
+        <w:rPr>
+          <w:rFonts w:ascii="Arial" w:cs="Arial" w:eastAsia="Arial" w:hAnsi="Arial"/>
+          <w:b/>
+          <w:bCs/>
+          <w:color w:val="2D3436"/>
+          <w:sz w:val="21"/>
+          <w:szCs w:val="21"/>
+        </w:rPr>
         <w:t xml:space="preserve">POST /api/interview-feedback </w:t>
       </w:r>
       <w:r>
@@ -3522,7 +3643,7 @@
           <w:sz w:val="21"/>
           <w:szCs w:val="21"/>
         </w:rPr>
-        <w:t xml:space="preserve">Data source: </w:t>
+        <w:t xml:space="preserve">Data source (inside our own code): </w:t>
       </w:r>
       <w:r>
         <w:rPr>
@@ -3547,7 +3668,7 @@
           <w:sz w:val="21"/>
           <w:szCs w:val="21"/>
         </w:rPr>
-        <w:t xml:space="preserve">API: </w:t>
+        <w:t xml:space="preserve">External API: </w:t>
       </w:r>
       <w:r>
         <w:rPr>
@@ -3558,16 +3679,16 @@
           <w:sz w:val="21"/>
           <w:szCs w:val="21"/>
         </w:rPr>
-        <w:t xml:space="preserve">Anthropic Claude API — model claude-haiku-4-5. </w:t>
-      </w:r>
-      <w:r>
-        <w:rPr>
-          <w:rFonts w:ascii="Arial" w:cs="Arial" w:eastAsia="Arial" w:hAnsi="Arial"/>
-          <w:color w:val="2D3436"/>
-          <w:sz w:val="21"/>
-          <w:szCs w:val="21"/>
-        </w:rPr>
-        <w:t xml:space="preserve">Uses structured outputs so the response is always valid JSON. The key is read server-side only (ANTHROPIC_API_KEY) and never exposed to the browser. Any failure — missing key, rate limit, network — falls back to a deterministic local evaluation labelled "Simulated".</w:t>
+        <w:t xml:space="preserve">YES — Anthropic Claude API, model claude-haiku-4-5. </w:t>
+      </w:r>
+      <w:r>
+        <w:rPr>
+          <w:rFonts w:ascii="Arial" w:cs="Arial" w:eastAsia="Arial" w:hAnsi="Arial"/>
+          <w:color w:val="2D3436"/>
+          <w:sz w:val="21"/>
+          <w:szCs w:val="21"/>
+        </w:rPr>
+        <w:t xml:space="preserve">This is the only module in the entire platform that calls out to the internet. Uses structured outputs so the response is always valid JSON. The key is read server-side only (ANTHROPIC_API_KEY) and never exposed to the browser. Any failure — missing key, rate limit, network — falls back to a deterministic local evaluation labelled "Simulated".</w:t>
       </w:r>
     </w:p>
     <w:p>

</xml_diff>

<commit_message>
Add Part 4: Real Implementation Blueprint
Teammate's note: judges must not think the idea is impossible to build. Replaces the thin 5-bullet Stage 2 section with a full production blueprint.

Covers production architecture (DB, auth, storage, AI), real Malaysian data sources (MOHE Graduate Tracer Study, MQA Qualifications Register, TalentCorp COL, DOSM wages survey, MyFutureJobs, SSM e-Info, EPF/SOCSO for retention), commercial APIs, platform-native proprietary data, a prototype-to-production table for every module, and honest Tier 1/2/3 sequencing.
</commit_message>
<xml_diff>
--- a/docs/CareerArc_Supporting_Materials.docx
+++ b/docs/CareerArc_Supporting_Materials.docx
@@ -5743,6 +5743,31 @@
     </w:p>
     <w:p>
       <w:pPr>
+        <w:pageBreakBefore/>
+      </w:pPr>
+    </w:p>
+    <w:p>
+      <w:pPr>
+        <w:pStyle w:val="Heading1"/>
+        <w:pBdr>
+          <w:bottom w:val="single" w:color="8A6D1F" w:sz="12" w:space="4"/>
+        </w:pBdr>
+        <w:spacing w:after="160" w:before="360"/>
+      </w:pPr>
+      <w:r>
+        <w:rPr>
+          <w:rFonts w:ascii="Arial" w:cs="Arial" w:eastAsia="Arial" w:hAnsi="Arial"/>
+          <w:b/>
+          <w:bCs/>
+          <w:color w:val="2D3436"/>
+          <w:sz w:val="30"/>
+          <w:szCs w:val="30"/>
+        </w:rPr>
+        <w:t xml:space="preserve">Part 4 — Real Implementation Blueprint</w:t>
+      </w:r>
+    </w:p>
+    <w:p>
+      <w:pPr>
         <w:pStyle w:val="Heading2"/>
         <w:spacing w:after="90" w:before="260"/>
       </w:pPr>
@@ -5755,7 +5780,975 @@
           <w:sz w:val="24"/>
           <w:szCs w:val="24"/>
         </w:rPr>
-        <w:t xml:space="preserve">What we would build next (Stage 2)</w:t>
+        <w:t xml:space="preserve">Why this section exists</w:t>
+      </w:r>
+    </w:p>
+    <w:p>
+      <w:pPr>
+        <w:spacing w:after="110" w:line="268"/>
+      </w:pPr>
+      <w:r>
+        <w:rPr>
+          <w:rFonts w:ascii="Arial" w:cs="Arial" w:eastAsia="Arial" w:hAnsi="Arial"/>
+          <w:color w:val="2D3436"/>
+          <w:sz w:val="21"/>
+          <w:szCs w:val="21"/>
+        </w:rPr>
+        <w:t xml:space="preserve">The prototype runs on simulated data because the brief requires it. </w:t>
+      </w:r>
+      <w:r>
+        <w:rPr>
+          <w:rFonts w:ascii="Arial" w:cs="Arial" w:eastAsia="Arial" w:hAnsi="Arial"/>
+          <w:b/>
+          <w:bCs/>
+          <w:color w:val="2D3436"/>
+          <w:sz w:val="21"/>
+          <w:szCs w:val="21"/>
+        </w:rPr>
+        <w:t xml:space="preserve">This section sets out what would power each module in production</w:t>
+      </w:r>
+      <w:r>
+        <w:rPr>
+          <w:rFonts w:ascii="Arial" w:cs="Arial" w:eastAsia="Arial" w:hAnsi="Arial"/>
+          <w:color w:val="2D3436"/>
+          <w:sz w:val="21"/>
+          <w:szCs w:val="21"/>
+        </w:rPr>
+        <w:t xml:space="preserve">, so the concept can be judged as buildable rather than hypothetical.</w:t>
+      </w:r>
+    </w:p>
+    <w:p>
+      <w:pPr>
+        <w:spacing w:after="110" w:line="268"/>
+      </w:pPr>
+      <w:r>
+        <w:rPr>
+          <w:rFonts w:ascii="Arial" w:cs="Arial" w:eastAsia="Arial" w:hAnsi="Arial"/>
+          <w:i/>
+          <w:iCs/>
+          <w:color w:val="5A6570"/>
+          <w:sz w:val="21"/>
+          <w:szCs w:val="21"/>
+        </w:rPr>
+        <w:t xml:space="preserve">Nothing below is speculative technology. Every source named already exists in Malaysia today — the work is integration and partnership, not invention.</w:t>
+      </w:r>
+    </w:p>
+    <w:p>
+      <w:pPr>
+        <w:pStyle w:val="Heading2"/>
+        <w:spacing w:after="90" w:before="260"/>
+      </w:pPr>
+      <w:r>
+        <w:rPr>
+          <w:rFonts w:ascii="Arial" w:cs="Arial" w:eastAsia="Arial" w:hAnsi="Arial"/>
+          <w:b/>
+          <w:bCs/>
+          <w:color w:val="C0392B"/>
+          <w:sz w:val="24"/>
+          <w:szCs w:val="24"/>
+        </w:rPr>
+        <w:t xml:space="preserve">Production architecture</w:t>
+      </w:r>
+    </w:p>
+    <w:tbl>
+      <w:tblPr>
+        <w:tblW w:type="dxa" w:w="9026"/>
+        <w:tblBorders>
+          <w:top w:val="single" w:color="auto" w:sz="4"/>
+          <w:left w:val="single" w:color="auto" w:sz="4"/>
+          <w:bottom w:val="single" w:color="auto" w:sz="4"/>
+          <w:right w:val="single" w:color="auto" w:sz="4"/>
+          <w:insideH w:val="single" w:color="auto" w:sz="4"/>
+          <w:insideV w:val="single" w:color="auto" w:sz="4"/>
+        </w:tblBorders>
+      </w:tblPr>
+      <w:tblGrid>
+        <w:gridCol w:w="1700"/>
+        <w:gridCol w:w="3400"/>
+        <w:gridCol w:w="3926"/>
+      </w:tblGrid>
+      <w:tr>
+        <w:trPr>
+          <w:tblHeader/>
+        </w:trPr>
+        <w:tc>
+          <w:tcPr>
+            <w:tcW w:type="dxa" w:w="1700"/>
+            <w:tcBorders>
+              <w:top w:val="single" w:color="D8CDB4" w:sz="1"/>
+              <w:left w:val="single" w:color="D8CDB4" w:sz="1"/>
+              <w:bottom w:val="single" w:color="D8CDB4" w:sz="1"/>
+              <w:right w:val="single" w:color="D8CDB4" w:sz="1"/>
+            </w:tcBorders>
+            <w:shd w:fill="8A6D1F" w:val="clear"/>
+            <w:tcMar>
+              <w:top w:type="dxa" w:w="70"/>
+              <w:left w:type="dxa" w:w="110"/>
+              <w:bottom w:type="dxa" w:w="70"/>
+              <w:right w:type="dxa" w:w="110"/>
+            </w:tcMar>
+          </w:tcPr>
+          <w:p>
+            <w:pPr>
+              <w:spacing w:after="0" w:line="250"/>
+            </w:pPr>
+            <w:r>
+              <w:rPr>
+                <w:rFonts w:ascii="Arial" w:cs="Arial" w:eastAsia="Arial" w:hAnsi="Arial"/>
+                <w:b/>
+                <w:bCs/>
+                <w:color w:val="FFFFFF"/>
+                <w:sz w:val="19"/>
+                <w:szCs w:val="19"/>
+              </w:rPr>
+              <w:t xml:space="preserve">Layer</w:t>
+            </w:r>
+          </w:p>
+        </w:tc>
+        <w:tc>
+          <w:tcPr>
+            <w:tcW w:type="dxa" w:w="3400"/>
+            <w:tcBorders>
+              <w:top w:val="single" w:color="D8CDB4" w:sz="1"/>
+              <w:left w:val="single" w:color="D8CDB4" w:sz="1"/>
+              <w:bottom w:val="single" w:color="D8CDB4" w:sz="1"/>
+              <w:right w:val="single" w:color="D8CDB4" w:sz="1"/>
+            </w:tcBorders>
+            <w:shd w:fill="8A6D1F" w:val="clear"/>
+            <w:tcMar>
+              <w:top w:type="dxa" w:w="70"/>
+              <w:left w:type="dxa" w:w="110"/>
+              <w:bottom w:type="dxa" w:w="70"/>
+              <w:right w:type="dxa" w:w="110"/>
+            </w:tcMar>
+          </w:tcPr>
+          <w:p>
+            <w:pPr>
+              <w:spacing w:after="0" w:line="250"/>
+            </w:pPr>
+            <w:r>
+              <w:rPr>
+                <w:rFonts w:ascii="Arial" w:cs="Arial" w:eastAsia="Arial" w:hAnsi="Arial"/>
+                <w:b/>
+                <w:bCs/>
+                <w:color w:val="FFFFFF"/>
+                <w:sz w:val="19"/>
+                <w:szCs w:val="19"/>
+              </w:rPr>
+              <w:t xml:space="preserve">Production choice</w:t>
+            </w:r>
+          </w:p>
+        </w:tc>
+        <w:tc>
+          <w:tcPr>
+            <w:tcW w:type="dxa" w:w="3926"/>
+            <w:tcBorders>
+              <w:top w:val="single" w:color="D8CDB4" w:sz="1"/>
+              <w:left w:val="single" w:color="D8CDB4" w:sz="1"/>
+              <w:bottom w:val="single" w:color="D8CDB4" w:sz="1"/>
+              <w:right w:val="single" w:color="D8CDB4" w:sz="1"/>
+            </w:tcBorders>
+            <w:shd w:fill="8A6D1F" w:val="clear"/>
+            <w:tcMar>
+              <w:top w:type="dxa" w:w="70"/>
+              <w:left w:type="dxa" w:w="110"/>
+              <w:bottom w:type="dxa" w:w="70"/>
+              <w:right w:type="dxa" w:w="110"/>
+            </w:tcMar>
+          </w:tcPr>
+          <w:p>
+            <w:pPr>
+              <w:spacing w:after="0" w:line="250"/>
+            </w:pPr>
+            <w:r>
+              <w:rPr>
+                <w:rFonts w:ascii="Arial" w:cs="Arial" w:eastAsia="Arial" w:hAnsi="Arial"/>
+                <w:b/>
+                <w:bCs/>
+                <w:color w:val="FFFFFF"/>
+                <w:sz w:val="19"/>
+                <w:szCs w:val="19"/>
+              </w:rPr>
+              <w:t xml:space="preserve">Note</w:t>
+            </w:r>
+          </w:p>
+        </w:tc>
+      </w:tr>
+      <w:tr>
+        <w:tc>
+          <w:tcPr>
+            <w:tcW w:type="dxa" w:w="1700"/>
+            <w:tcBorders>
+              <w:top w:val="single" w:color="D8CDB4" w:sz="1"/>
+              <w:left w:val="single" w:color="D8CDB4" w:sz="1"/>
+              <w:bottom w:val="single" w:color="D8CDB4" w:sz="1"/>
+              <w:right w:val="single" w:color="D8CDB4" w:sz="1"/>
+            </w:tcBorders>
+            <w:shd w:fill="FFFFFF" w:val="clear"/>
+            <w:tcMar>
+              <w:top w:type="dxa" w:w="70"/>
+              <w:left w:type="dxa" w:w="110"/>
+              <w:bottom w:type="dxa" w:w="70"/>
+              <w:right w:type="dxa" w:w="110"/>
+            </w:tcMar>
+          </w:tcPr>
+          <w:p>
+            <w:pPr>
+              <w:spacing w:after="0" w:line="250"/>
+            </w:pPr>
+            <w:r>
+              <w:rPr>
+                <w:rFonts w:ascii="Arial" w:cs="Arial" w:eastAsia="Arial" w:hAnsi="Arial"/>
+                <w:b w:val="false"/>
+                <w:bCs w:val="false"/>
+                <w:color w:val="2D3436"/>
+                <w:sz w:val="19"/>
+                <w:szCs w:val="19"/>
+              </w:rPr>
+              <w:t xml:space="preserve">Frontend</w:t>
+            </w:r>
+          </w:p>
+        </w:tc>
+        <w:tc>
+          <w:tcPr>
+            <w:tcW w:type="dxa" w:w="3400"/>
+            <w:tcBorders>
+              <w:top w:val="single" w:color="D8CDB4" w:sz="1"/>
+              <w:left w:val="single" w:color="D8CDB4" w:sz="1"/>
+              <w:bottom w:val="single" w:color="D8CDB4" w:sz="1"/>
+              <w:right w:val="single" w:color="D8CDB4" w:sz="1"/>
+            </w:tcBorders>
+            <w:shd w:fill="FFFFFF" w:val="clear"/>
+            <w:tcMar>
+              <w:top w:type="dxa" w:w="70"/>
+              <w:left w:type="dxa" w:w="110"/>
+              <w:bottom w:type="dxa" w:w="70"/>
+              <w:right w:type="dxa" w:w="110"/>
+            </w:tcMar>
+          </w:tcPr>
+          <w:p>
+            <w:pPr>
+              <w:spacing w:after="0" w:line="250"/>
+            </w:pPr>
+            <w:r>
+              <w:rPr>
+                <w:rFonts w:ascii="Arial" w:cs="Arial" w:eastAsia="Arial" w:hAnsi="Arial"/>
+                <w:b w:val="false"/>
+                <w:bCs w:val="false"/>
+                <w:color w:val="2D3436"/>
+                <w:sz w:val="19"/>
+                <w:szCs w:val="19"/>
+              </w:rPr>
+              <w:t xml:space="preserve">Next.js (unchanged)</w:t>
+            </w:r>
+          </w:p>
+        </w:tc>
+        <w:tc>
+          <w:tcPr>
+            <w:tcW w:type="dxa" w:w="3926"/>
+            <w:tcBorders>
+              <w:top w:val="single" w:color="D8CDB4" w:sz="1"/>
+              <w:left w:val="single" w:color="D8CDB4" w:sz="1"/>
+              <w:bottom w:val="single" w:color="D8CDB4" w:sz="1"/>
+              <w:right w:val="single" w:color="D8CDB4" w:sz="1"/>
+            </w:tcBorders>
+            <w:shd w:fill="FFFFFF" w:val="clear"/>
+            <w:tcMar>
+              <w:top w:type="dxa" w:w="70"/>
+              <w:left w:type="dxa" w:w="110"/>
+              <w:bottom w:type="dxa" w:w="70"/>
+              <w:right w:type="dxa" w:w="110"/>
+            </w:tcMar>
+          </w:tcPr>
+          <w:p>
+            <w:pPr>
+              <w:spacing w:after="0" w:line="250"/>
+            </w:pPr>
+            <w:r>
+              <w:rPr>
+                <w:rFonts w:ascii="Arial" w:cs="Arial" w:eastAsia="Arial" w:hAnsi="Arial"/>
+                <w:b w:val="false"/>
+                <w:bCs w:val="false"/>
+                <w:color w:val="2D3436"/>
+                <w:sz w:val="19"/>
+                <w:szCs w:val="19"/>
+              </w:rPr>
+              <w:t xml:space="preserve">The prototype UI is already production-grade</w:t>
+            </w:r>
+          </w:p>
+        </w:tc>
+      </w:tr>
+      <w:tr>
+        <w:tc>
+          <w:tcPr>
+            <w:tcW w:type="dxa" w:w="1700"/>
+            <w:tcBorders>
+              <w:top w:val="single" w:color="D8CDB4" w:sz="1"/>
+              <w:left w:val="single" w:color="D8CDB4" w:sz="1"/>
+              <w:bottom w:val="single" w:color="D8CDB4" w:sz="1"/>
+              <w:right w:val="single" w:color="D8CDB4" w:sz="1"/>
+            </w:tcBorders>
+            <w:shd w:fill="FBF9F3" w:val="clear"/>
+            <w:tcMar>
+              <w:top w:type="dxa" w:w="70"/>
+              <w:left w:type="dxa" w:w="110"/>
+              <w:bottom w:type="dxa" w:w="70"/>
+              <w:right w:type="dxa" w:w="110"/>
+            </w:tcMar>
+          </w:tcPr>
+          <w:p>
+            <w:pPr>
+              <w:spacing w:after="0" w:line="250"/>
+            </w:pPr>
+            <w:r>
+              <w:rPr>
+                <w:rFonts w:ascii="Arial" w:cs="Arial" w:eastAsia="Arial" w:hAnsi="Arial"/>
+                <w:b w:val="false"/>
+                <w:bCs w:val="false"/>
+                <w:color w:val="2D3436"/>
+                <w:sz w:val="19"/>
+                <w:szCs w:val="19"/>
+              </w:rPr>
+              <w:t xml:space="preserve">Backend / API</w:t>
+            </w:r>
+          </w:p>
+        </w:tc>
+        <w:tc>
+          <w:tcPr>
+            <w:tcW w:type="dxa" w:w="3400"/>
+            <w:tcBorders>
+              <w:top w:val="single" w:color="D8CDB4" w:sz="1"/>
+              <w:left w:val="single" w:color="D8CDB4" w:sz="1"/>
+              <w:bottom w:val="single" w:color="D8CDB4" w:sz="1"/>
+              <w:right w:val="single" w:color="D8CDB4" w:sz="1"/>
+            </w:tcBorders>
+            <w:shd w:fill="FBF9F3" w:val="clear"/>
+            <w:tcMar>
+              <w:top w:type="dxa" w:w="70"/>
+              <w:left w:type="dxa" w:w="110"/>
+              <w:bottom w:type="dxa" w:w="70"/>
+              <w:right w:type="dxa" w:w="110"/>
+            </w:tcMar>
+          </w:tcPr>
+          <w:p>
+            <w:pPr>
+              <w:spacing w:after="0" w:line="250"/>
+            </w:pPr>
+            <w:r>
+              <w:rPr>
+                <w:rFonts w:ascii="Arial" w:cs="Arial" w:eastAsia="Arial" w:hAnsi="Arial"/>
+                <w:b w:val="false"/>
+                <w:bCs w:val="false"/>
+                <w:color w:val="2D3436"/>
+                <w:sz w:val="19"/>
+                <w:szCs w:val="19"/>
+              </w:rPr>
+              <w:t xml:space="preserve">Next.js server routes → Node.js services</w:t>
+            </w:r>
+          </w:p>
+        </w:tc>
+        <w:tc>
+          <w:tcPr>
+            <w:tcW w:type="dxa" w:w="3926"/>
+            <w:tcBorders>
+              <w:top w:val="single" w:color="D8CDB4" w:sz="1"/>
+              <w:left w:val="single" w:color="D8CDB4" w:sz="1"/>
+              <w:bottom w:val="single" w:color="D8CDB4" w:sz="1"/>
+              <w:right w:val="single" w:color="D8CDB4" w:sz="1"/>
+            </w:tcBorders>
+            <w:shd w:fill="FBF9F3" w:val="clear"/>
+            <w:tcMar>
+              <w:top w:type="dxa" w:w="70"/>
+              <w:left w:type="dxa" w:w="110"/>
+              <w:bottom w:type="dxa" w:w="70"/>
+              <w:right w:type="dxa" w:w="110"/>
+            </w:tcMar>
+          </w:tcPr>
+          <w:p>
+            <w:pPr>
+              <w:spacing w:after="0" w:line="250"/>
+            </w:pPr>
+            <w:r>
+              <w:rPr>
+                <w:rFonts w:ascii="Arial" w:cs="Arial" w:eastAsia="Arial" w:hAnsi="Arial"/>
+                <w:b w:val="false"/>
+                <w:bCs w:val="false"/>
+                <w:color w:val="2D3436"/>
+                <w:sz w:val="19"/>
+                <w:szCs w:val="19"/>
+              </w:rPr>
+              <w:t xml:space="preserve">Already proven: our SIFU routes work this way</w:t>
+            </w:r>
+          </w:p>
+        </w:tc>
+      </w:tr>
+      <w:tr>
+        <w:tc>
+          <w:tcPr>
+            <w:tcW w:type="dxa" w:w="1700"/>
+            <w:tcBorders>
+              <w:top w:val="single" w:color="D8CDB4" w:sz="1"/>
+              <w:left w:val="single" w:color="D8CDB4" w:sz="1"/>
+              <w:bottom w:val="single" w:color="D8CDB4" w:sz="1"/>
+              <w:right w:val="single" w:color="D8CDB4" w:sz="1"/>
+            </w:tcBorders>
+            <w:shd w:fill="FFFFFF" w:val="clear"/>
+            <w:tcMar>
+              <w:top w:type="dxa" w:w="70"/>
+              <w:left w:type="dxa" w:w="110"/>
+              <w:bottom w:type="dxa" w:w="70"/>
+              <w:right w:type="dxa" w:w="110"/>
+            </w:tcMar>
+          </w:tcPr>
+          <w:p>
+            <w:pPr>
+              <w:spacing w:after="0" w:line="250"/>
+            </w:pPr>
+            <w:r>
+              <w:rPr>
+                <w:rFonts w:ascii="Arial" w:cs="Arial" w:eastAsia="Arial" w:hAnsi="Arial"/>
+                <w:b w:val="false"/>
+                <w:bCs w:val="false"/>
+                <w:color w:val="2D3436"/>
+                <w:sz w:val="19"/>
+                <w:szCs w:val="19"/>
+              </w:rPr>
+              <w:t xml:space="preserve">Database</w:t>
+            </w:r>
+          </w:p>
+        </w:tc>
+        <w:tc>
+          <w:tcPr>
+            <w:tcW w:type="dxa" w:w="3400"/>
+            <w:tcBorders>
+              <w:top w:val="single" w:color="D8CDB4" w:sz="1"/>
+              <w:left w:val="single" w:color="D8CDB4" w:sz="1"/>
+              <w:bottom w:val="single" w:color="D8CDB4" w:sz="1"/>
+              <w:right w:val="single" w:color="D8CDB4" w:sz="1"/>
+            </w:tcBorders>
+            <w:shd w:fill="FFFFFF" w:val="clear"/>
+            <w:tcMar>
+              <w:top w:type="dxa" w:w="70"/>
+              <w:left w:type="dxa" w:w="110"/>
+              <w:bottom w:type="dxa" w:w="70"/>
+              <w:right w:type="dxa" w:w="110"/>
+            </w:tcMar>
+          </w:tcPr>
+          <w:p>
+            <w:pPr>
+              <w:spacing w:after="0" w:line="250"/>
+            </w:pPr>
+            <w:r>
+              <w:rPr>
+                <w:rFonts w:ascii="Arial" w:cs="Arial" w:eastAsia="Arial" w:hAnsi="Arial"/>
+                <w:b w:val="false"/>
+                <w:bCs w:val="false"/>
+                <w:color w:val="2D3436"/>
+                <w:sz w:val="19"/>
+                <w:szCs w:val="19"/>
+              </w:rPr>
+              <w:t xml:space="preserve">PostgreSQL (Supabase / AWS RDS)</w:t>
+            </w:r>
+          </w:p>
+        </w:tc>
+        <w:tc>
+          <w:tcPr>
+            <w:tcW w:type="dxa" w:w="3926"/>
+            <w:tcBorders>
+              <w:top w:val="single" w:color="D8CDB4" w:sz="1"/>
+              <w:left w:val="single" w:color="D8CDB4" w:sz="1"/>
+              <w:bottom w:val="single" w:color="D8CDB4" w:sz="1"/>
+              <w:right w:val="single" w:color="D8CDB4" w:sz="1"/>
+            </w:tcBorders>
+            <w:shd w:fill="FFFFFF" w:val="clear"/>
+            <w:tcMar>
+              <w:top w:type="dxa" w:w="70"/>
+              <w:left w:type="dxa" w:w="110"/>
+              <w:bottom w:type="dxa" w:w="70"/>
+              <w:right w:type="dxa" w:w="110"/>
+            </w:tcMar>
+          </w:tcPr>
+          <w:p>
+            <w:pPr>
+              <w:spacing w:after="0" w:line="250"/>
+            </w:pPr>
+            <w:r>
+              <w:rPr>
+                <w:rFonts w:ascii="Arial" w:cs="Arial" w:eastAsia="Arial" w:hAnsi="Arial"/>
+                <w:b w:val="false"/>
+                <w:bCs w:val="false"/>
+                <w:color w:val="2D3436"/>
+                <w:sz w:val="19"/>
+                <w:szCs w:val="19"/>
+              </w:rPr>
+              <w:t xml:space="preserve">Replaces localStorage; stores profiles, applications, scores</w:t>
+            </w:r>
+          </w:p>
+        </w:tc>
+      </w:tr>
+      <w:tr>
+        <w:tc>
+          <w:tcPr>
+            <w:tcW w:type="dxa" w:w="1700"/>
+            <w:tcBorders>
+              <w:top w:val="single" w:color="D8CDB4" w:sz="1"/>
+              <w:left w:val="single" w:color="D8CDB4" w:sz="1"/>
+              <w:bottom w:val="single" w:color="D8CDB4" w:sz="1"/>
+              <w:right w:val="single" w:color="D8CDB4" w:sz="1"/>
+            </w:tcBorders>
+            <w:shd w:fill="FBF9F3" w:val="clear"/>
+            <w:tcMar>
+              <w:top w:type="dxa" w:w="70"/>
+              <w:left w:type="dxa" w:w="110"/>
+              <w:bottom w:type="dxa" w:w="70"/>
+              <w:right w:type="dxa" w:w="110"/>
+            </w:tcMar>
+          </w:tcPr>
+          <w:p>
+            <w:pPr>
+              <w:spacing w:after="0" w:line="250"/>
+            </w:pPr>
+            <w:r>
+              <w:rPr>
+                <w:rFonts w:ascii="Arial" w:cs="Arial" w:eastAsia="Arial" w:hAnsi="Arial"/>
+                <w:b w:val="false"/>
+                <w:bCs w:val="false"/>
+                <w:color w:val="2D3436"/>
+                <w:sz w:val="19"/>
+                <w:szCs w:val="19"/>
+              </w:rPr>
+              <w:t xml:space="preserve">Authentication</w:t>
+            </w:r>
+          </w:p>
+        </w:tc>
+        <w:tc>
+          <w:tcPr>
+            <w:tcW w:type="dxa" w:w="3400"/>
+            <w:tcBorders>
+              <w:top w:val="single" w:color="D8CDB4" w:sz="1"/>
+              <w:left w:val="single" w:color="D8CDB4" w:sz="1"/>
+              <w:bottom w:val="single" w:color="D8CDB4" w:sz="1"/>
+              <w:right w:val="single" w:color="D8CDB4" w:sz="1"/>
+            </w:tcBorders>
+            <w:shd w:fill="FBF9F3" w:val="clear"/>
+            <w:tcMar>
+              <w:top w:type="dxa" w:w="70"/>
+              <w:left w:type="dxa" w:w="110"/>
+              <w:bottom w:type="dxa" w:w="70"/>
+              <w:right w:type="dxa" w:w="110"/>
+            </w:tcMar>
+          </w:tcPr>
+          <w:p>
+            <w:pPr>
+              <w:spacing w:after="0" w:line="250"/>
+            </w:pPr>
+            <w:r>
+              <w:rPr>
+                <w:rFonts w:ascii="Arial" w:cs="Arial" w:eastAsia="Arial" w:hAnsi="Arial"/>
+                <w:b w:val="false"/>
+                <w:bCs w:val="false"/>
+                <w:color w:val="2D3436"/>
+                <w:sz w:val="19"/>
+                <w:szCs w:val="19"/>
+              </w:rPr>
+              <w:t xml:space="preserve">Auth0 / Clerk / Supabase Auth</w:t>
+            </w:r>
+          </w:p>
+        </w:tc>
+        <w:tc>
+          <w:tcPr>
+            <w:tcW w:type="dxa" w:w="3926"/>
+            <w:tcBorders>
+              <w:top w:val="single" w:color="D8CDB4" w:sz="1"/>
+              <w:left w:val="single" w:color="D8CDB4" w:sz="1"/>
+              <w:bottom w:val="single" w:color="D8CDB4" w:sz="1"/>
+              <w:right w:val="single" w:color="D8CDB4" w:sz="1"/>
+            </w:tcBorders>
+            <w:shd w:fill="FBF9F3" w:val="clear"/>
+            <w:tcMar>
+              <w:top w:type="dxa" w:w="70"/>
+              <w:left w:type="dxa" w:w="110"/>
+              <w:bottom w:type="dxa" w:w="70"/>
+              <w:right w:type="dxa" w:w="110"/>
+            </w:tcMar>
+          </w:tcPr>
+          <w:p>
+            <w:pPr>
+              <w:spacing w:after="0" w:line="250"/>
+            </w:pPr>
+            <w:r>
+              <w:rPr>
+                <w:rFonts w:ascii="Arial" w:cs="Arial" w:eastAsia="Arial" w:hAnsi="Arial"/>
+                <w:b w:val="false"/>
+                <w:bCs w:val="false"/>
+                <w:color w:val="2D3436"/>
+                <w:sz w:val="19"/>
+                <w:szCs w:val="19"/>
+              </w:rPr>
+              <w:t xml:space="preserve">Email + institutional SSO for university accounts</w:t>
+            </w:r>
+          </w:p>
+        </w:tc>
+      </w:tr>
+      <w:tr>
+        <w:tc>
+          <w:tcPr>
+            <w:tcW w:type="dxa" w:w="1700"/>
+            <w:tcBorders>
+              <w:top w:val="single" w:color="D8CDB4" w:sz="1"/>
+              <w:left w:val="single" w:color="D8CDB4" w:sz="1"/>
+              <w:bottom w:val="single" w:color="D8CDB4" w:sz="1"/>
+              <w:right w:val="single" w:color="D8CDB4" w:sz="1"/>
+            </w:tcBorders>
+            <w:shd w:fill="FFFFFF" w:val="clear"/>
+            <w:tcMar>
+              <w:top w:type="dxa" w:w="70"/>
+              <w:left w:type="dxa" w:w="110"/>
+              <w:bottom w:type="dxa" w:w="70"/>
+              <w:right w:type="dxa" w:w="110"/>
+            </w:tcMar>
+          </w:tcPr>
+          <w:p>
+            <w:pPr>
+              <w:spacing w:after="0" w:line="250"/>
+            </w:pPr>
+            <w:r>
+              <w:rPr>
+                <w:rFonts w:ascii="Arial" w:cs="Arial" w:eastAsia="Arial" w:hAnsi="Arial"/>
+                <w:b w:val="false"/>
+                <w:bCs w:val="false"/>
+                <w:color w:val="2D3436"/>
+                <w:sz w:val="19"/>
+                <w:szCs w:val="19"/>
+              </w:rPr>
+              <w:t xml:space="preserve">File &amp; video storage</w:t>
+            </w:r>
+          </w:p>
+        </w:tc>
+        <w:tc>
+          <w:tcPr>
+            <w:tcW w:type="dxa" w:w="3400"/>
+            <w:tcBorders>
+              <w:top w:val="single" w:color="D8CDB4" w:sz="1"/>
+              <w:left w:val="single" w:color="D8CDB4" w:sz="1"/>
+              <w:bottom w:val="single" w:color="D8CDB4" w:sz="1"/>
+              <w:right w:val="single" w:color="D8CDB4" w:sz="1"/>
+            </w:tcBorders>
+            <w:shd w:fill="FFFFFF" w:val="clear"/>
+            <w:tcMar>
+              <w:top w:type="dxa" w:w="70"/>
+              <w:left w:type="dxa" w:w="110"/>
+              <w:bottom w:type="dxa" w:w="70"/>
+              <w:right w:type="dxa" w:w="110"/>
+            </w:tcMar>
+          </w:tcPr>
+          <w:p>
+            <w:pPr>
+              <w:spacing w:after="0" w:line="250"/>
+            </w:pPr>
+            <w:r>
+              <w:rPr>
+                <w:rFonts w:ascii="Arial" w:cs="Arial" w:eastAsia="Arial" w:hAnsi="Arial"/>
+                <w:b w:val="false"/>
+                <w:bCs w:val="false"/>
+                <w:color w:val="2D3436"/>
+                <w:sz w:val="19"/>
+                <w:szCs w:val="19"/>
+              </w:rPr>
+              <w:t xml:space="preserve">AWS S3 + Mux or Cloudflare Stream</w:t>
+            </w:r>
+          </w:p>
+        </w:tc>
+        <w:tc>
+          <w:tcPr>
+            <w:tcW w:type="dxa" w:w="3926"/>
+            <w:tcBorders>
+              <w:top w:val="single" w:color="D8CDB4" w:sz="1"/>
+              <w:left w:val="single" w:color="D8CDB4" w:sz="1"/>
+              <w:bottom w:val="single" w:color="D8CDB4" w:sz="1"/>
+              <w:right w:val="single" w:color="D8CDB4" w:sz="1"/>
+            </w:tcBorders>
+            <w:shd w:fill="FFFFFF" w:val="clear"/>
+            <w:tcMar>
+              <w:top w:type="dxa" w:w="70"/>
+              <w:left w:type="dxa" w:w="110"/>
+              <w:bottom w:type="dxa" w:w="70"/>
+              <w:right w:type="dxa" w:w="110"/>
+            </w:tcMar>
+          </w:tcPr>
+          <w:p>
+            <w:pPr>
+              <w:spacing w:after="0" w:line="250"/>
+            </w:pPr>
+            <w:r>
+              <w:rPr>
+                <w:rFonts w:ascii="Arial" w:cs="Arial" w:eastAsia="Arial" w:hAnsi="Arial"/>
+                <w:b w:val="false"/>
+                <w:bCs w:val="false"/>
+                <w:color w:val="2D3436"/>
+                <w:sz w:val="19"/>
+                <w:szCs w:val="19"/>
+              </w:rPr>
+              <w:t xml:space="preserve">Resume PDFs and Story Videos</w:t>
+            </w:r>
+          </w:p>
+        </w:tc>
+      </w:tr>
+      <w:tr>
+        <w:tc>
+          <w:tcPr>
+            <w:tcW w:type="dxa" w:w="1700"/>
+            <w:tcBorders>
+              <w:top w:val="single" w:color="D8CDB4" w:sz="1"/>
+              <w:left w:val="single" w:color="D8CDB4" w:sz="1"/>
+              <w:bottom w:val="single" w:color="D8CDB4" w:sz="1"/>
+              <w:right w:val="single" w:color="D8CDB4" w:sz="1"/>
+            </w:tcBorders>
+            <w:shd w:fill="FBF9F3" w:val="clear"/>
+            <w:tcMar>
+              <w:top w:type="dxa" w:w="70"/>
+              <w:left w:type="dxa" w:w="110"/>
+              <w:bottom w:type="dxa" w:w="70"/>
+              <w:right w:type="dxa" w:w="110"/>
+            </w:tcMar>
+          </w:tcPr>
+          <w:p>
+            <w:pPr>
+              <w:spacing w:after="0" w:line="250"/>
+            </w:pPr>
+            <w:r>
+              <w:rPr>
+                <w:rFonts w:ascii="Arial" w:cs="Arial" w:eastAsia="Arial" w:hAnsi="Arial"/>
+                <w:b w:val="false"/>
+                <w:bCs w:val="false"/>
+                <w:color w:val="2D3436"/>
+                <w:sz w:val="19"/>
+                <w:szCs w:val="19"/>
+              </w:rPr>
+              <w:t xml:space="preserve">AI layer</w:t>
+            </w:r>
+          </w:p>
+        </w:tc>
+        <w:tc>
+          <w:tcPr>
+            <w:tcW w:type="dxa" w:w="3400"/>
+            <w:tcBorders>
+              <w:top w:val="single" w:color="D8CDB4" w:sz="1"/>
+              <w:left w:val="single" w:color="D8CDB4" w:sz="1"/>
+              <w:bottom w:val="single" w:color="D8CDB4" w:sz="1"/>
+              <w:right w:val="single" w:color="D8CDB4" w:sz="1"/>
+            </w:tcBorders>
+            <w:shd w:fill="FBF9F3" w:val="clear"/>
+            <w:tcMar>
+              <w:top w:type="dxa" w:w="70"/>
+              <w:left w:type="dxa" w:w="110"/>
+              <w:bottom w:type="dxa" w:w="70"/>
+              <w:right w:type="dxa" w:w="110"/>
+            </w:tcMar>
+          </w:tcPr>
+          <w:p>
+            <w:pPr>
+              <w:spacing w:after="0" w:line="250"/>
+            </w:pPr>
+            <w:r>
+              <w:rPr>
+                <w:rFonts w:ascii="Arial" w:cs="Arial" w:eastAsia="Arial" w:hAnsi="Arial"/>
+                <w:b w:val="false"/>
+                <w:bCs w:val="false"/>
+                <w:color w:val="2D3436"/>
+                <w:sz w:val="19"/>
+                <w:szCs w:val="19"/>
+              </w:rPr>
+              <w:t xml:space="preserve">Anthropic Claude API</w:t>
+            </w:r>
+          </w:p>
+        </w:tc>
+        <w:tc>
+          <w:tcPr>
+            <w:tcW w:type="dxa" w:w="3926"/>
+            <w:tcBorders>
+              <w:top w:val="single" w:color="D8CDB4" w:sz="1"/>
+              <w:left w:val="single" w:color="D8CDB4" w:sz="1"/>
+              <w:bottom w:val="single" w:color="D8CDB4" w:sz="1"/>
+              <w:right w:val="single" w:color="D8CDB4" w:sz="1"/>
+            </w:tcBorders>
+            <w:shd w:fill="FBF9F3" w:val="clear"/>
+            <w:tcMar>
+              <w:top w:type="dxa" w:w="70"/>
+              <w:left w:type="dxa" w:w="110"/>
+              <w:bottom w:type="dxa" w:w="70"/>
+              <w:right w:type="dxa" w:w="110"/>
+            </w:tcMar>
+          </w:tcPr>
+          <w:p>
+            <w:pPr>
+              <w:spacing w:after="0" w:line="250"/>
+            </w:pPr>
+            <w:r>
+              <w:rPr>
+                <w:rFonts w:ascii="Arial" w:cs="Arial" w:eastAsia="Arial" w:hAnsi="Arial"/>
+                <w:b w:val="false"/>
+                <w:bCs w:val="false"/>
+                <w:color w:val="2D3436"/>
+                <w:sz w:val="19"/>
+                <w:szCs w:val="19"/>
+              </w:rPr>
+              <w:t xml:space="preserve">Already live for SIFU — extend to resume parsing and coaching</w:t>
+            </w:r>
+          </w:p>
+        </w:tc>
+      </w:tr>
+      <w:tr>
+        <w:tc>
+          <w:tcPr>
+            <w:tcW w:type="dxa" w:w="1700"/>
+            <w:tcBorders>
+              <w:top w:val="single" w:color="D8CDB4" w:sz="1"/>
+              <w:left w:val="single" w:color="D8CDB4" w:sz="1"/>
+              <w:bottom w:val="single" w:color="D8CDB4" w:sz="1"/>
+              <w:right w:val="single" w:color="D8CDB4" w:sz="1"/>
+            </w:tcBorders>
+            <w:shd w:fill="FFFFFF" w:val="clear"/>
+            <w:tcMar>
+              <w:top w:type="dxa" w:w="70"/>
+              <w:left w:type="dxa" w:w="110"/>
+              <w:bottom w:type="dxa" w:w="70"/>
+              <w:right w:type="dxa" w:w="110"/>
+            </w:tcMar>
+          </w:tcPr>
+          <w:p>
+            <w:pPr>
+              <w:spacing w:after="0" w:line="250"/>
+            </w:pPr>
+            <w:r>
+              <w:rPr>
+                <w:rFonts w:ascii="Arial" w:cs="Arial" w:eastAsia="Arial" w:hAnsi="Arial"/>
+                <w:b w:val="false"/>
+                <w:bCs w:val="false"/>
+                <w:color w:val="2D3436"/>
+                <w:sz w:val="19"/>
+                <w:szCs w:val="19"/>
+              </w:rPr>
+              <w:t xml:space="preserve">Analytics</w:t>
+            </w:r>
+          </w:p>
+        </w:tc>
+        <w:tc>
+          <w:tcPr>
+            <w:tcW w:type="dxa" w:w="3400"/>
+            <w:tcBorders>
+              <w:top w:val="single" w:color="D8CDB4" w:sz="1"/>
+              <w:left w:val="single" w:color="D8CDB4" w:sz="1"/>
+              <w:bottom w:val="single" w:color="D8CDB4" w:sz="1"/>
+              <w:right w:val="single" w:color="D8CDB4" w:sz="1"/>
+            </w:tcBorders>
+            <w:shd w:fill="FFFFFF" w:val="clear"/>
+            <w:tcMar>
+              <w:top w:type="dxa" w:w="70"/>
+              <w:left w:type="dxa" w:w="110"/>
+              <w:bottom w:type="dxa" w:w="70"/>
+              <w:right w:type="dxa" w:w="110"/>
+            </w:tcMar>
+          </w:tcPr>
+          <w:p>
+            <w:pPr>
+              <w:spacing w:after="0" w:line="250"/>
+            </w:pPr>
+            <w:r>
+              <w:rPr>
+                <w:rFonts w:ascii="Arial" w:cs="Arial" w:eastAsia="Arial" w:hAnsi="Arial"/>
+                <w:b w:val="false"/>
+                <w:bCs w:val="false"/>
+                <w:color w:val="2D3436"/>
+                <w:sz w:val="19"/>
+                <w:szCs w:val="19"/>
+              </w:rPr>
+              <w:t xml:space="preserve">Scheduled jobs into a data warehouse</w:t>
+            </w:r>
+          </w:p>
+        </w:tc>
+        <w:tc>
+          <w:tcPr>
+            <w:tcW w:type="dxa" w:w="3926"/>
+            <w:tcBorders>
+              <w:top w:val="single" w:color="D8CDB4" w:sz="1"/>
+              <w:left w:val="single" w:color="D8CDB4" w:sz="1"/>
+              <w:bottom w:val="single" w:color="D8CDB4" w:sz="1"/>
+              <w:right w:val="single" w:color="D8CDB4" w:sz="1"/>
+            </w:tcBorders>
+            <w:shd w:fill="FFFFFF" w:val="clear"/>
+            <w:tcMar>
+              <w:top w:type="dxa" w:w="70"/>
+              <w:left w:type="dxa" w:w="110"/>
+              <w:bottom w:type="dxa" w:w="70"/>
+              <w:right w:type="dxa" w:w="110"/>
+            </w:tcMar>
+          </w:tcPr>
+          <w:p>
+            <w:pPr>
+              <w:spacing w:after="0" w:line="250"/>
+            </w:pPr>
+            <w:r>
+              <w:rPr>
+                <w:rFonts w:ascii="Arial" w:cs="Arial" w:eastAsia="Arial" w:hAnsi="Arial"/>
+                <w:b w:val="false"/>
+                <w:bCs w:val="false"/>
+                <w:color w:val="2D3436"/>
+                <w:sz w:val="19"/>
+                <w:szCs w:val="19"/>
+              </w:rPr>
+              <w:t xml:space="preserve">Powers the university and ministry dashboards</w:t>
+            </w:r>
+          </w:p>
+        </w:tc>
+      </w:tr>
+    </w:tbl>
+    <w:p>
+      <w:pPr>
+        <w:pStyle w:val="Heading2"/>
+        <w:spacing w:after="90" w:before="260"/>
+      </w:pPr>
+      <w:r>
+        <w:rPr>
+          <w:rFonts w:ascii="Arial" w:cs="Arial" w:eastAsia="Arial" w:hAnsi="Arial"/>
+          <w:b/>
+          <w:bCs/>
+          <w:color w:val="C0392B"/>
+          <w:sz w:val="24"/>
+          <w:szCs w:val="24"/>
+        </w:rPr>
+        <w:t xml:space="preserve">Where the real data would come from</w:t>
+      </w:r>
+    </w:p>
+    <w:p>
+      <w:pPr>
+        <w:pStyle w:val="Heading3"/>
+        <w:spacing w:after="70" w:before="200"/>
+      </w:pPr>
+      <w:r>
+        <w:rPr>
+          <w:rFonts w:ascii="Arial" w:cs="Arial" w:eastAsia="Arial" w:hAnsi="Arial"/>
+          <w:b/>
+          <w:bCs/>
+          <w:color w:val="8A6D1F"/>
+          <w:sz w:val="22"/>
+          <w:szCs w:val="22"/>
+        </w:rPr>
+        <w:t xml:space="preserve">A. Talentbank’s own assets — available on day one</w:t>
+      </w:r>
+    </w:p>
+    <w:p>
+      <w:pPr>
+        <w:spacing w:after="110" w:line="268"/>
+      </w:pPr>
+      <w:r>
+        <w:rPr>
+          <w:rFonts w:ascii="Arial" w:cs="Arial" w:eastAsia="Arial" w:hAnsi="Arial"/>
+          <w:color w:val="2D3436"/>
+          <w:sz w:val="21"/>
+          <w:szCs w:val="21"/>
+        </w:rPr>
+        <w:t xml:space="preserve">The strongest data advantage is Talentbank’s, not a third party’s:</w:t>
       </w:r>
     </w:p>
     <w:p>
@@ -5770,11 +6763,22 @@
       <w:r>
         <w:rPr>
           <w:rFonts w:ascii="Arial" w:cs="Arial" w:eastAsia="Arial" w:hAnsi="Arial"/>
-          <w:color w:val="2D3436"/>
-          <w:sz w:val="21"/>
-          <w:szCs w:val="21"/>
-        </w:rPr>
-        <w:t xml:space="preserve">Real database and authentication replacing localStorage</w:t>
+          <w:b/>
+          <w:bCs/>
+          <w:color w:val="2D3436"/>
+          <w:sz w:val="21"/>
+          <w:szCs w:val="21"/>
+        </w:rPr>
+        <w:t xml:space="preserve">10,000+ employer network → </w:t>
+      </w:r>
+      <w:r>
+        <w:rPr>
+          <w:rFonts w:ascii="Arial" w:cs="Arial" w:eastAsia="Arial" w:hAnsi="Arial"/>
+          <w:color w:val="2D3436"/>
+          <w:sz w:val="21"/>
+          <w:szCs w:val="21"/>
+        </w:rPr>
+        <w:t xml:space="preserve">live job listings and verified employer profiles</w:t>
       </w:r>
     </w:p>
     <w:p>
@@ -5789,11 +6793,22 @@
       <w:r>
         <w:rPr>
           <w:rFonts w:ascii="Arial" w:cs="Arial" w:eastAsia="Arial" w:hAnsi="Arial"/>
-          <w:color w:val="2D3436"/>
-          <w:sz w:val="21"/>
-          <w:szCs w:val="21"/>
-        </w:rPr>
-        <w:t xml:space="preserve">Live employer job feeds and verified partner onboarding</w:t>
+          <w:b/>
+          <w:bCs/>
+          <w:color w:val="2D3436"/>
+          <w:sz w:val="21"/>
+          <w:szCs w:val="21"/>
+        </w:rPr>
+        <w:t xml:space="preserve">50 university partners → </w:t>
+      </w:r>
+      <w:r>
+        <w:rPr>
+          <w:rFonts w:ascii="Arial" w:cs="Arial" w:eastAsia="Arial" w:hAnsi="Arial"/>
+          <w:color w:val="2D3436"/>
+          <w:sz w:val="21"/>
+          <w:szCs w:val="21"/>
+        </w:rPr>
+        <w:t xml:space="preserve">cohort data for the university dashboards</w:t>
       </w:r>
     </w:p>
     <w:p>
@@ -5808,11 +6823,22 @@
       <w:r>
         <w:rPr>
           <w:rFonts w:ascii="Arial" w:cs="Arial" w:eastAsia="Arial" w:hAnsi="Arial"/>
-          <w:color w:val="2D3436"/>
-          <w:sz w:val="21"/>
-          <w:szCs w:val="21"/>
-        </w:rPr>
-        <w:t xml:space="preserve">Real ATS resume parsing (currently simulated)</w:t>
+          <w:b/>
+          <w:bCs/>
+          <w:color w:val="2D3436"/>
+          <w:sz w:val="21"/>
+          <w:szCs w:val="21"/>
+        </w:rPr>
+        <w:t xml:space="preserve">~50 career fairs a year → </w:t>
+      </w:r>
+      <w:r>
+        <w:rPr>
+          <w:rFonts w:ascii="Arial" w:cs="Arial" w:eastAsia="Arial" w:hAnsi="Arial"/>
+          <w:color w:val="2D3436"/>
+          <w:sz w:val="21"/>
+          <w:szCs w:val="21"/>
+        </w:rPr>
+        <w:t xml:space="preserve">employer engagement and placement outcomes</w:t>
       </w:r>
     </w:p>
     <w:p>
@@ -5827,11 +6853,1058 @@
       <w:r>
         <w:rPr>
           <w:rFonts w:ascii="Arial" w:cs="Arial" w:eastAsia="Arial" w:hAnsi="Arial"/>
-          <w:color w:val="2D3436"/>
-          <w:sz w:val="21"/>
-          <w:szCs w:val="21"/>
-        </w:rPr>
-        <w:t xml:space="preserve">Video upload and storage for Story Video (currently in-browser only)</w:t>
+          <w:b/>
+          <w:bCs/>
+          <w:color w:val="2D3436"/>
+          <w:sz w:val="21"/>
+          <w:szCs w:val="21"/>
+        </w:rPr>
+        <w:t xml:space="preserve">YourWork Animal (yourworkanimal.com) → </w:t>
+      </w:r>
+      <w:r>
+        <w:rPr>
+          <w:rFonts w:ascii="Arial" w:cs="Arial" w:eastAsia="Arial" w:hAnsi="Arial"/>
+          <w:color w:val="2D3436"/>
+          <w:sz w:val="21"/>
+          <w:szCs w:val="21"/>
+        </w:rPr>
+        <w:t xml:space="preserve">the assessment is already Talentbank IP — we integrate rather than rebuild</w:t>
+      </w:r>
+    </w:p>
+    <w:p>
+      <w:pPr>
+        <w:pStyle w:val="Heading3"/>
+        <w:spacing w:after="70" w:before="200"/>
+      </w:pPr>
+      <w:r>
+        <w:rPr>
+          <w:rFonts w:ascii="Arial" w:cs="Arial" w:eastAsia="Arial" w:hAnsi="Arial"/>
+          <w:b/>
+          <w:bCs/>
+          <w:color w:val="8A6D1F"/>
+          <w:sz w:val="22"/>
+          <w:szCs w:val="22"/>
+        </w:rPr>
+        <w:t xml:space="preserve">B. Malaysian national and government sources</w:t>
+      </w:r>
+    </w:p>
+    <w:tbl>
+      <w:tblPr>
+        <w:tblW w:type="dxa" w:w="9026"/>
+        <w:tblBorders>
+          <w:top w:val="single" w:color="auto" w:sz="4"/>
+          <w:left w:val="single" w:color="auto" w:sz="4"/>
+          <w:bottom w:val="single" w:color="auto" w:sz="4"/>
+          <w:right w:val="single" w:color="auto" w:sz="4"/>
+          <w:insideH w:val="single" w:color="auto" w:sz="4"/>
+          <w:insideV w:val="single" w:color="auto" w:sz="4"/>
+        </w:tblBorders>
+      </w:tblPr>
+      <w:tblGrid>
+        <w:gridCol w:w="3400"/>
+        <w:gridCol w:w="5626"/>
+      </w:tblGrid>
+      <w:tr>
+        <w:trPr>
+          <w:tblHeader/>
+        </w:trPr>
+        <w:tc>
+          <w:tcPr>
+            <w:tcW w:type="dxa" w:w="3400"/>
+            <w:tcBorders>
+              <w:top w:val="single" w:color="D8CDB4" w:sz="1"/>
+              <w:left w:val="single" w:color="D8CDB4" w:sz="1"/>
+              <w:bottom w:val="single" w:color="D8CDB4" w:sz="1"/>
+              <w:right w:val="single" w:color="D8CDB4" w:sz="1"/>
+            </w:tcBorders>
+            <w:shd w:fill="8A6D1F" w:val="clear"/>
+            <w:tcMar>
+              <w:top w:type="dxa" w:w="70"/>
+              <w:left w:type="dxa" w:w="110"/>
+              <w:bottom w:type="dxa" w:w="70"/>
+              <w:right w:type="dxa" w:w="110"/>
+            </w:tcMar>
+          </w:tcPr>
+          <w:p>
+            <w:pPr>
+              <w:spacing w:after="0" w:line="250"/>
+            </w:pPr>
+            <w:r>
+              <w:rPr>
+                <w:rFonts w:ascii="Arial" w:cs="Arial" w:eastAsia="Arial" w:hAnsi="Arial"/>
+                <w:b/>
+                <w:bCs/>
+                <w:color w:val="FFFFFF"/>
+                <w:sz w:val="19"/>
+                <w:szCs w:val="19"/>
+              </w:rPr>
+              <w:t xml:space="preserve">Source</w:t>
+            </w:r>
+          </w:p>
+        </w:tc>
+        <w:tc>
+          <w:tcPr>
+            <w:tcW w:type="dxa" w:w="5626"/>
+            <w:tcBorders>
+              <w:top w:val="single" w:color="D8CDB4" w:sz="1"/>
+              <w:left w:val="single" w:color="D8CDB4" w:sz="1"/>
+              <w:bottom w:val="single" w:color="D8CDB4" w:sz="1"/>
+              <w:right w:val="single" w:color="D8CDB4" w:sz="1"/>
+            </w:tcBorders>
+            <w:shd w:fill="8A6D1F" w:val="clear"/>
+            <w:tcMar>
+              <w:top w:type="dxa" w:w="70"/>
+              <w:left w:type="dxa" w:w="110"/>
+              <w:bottom w:type="dxa" w:w="70"/>
+              <w:right w:type="dxa" w:w="110"/>
+            </w:tcMar>
+          </w:tcPr>
+          <w:p>
+            <w:pPr>
+              <w:spacing w:after="0" w:line="250"/>
+            </w:pPr>
+            <w:r>
+              <w:rPr>
+                <w:rFonts w:ascii="Arial" w:cs="Arial" w:eastAsia="Arial" w:hAnsi="Arial"/>
+                <w:b/>
+                <w:bCs/>
+                <w:color w:val="FFFFFF"/>
+                <w:sz w:val="19"/>
+                <w:szCs w:val="19"/>
+              </w:rPr>
+              <w:t xml:space="preserve">What it powers</w:t>
+            </w:r>
+          </w:p>
+        </w:tc>
+      </w:tr>
+      <w:tr>
+        <w:tc>
+          <w:tcPr>
+            <w:tcW w:type="dxa" w:w="3400"/>
+            <w:tcBorders>
+              <w:top w:val="single" w:color="D8CDB4" w:sz="1"/>
+              <w:left w:val="single" w:color="D8CDB4" w:sz="1"/>
+              <w:bottom w:val="single" w:color="D8CDB4" w:sz="1"/>
+              <w:right w:val="single" w:color="D8CDB4" w:sz="1"/>
+            </w:tcBorders>
+            <w:shd w:fill="FFFFFF" w:val="clear"/>
+            <w:tcMar>
+              <w:top w:type="dxa" w:w="70"/>
+              <w:left w:type="dxa" w:w="110"/>
+              <w:bottom w:type="dxa" w:w="70"/>
+              <w:right w:type="dxa" w:w="110"/>
+            </w:tcMar>
+          </w:tcPr>
+          <w:p>
+            <w:pPr>
+              <w:spacing w:after="0" w:line="250"/>
+            </w:pPr>
+            <w:r>
+              <w:rPr>
+                <w:rFonts w:ascii="Arial" w:cs="Arial" w:eastAsia="Arial" w:hAnsi="Arial"/>
+                <w:b w:val="false"/>
+                <w:bCs w:val="false"/>
+                <w:color w:val="2D3436"/>
+                <w:sz w:val="19"/>
+                <w:szCs w:val="19"/>
+              </w:rPr>
+              <w:t xml:space="preserve">MOHE Graduate Tracer Study (Kajian Pengesanan Graduan)</w:t>
+            </w:r>
+          </w:p>
+        </w:tc>
+        <w:tc>
+          <w:tcPr>
+            <w:tcW w:type="dxa" w:w="5626"/>
+            <w:tcBorders>
+              <w:top w:val="single" w:color="D8CDB4" w:sz="1"/>
+              <w:left w:val="single" w:color="D8CDB4" w:sz="1"/>
+              <w:bottom w:val="single" w:color="D8CDB4" w:sz="1"/>
+              <w:right w:val="single" w:color="D8CDB4" w:sz="1"/>
+            </w:tcBorders>
+            <w:shd w:fill="FFFFFF" w:val="clear"/>
+            <w:tcMar>
+              <w:top w:type="dxa" w:w="70"/>
+              <w:left w:type="dxa" w:w="110"/>
+              <w:bottom w:type="dxa" w:w="70"/>
+              <w:right w:type="dxa" w:w="110"/>
+            </w:tcMar>
+          </w:tcPr>
+          <w:p>
+            <w:pPr>
+              <w:spacing w:after="0" w:line="250"/>
+            </w:pPr>
+            <w:r>
+              <w:rPr>
+                <w:rFonts w:ascii="Arial" w:cs="Arial" w:eastAsia="Arial" w:hAnsi="Arial"/>
+                <w:b w:val="false"/>
+                <w:bCs w:val="false"/>
+                <w:color w:val="2D3436"/>
+                <w:sz w:val="19"/>
+                <w:szCs w:val="19"/>
+              </w:rPr>
+              <w:t xml:space="preserve">University and ministry employability dashboards — the national survey already run annually</w:t>
+            </w:r>
+          </w:p>
+        </w:tc>
+      </w:tr>
+      <w:tr>
+        <w:tc>
+          <w:tcPr>
+            <w:tcW w:type="dxa" w:w="3400"/>
+            <w:tcBorders>
+              <w:top w:val="single" w:color="D8CDB4" w:sz="1"/>
+              <w:left w:val="single" w:color="D8CDB4" w:sz="1"/>
+              <w:bottom w:val="single" w:color="D8CDB4" w:sz="1"/>
+              <w:right w:val="single" w:color="D8CDB4" w:sz="1"/>
+            </w:tcBorders>
+            <w:shd w:fill="FBF9F3" w:val="clear"/>
+            <w:tcMar>
+              <w:top w:type="dxa" w:w="70"/>
+              <w:left w:type="dxa" w:w="110"/>
+              <w:bottom w:type="dxa" w:w="70"/>
+              <w:right w:type="dxa" w:w="110"/>
+            </w:tcMar>
+          </w:tcPr>
+          <w:p>
+            <w:pPr>
+              <w:spacing w:after="0" w:line="250"/>
+            </w:pPr>
+            <w:r>
+              <w:rPr>
+                <w:rFonts w:ascii="Arial" w:cs="Arial" w:eastAsia="Arial" w:hAnsi="Arial"/>
+                <w:b w:val="false"/>
+                <w:bCs w:val="false"/>
+                <w:color w:val="2D3436"/>
+                <w:sz w:val="19"/>
+                <w:szCs w:val="19"/>
+              </w:rPr>
+              <w:t xml:space="preserve">MQA — Malaysian Qualifications Register</w:t>
+            </w:r>
+          </w:p>
+        </w:tc>
+        <w:tc>
+          <w:tcPr>
+            <w:tcW w:type="dxa" w:w="5626"/>
+            <w:tcBorders>
+              <w:top w:val="single" w:color="D8CDB4" w:sz="1"/>
+              <w:left w:val="single" w:color="D8CDB4" w:sz="1"/>
+              <w:bottom w:val="single" w:color="D8CDB4" w:sz="1"/>
+              <w:right w:val="single" w:color="D8CDB4" w:sz="1"/>
+            </w:tcBorders>
+            <w:shd w:fill="FBF9F3" w:val="clear"/>
+            <w:tcMar>
+              <w:top w:type="dxa" w:w="70"/>
+              <w:left w:type="dxa" w:w="110"/>
+              <w:bottom w:type="dxa" w:w="70"/>
+              <w:right w:type="dxa" w:w="110"/>
+            </w:tcMar>
+          </w:tcPr>
+          <w:p>
+            <w:pPr>
+              <w:spacing w:after="0" w:line="250"/>
+            </w:pPr>
+            <w:r>
+              <w:rPr>
+                <w:rFonts w:ascii="Arial" w:cs="Arial" w:eastAsia="Arial" w:hAnsi="Arial"/>
+                <w:b w:val="false"/>
+                <w:bCs w:val="false"/>
+                <w:color w:val="2D3436"/>
+                <w:sz w:val="19"/>
+                <w:szCs w:val="19"/>
+              </w:rPr>
+              <w:t xml:space="preserve">Course Advisor: every accredited programme in Malaysia</w:t>
+            </w:r>
+          </w:p>
+        </w:tc>
+      </w:tr>
+      <w:tr>
+        <w:tc>
+          <w:tcPr>
+            <w:tcW w:type="dxa" w:w="3400"/>
+            <w:tcBorders>
+              <w:top w:val="single" w:color="D8CDB4" w:sz="1"/>
+              <w:left w:val="single" w:color="D8CDB4" w:sz="1"/>
+              <w:bottom w:val="single" w:color="D8CDB4" w:sz="1"/>
+              <w:right w:val="single" w:color="D8CDB4" w:sz="1"/>
+            </w:tcBorders>
+            <w:shd w:fill="FFFFFF" w:val="clear"/>
+            <w:tcMar>
+              <w:top w:type="dxa" w:w="70"/>
+              <w:left w:type="dxa" w:w="110"/>
+              <w:bottom w:type="dxa" w:w="70"/>
+              <w:right w:type="dxa" w:w="110"/>
+            </w:tcMar>
+          </w:tcPr>
+          <w:p>
+            <w:pPr>
+              <w:spacing w:after="0" w:line="250"/>
+            </w:pPr>
+            <w:r>
+              <w:rPr>
+                <w:rFonts w:ascii="Arial" w:cs="Arial" w:eastAsia="Arial" w:hAnsi="Arial"/>
+                <w:b w:val="false"/>
+                <w:bCs w:val="false"/>
+                <w:color w:val="2D3436"/>
+                <w:sz w:val="19"/>
+                <w:szCs w:val="19"/>
+              </w:rPr>
+              <w:t xml:space="preserve">TalentCorp — Critical Occupations List / MyNext</w:t>
+            </w:r>
+          </w:p>
+        </w:tc>
+        <w:tc>
+          <w:tcPr>
+            <w:tcW w:type="dxa" w:w="5626"/>
+            <w:tcBorders>
+              <w:top w:val="single" w:color="D8CDB4" w:sz="1"/>
+              <w:left w:val="single" w:color="D8CDB4" w:sz="1"/>
+              <w:bottom w:val="single" w:color="D8CDB4" w:sz="1"/>
+              <w:right w:val="single" w:color="D8CDB4" w:sz="1"/>
+            </w:tcBorders>
+            <w:shd w:fill="FFFFFF" w:val="clear"/>
+            <w:tcMar>
+              <w:top w:type="dxa" w:w="70"/>
+              <w:left w:type="dxa" w:w="110"/>
+              <w:bottom w:type="dxa" w:w="70"/>
+              <w:right w:type="dxa" w:w="110"/>
+            </w:tcMar>
+          </w:tcPr>
+          <w:p>
+            <w:pPr>
+              <w:spacing w:after="0" w:line="250"/>
+            </w:pPr>
+            <w:r>
+              <w:rPr>
+                <w:rFonts w:ascii="Arial" w:cs="Arial" w:eastAsia="Arial" w:hAnsi="Arial"/>
+                <w:b w:val="false"/>
+                <w:bCs w:val="false"/>
+                <w:color w:val="2D3436"/>
+                <w:sz w:val="19"/>
+                <w:szCs w:val="19"/>
+              </w:rPr>
+              <w:t xml:space="preserve">Which skills and roles are genuinely in demand</w:t>
+            </w:r>
+          </w:p>
+        </w:tc>
+      </w:tr>
+      <w:tr>
+        <w:tc>
+          <w:tcPr>
+            <w:tcW w:type="dxa" w:w="3400"/>
+            <w:tcBorders>
+              <w:top w:val="single" w:color="D8CDB4" w:sz="1"/>
+              <w:left w:val="single" w:color="D8CDB4" w:sz="1"/>
+              <w:bottom w:val="single" w:color="D8CDB4" w:sz="1"/>
+              <w:right w:val="single" w:color="D8CDB4" w:sz="1"/>
+            </w:tcBorders>
+            <w:shd w:fill="FBF9F3" w:val="clear"/>
+            <w:tcMar>
+              <w:top w:type="dxa" w:w="70"/>
+              <w:left w:type="dxa" w:w="110"/>
+              <w:bottom w:type="dxa" w:w="70"/>
+              <w:right w:type="dxa" w:w="110"/>
+            </w:tcMar>
+          </w:tcPr>
+          <w:p>
+            <w:pPr>
+              <w:spacing w:after="0" w:line="250"/>
+            </w:pPr>
+            <w:r>
+              <w:rPr>
+                <w:rFonts w:ascii="Arial" w:cs="Arial" w:eastAsia="Arial" w:hAnsi="Arial"/>
+                <w:b w:val="false"/>
+                <w:bCs w:val="false"/>
+                <w:color w:val="2D3436"/>
+                <w:sz w:val="19"/>
+                <w:szCs w:val="19"/>
+              </w:rPr>
+              <w:t xml:space="preserve">DOSM — Salaries &amp; Wages Survey</w:t>
+            </w:r>
+          </w:p>
+        </w:tc>
+        <w:tc>
+          <w:tcPr>
+            <w:tcW w:type="dxa" w:w="5626"/>
+            <w:tcBorders>
+              <w:top w:val="single" w:color="D8CDB4" w:sz="1"/>
+              <w:left w:val="single" w:color="D8CDB4" w:sz="1"/>
+              <w:bottom w:val="single" w:color="D8CDB4" w:sz="1"/>
+              <w:right w:val="single" w:color="D8CDB4" w:sz="1"/>
+            </w:tcBorders>
+            <w:shd w:fill="FBF9F3" w:val="clear"/>
+            <w:tcMar>
+              <w:top w:type="dxa" w:w="70"/>
+              <w:left w:type="dxa" w:w="110"/>
+              <w:bottom w:type="dxa" w:w="70"/>
+              <w:right w:type="dxa" w:w="110"/>
+            </w:tcMar>
+          </w:tcPr>
+          <w:p>
+            <w:pPr>
+              <w:spacing w:after="0" w:line="250"/>
+            </w:pPr>
+            <w:r>
+              <w:rPr>
+                <w:rFonts w:ascii="Arial" w:cs="Arial" w:eastAsia="Arial" w:hAnsi="Arial"/>
+                <w:b w:val="false"/>
+                <w:bCs w:val="false"/>
+                <w:color w:val="2D3436"/>
+                <w:sz w:val="19"/>
+                <w:szCs w:val="19"/>
+              </w:rPr>
+              <w:t xml:space="preserve">Fair-pay benchmarks by role, sector and state</w:t>
+            </w:r>
+          </w:p>
+        </w:tc>
+      </w:tr>
+      <w:tr>
+        <w:tc>
+          <w:tcPr>
+            <w:tcW w:type="dxa" w:w="3400"/>
+            <w:tcBorders>
+              <w:top w:val="single" w:color="D8CDB4" w:sz="1"/>
+              <w:left w:val="single" w:color="D8CDB4" w:sz="1"/>
+              <w:bottom w:val="single" w:color="D8CDB4" w:sz="1"/>
+              <w:right w:val="single" w:color="D8CDB4" w:sz="1"/>
+            </w:tcBorders>
+            <w:shd w:fill="FFFFFF" w:val="clear"/>
+            <w:tcMar>
+              <w:top w:type="dxa" w:w="70"/>
+              <w:left w:type="dxa" w:w="110"/>
+              <w:bottom w:type="dxa" w:w="70"/>
+              <w:right w:type="dxa" w:w="110"/>
+            </w:tcMar>
+          </w:tcPr>
+          <w:p>
+            <w:pPr>
+              <w:spacing w:after="0" w:line="250"/>
+            </w:pPr>
+            <w:r>
+              <w:rPr>
+                <w:rFonts w:ascii="Arial" w:cs="Arial" w:eastAsia="Arial" w:hAnsi="Arial"/>
+                <w:b w:val="false"/>
+                <w:bCs w:val="false"/>
+                <w:color w:val="2D3436"/>
+                <w:sz w:val="19"/>
+                <w:szCs w:val="19"/>
+              </w:rPr>
+              <w:t xml:space="preserve">MyFutureJobs (PERKESO)</w:t>
+            </w:r>
+          </w:p>
+        </w:tc>
+        <w:tc>
+          <w:tcPr>
+            <w:tcW w:type="dxa" w:w="5626"/>
+            <w:tcBorders>
+              <w:top w:val="single" w:color="D8CDB4" w:sz="1"/>
+              <w:left w:val="single" w:color="D8CDB4" w:sz="1"/>
+              <w:bottom w:val="single" w:color="D8CDB4" w:sz="1"/>
+              <w:right w:val="single" w:color="D8CDB4" w:sz="1"/>
+            </w:tcBorders>
+            <w:shd w:fill="FFFFFF" w:val="clear"/>
+            <w:tcMar>
+              <w:top w:type="dxa" w:w="70"/>
+              <w:left w:type="dxa" w:w="110"/>
+              <w:bottom w:type="dxa" w:w="70"/>
+              <w:right w:type="dxa" w:w="110"/>
+            </w:tcMar>
+          </w:tcPr>
+          <w:p>
+            <w:pPr>
+              <w:spacing w:after="0" w:line="250"/>
+            </w:pPr>
+            <w:r>
+              <w:rPr>
+                <w:rFonts w:ascii="Arial" w:cs="Arial" w:eastAsia="Arial" w:hAnsi="Arial"/>
+                <w:b w:val="false"/>
+                <w:bCs w:val="false"/>
+                <w:color w:val="2D3436"/>
+                <w:sz w:val="19"/>
+                <w:szCs w:val="19"/>
+              </w:rPr>
+              <w:t xml:space="preserve">National vacancy data</w:t>
+            </w:r>
+          </w:p>
+        </w:tc>
+      </w:tr>
+      <w:tr>
+        <w:tc>
+          <w:tcPr>
+            <w:tcW w:type="dxa" w:w="3400"/>
+            <w:tcBorders>
+              <w:top w:val="single" w:color="D8CDB4" w:sz="1"/>
+              <w:left w:val="single" w:color="D8CDB4" w:sz="1"/>
+              <w:bottom w:val="single" w:color="D8CDB4" w:sz="1"/>
+              <w:right w:val="single" w:color="D8CDB4" w:sz="1"/>
+            </w:tcBorders>
+            <w:shd w:fill="FBF9F3" w:val="clear"/>
+            <w:tcMar>
+              <w:top w:type="dxa" w:w="70"/>
+              <w:left w:type="dxa" w:w="110"/>
+              <w:bottom w:type="dxa" w:w="70"/>
+              <w:right w:type="dxa" w:w="110"/>
+            </w:tcMar>
+          </w:tcPr>
+          <w:p>
+            <w:pPr>
+              <w:spacing w:after="0" w:line="250"/>
+            </w:pPr>
+            <w:r>
+              <w:rPr>
+                <w:rFonts w:ascii="Arial" w:cs="Arial" w:eastAsia="Arial" w:hAnsi="Arial"/>
+                <w:b w:val="false"/>
+                <w:bCs w:val="false"/>
+                <w:color w:val="2D3436"/>
+                <w:sz w:val="19"/>
+                <w:szCs w:val="19"/>
+              </w:rPr>
+              <w:t xml:space="preserve">SSM e-Info (Companies Commission)</w:t>
+            </w:r>
+          </w:p>
+        </w:tc>
+        <w:tc>
+          <w:tcPr>
+            <w:tcW w:type="dxa" w:w="5626"/>
+            <w:tcBorders>
+              <w:top w:val="single" w:color="D8CDB4" w:sz="1"/>
+              <w:left w:val="single" w:color="D8CDB4" w:sz="1"/>
+              <w:bottom w:val="single" w:color="D8CDB4" w:sz="1"/>
+              <w:right w:val="single" w:color="D8CDB4" w:sz="1"/>
+            </w:tcBorders>
+            <w:shd w:fill="FBF9F3" w:val="clear"/>
+            <w:tcMar>
+              <w:top w:type="dxa" w:w="70"/>
+              <w:left w:type="dxa" w:w="110"/>
+              <w:bottom w:type="dxa" w:w="70"/>
+              <w:right w:type="dxa" w:w="110"/>
+            </w:tcMar>
+          </w:tcPr>
+          <w:p>
+            <w:pPr>
+              <w:spacing w:after="0" w:line="250"/>
+            </w:pPr>
+            <w:r>
+              <w:rPr>
+                <w:rFonts w:ascii="Arial" w:cs="Arial" w:eastAsia="Arial" w:hAnsi="Arial"/>
+                <w:b w:val="false"/>
+                <w:bCs w:val="false"/>
+                <w:color w:val="2D3436"/>
+                <w:sz w:val="19"/>
+                <w:szCs w:val="19"/>
+              </w:rPr>
+              <w:t xml:space="preserve">Verifying employers are real registered businesses</w:t>
+            </w:r>
+          </w:p>
+        </w:tc>
+      </w:tr>
+      <w:tr>
+        <w:tc>
+          <w:tcPr>
+            <w:tcW w:type="dxa" w:w="3400"/>
+            <w:tcBorders>
+              <w:top w:val="single" w:color="D8CDB4" w:sz="1"/>
+              <w:left w:val="single" w:color="D8CDB4" w:sz="1"/>
+              <w:bottom w:val="single" w:color="D8CDB4" w:sz="1"/>
+              <w:right w:val="single" w:color="D8CDB4" w:sz="1"/>
+            </w:tcBorders>
+            <w:shd w:fill="FFFFFF" w:val="clear"/>
+            <w:tcMar>
+              <w:top w:type="dxa" w:w="70"/>
+              <w:left w:type="dxa" w:w="110"/>
+              <w:bottom w:type="dxa" w:w="70"/>
+              <w:right w:type="dxa" w:w="110"/>
+            </w:tcMar>
+          </w:tcPr>
+          <w:p>
+            <w:pPr>
+              <w:spacing w:after="0" w:line="250"/>
+            </w:pPr>
+            <w:r>
+              <w:rPr>
+                <w:rFonts w:ascii="Arial" w:cs="Arial" w:eastAsia="Arial" w:hAnsi="Arial"/>
+                <w:b w:val="false"/>
+                <w:bCs w:val="false"/>
+                <w:color w:val="2D3436"/>
+                <w:sz w:val="19"/>
+                <w:szCs w:val="19"/>
+              </w:rPr>
+              <w:t xml:space="preserve">EPF (KWSP) / SOCSO contribution continuity</w:t>
+            </w:r>
+          </w:p>
+        </w:tc>
+        <w:tc>
+          <w:tcPr>
+            <w:tcW w:type="dxa" w:w="5626"/>
+            <w:tcBorders>
+              <w:top w:val="single" w:color="D8CDB4" w:sz="1"/>
+              <w:left w:val="single" w:color="D8CDB4" w:sz="1"/>
+              <w:bottom w:val="single" w:color="D8CDB4" w:sz="1"/>
+              <w:right w:val="single" w:color="D8CDB4" w:sz="1"/>
+            </w:tcBorders>
+            <w:shd w:fill="FFFFFF" w:val="clear"/>
+            <w:tcMar>
+              <w:top w:type="dxa" w:w="70"/>
+              <w:left w:type="dxa" w:w="110"/>
+              <w:bottom w:type="dxa" w:w="70"/>
+              <w:right w:type="dxa" w:w="110"/>
+            </w:tcMar>
+          </w:tcPr>
+          <w:p>
+            <w:pPr>
+              <w:spacing w:after="0" w:line="250"/>
+            </w:pPr>
+            <w:r>
+              <w:rPr>
+                <w:rFonts w:ascii="Arial" w:cs="Arial" w:eastAsia="Arial" w:hAnsi="Arial"/>
+                <w:b w:val="false"/>
+                <w:bCs w:val="false"/>
+                <w:color w:val="2D3436"/>
+                <w:sz w:val="19"/>
+                <w:szCs w:val="19"/>
+              </w:rPr>
+              <w:t xml:space="preserve">Retention — see below</w:t>
+            </w:r>
+          </w:p>
+        </w:tc>
+      </w:tr>
+    </w:tbl>
+    <w:p>
+      <w:pPr>
+        <w:pBdr>
+          <w:left w:val="single" w:color="8A6D1F" w:sz="18" w:space="8"/>
+        </w:pBdr>
+        <w:shd w:fill="F2EFE6" w:val="clear"/>
+        <w:spacing w:after="160" w:before="80" w:line="268"/>
+        <w:ind w:left="220" w:right="160"/>
+      </w:pPr>
+      <w:r>
+        <w:rPr>
+          <w:rFonts w:ascii="Arial" w:cs="Arial" w:eastAsia="Arial" w:hAnsi="Arial"/>
+          <w:i/>
+          <w:iCs/>
+          <w:color w:val="2D3436"/>
+          <w:sz w:val="21"/>
+          <w:szCs w:val="21"/>
+        </w:rPr>
+        <w:t xml:space="preserve">How we would actually measure "Speed vs Stickiness." Retention is the metric nobody tracks today, and it is measurable: if a graduate’s EPF or SOCSO contributions from one employer stop after five months, they left that job. Combined with 6- and 12-month follow-up surveys through the existing tracer-study channel, this produces a real national retention figure. This requires a government data-sharing agreement — which is precisely why it belongs to a Talentbank-scale platform rather than a startup.</w:t>
+      </w:r>
+    </w:p>
+    <w:p>
+      <w:pPr>
+        <w:pStyle w:val="Heading3"/>
+        <w:spacing w:after="70" w:before="200"/>
+      </w:pPr>
+      <w:r>
+        <w:rPr>
+          <w:rFonts w:ascii="Arial" w:cs="Arial" w:eastAsia="Arial" w:hAnsi="Arial"/>
+          <w:b/>
+          <w:bCs/>
+          <w:color w:val="8A6D1F"/>
+          <w:sz w:val="22"/>
+          <w:szCs w:val="22"/>
+        </w:rPr>
+        <w:t xml:space="preserve">C. Commercial APIs</w:t>
+      </w:r>
+    </w:p>
+    <w:tbl>
+      <w:tblPr>
+        <w:tblW w:type="dxa" w:w="9026"/>
+        <w:tblBorders>
+          <w:top w:val="single" w:color="auto" w:sz="4"/>
+          <w:left w:val="single" w:color="auto" w:sz="4"/>
+          <w:bottom w:val="single" w:color="auto" w:sz="4"/>
+          <w:right w:val="single" w:color="auto" w:sz="4"/>
+          <w:insideH w:val="single" w:color="auto" w:sz="4"/>
+          <w:insideV w:val="single" w:color="auto" w:sz="4"/>
+        </w:tblBorders>
+      </w:tblPr>
+      <w:tblGrid>
+        <w:gridCol w:w="3400"/>
+        <w:gridCol w:w="5626"/>
+      </w:tblGrid>
+      <w:tr>
+        <w:trPr>
+          <w:tblHeader/>
+        </w:trPr>
+        <w:tc>
+          <w:tcPr>
+            <w:tcW w:type="dxa" w:w="3400"/>
+            <w:tcBorders>
+              <w:top w:val="single" w:color="D8CDB4" w:sz="1"/>
+              <w:left w:val="single" w:color="D8CDB4" w:sz="1"/>
+              <w:bottom w:val="single" w:color="D8CDB4" w:sz="1"/>
+              <w:right w:val="single" w:color="D8CDB4" w:sz="1"/>
+            </w:tcBorders>
+            <w:shd w:fill="8A6D1F" w:val="clear"/>
+            <w:tcMar>
+              <w:top w:type="dxa" w:w="70"/>
+              <w:left w:type="dxa" w:w="110"/>
+              <w:bottom w:type="dxa" w:w="70"/>
+              <w:right w:type="dxa" w:w="110"/>
+            </w:tcMar>
+          </w:tcPr>
+          <w:p>
+            <w:pPr>
+              <w:spacing w:after="0" w:line="250"/>
+            </w:pPr>
+            <w:r>
+              <w:rPr>
+                <w:rFonts w:ascii="Arial" w:cs="Arial" w:eastAsia="Arial" w:hAnsi="Arial"/>
+                <w:b/>
+                <w:bCs/>
+                <w:color w:val="FFFFFF"/>
+                <w:sz w:val="19"/>
+                <w:szCs w:val="19"/>
+              </w:rPr>
+              <w:t xml:space="preserve">Service</w:t>
+            </w:r>
+          </w:p>
+        </w:tc>
+        <w:tc>
+          <w:tcPr>
+            <w:tcW w:type="dxa" w:w="5626"/>
+            <w:tcBorders>
+              <w:top w:val="single" w:color="D8CDB4" w:sz="1"/>
+              <w:left w:val="single" w:color="D8CDB4" w:sz="1"/>
+              <w:bottom w:val="single" w:color="D8CDB4" w:sz="1"/>
+              <w:right w:val="single" w:color="D8CDB4" w:sz="1"/>
+            </w:tcBorders>
+            <w:shd w:fill="8A6D1F" w:val="clear"/>
+            <w:tcMar>
+              <w:top w:type="dxa" w:w="70"/>
+              <w:left w:type="dxa" w:w="110"/>
+              <w:bottom w:type="dxa" w:w="70"/>
+              <w:right w:type="dxa" w:w="110"/>
+            </w:tcMar>
+          </w:tcPr>
+          <w:p>
+            <w:pPr>
+              <w:spacing w:after="0" w:line="250"/>
+            </w:pPr>
+            <w:r>
+              <w:rPr>
+                <w:rFonts w:ascii="Arial" w:cs="Arial" w:eastAsia="Arial" w:hAnsi="Arial"/>
+                <w:b/>
+                <w:bCs/>
+                <w:color w:val="FFFFFF"/>
+                <w:sz w:val="19"/>
+                <w:szCs w:val="19"/>
+              </w:rPr>
+              <w:t xml:space="preserve">What it powers</w:t>
+            </w:r>
+          </w:p>
+        </w:tc>
+      </w:tr>
+      <w:tr>
+        <w:tc>
+          <w:tcPr>
+            <w:tcW w:type="dxa" w:w="3400"/>
+            <w:tcBorders>
+              <w:top w:val="single" w:color="D8CDB4" w:sz="1"/>
+              <w:left w:val="single" w:color="D8CDB4" w:sz="1"/>
+              <w:bottom w:val="single" w:color="D8CDB4" w:sz="1"/>
+              <w:right w:val="single" w:color="D8CDB4" w:sz="1"/>
+            </w:tcBorders>
+            <w:shd w:fill="FFFFFF" w:val="clear"/>
+            <w:tcMar>
+              <w:top w:type="dxa" w:w="70"/>
+              <w:left w:type="dxa" w:w="110"/>
+              <w:bottom w:type="dxa" w:w="70"/>
+              <w:right w:type="dxa" w:w="110"/>
+            </w:tcMar>
+          </w:tcPr>
+          <w:p>
+            <w:pPr>
+              <w:spacing w:after="0" w:line="250"/>
+            </w:pPr>
+            <w:r>
+              <w:rPr>
+                <w:rFonts w:ascii="Arial" w:cs="Arial" w:eastAsia="Arial" w:hAnsi="Arial"/>
+                <w:b w:val="false"/>
+                <w:bCs w:val="false"/>
+                <w:color w:val="2D3436"/>
+                <w:sz w:val="19"/>
+                <w:szCs w:val="19"/>
+              </w:rPr>
+              <w:t xml:space="preserve">Textkernel / Sovren, Affinda or RChilli</w:t>
+            </w:r>
+          </w:p>
+        </w:tc>
+        <w:tc>
+          <w:tcPr>
+            <w:tcW w:type="dxa" w:w="5626"/>
+            <w:tcBorders>
+              <w:top w:val="single" w:color="D8CDB4" w:sz="1"/>
+              <w:left w:val="single" w:color="D8CDB4" w:sz="1"/>
+              <w:bottom w:val="single" w:color="D8CDB4" w:sz="1"/>
+              <w:right w:val="single" w:color="D8CDB4" w:sz="1"/>
+            </w:tcBorders>
+            <w:shd w:fill="FFFFFF" w:val="clear"/>
+            <w:tcMar>
+              <w:top w:type="dxa" w:w="70"/>
+              <w:left w:type="dxa" w:w="110"/>
+              <w:bottom w:type="dxa" w:w="70"/>
+              <w:right w:type="dxa" w:w="110"/>
+            </w:tcMar>
+          </w:tcPr>
+          <w:p>
+            <w:pPr>
+              <w:spacing w:after="0" w:line="250"/>
+            </w:pPr>
+            <w:r>
+              <w:rPr>
+                <w:rFonts w:ascii="Arial" w:cs="Arial" w:eastAsia="Arial" w:hAnsi="Arial"/>
+                <w:b w:val="false"/>
+                <w:bCs w:val="false"/>
+                <w:color w:val="2D3436"/>
+                <w:sz w:val="19"/>
+                <w:szCs w:val="19"/>
+              </w:rPr>
+              <w:t xml:space="preserve">Real ATS resume parsing and scoring</w:t>
+            </w:r>
+          </w:p>
+        </w:tc>
+      </w:tr>
+      <w:tr>
+        <w:tc>
+          <w:tcPr>
+            <w:tcW w:type="dxa" w:w="3400"/>
+            <w:tcBorders>
+              <w:top w:val="single" w:color="D8CDB4" w:sz="1"/>
+              <w:left w:val="single" w:color="D8CDB4" w:sz="1"/>
+              <w:bottom w:val="single" w:color="D8CDB4" w:sz="1"/>
+              <w:right w:val="single" w:color="D8CDB4" w:sz="1"/>
+            </w:tcBorders>
+            <w:shd w:fill="FBF9F3" w:val="clear"/>
+            <w:tcMar>
+              <w:top w:type="dxa" w:w="70"/>
+              <w:left w:type="dxa" w:w="110"/>
+              <w:bottom w:type="dxa" w:w="70"/>
+              <w:right w:type="dxa" w:w="110"/>
+            </w:tcMar>
+          </w:tcPr>
+          <w:p>
+            <w:pPr>
+              <w:spacing w:after="0" w:line="250"/>
+            </w:pPr>
+            <w:r>
+              <w:rPr>
+                <w:rFonts w:ascii="Arial" w:cs="Arial" w:eastAsia="Arial" w:hAnsi="Arial"/>
+                <w:b w:val="false"/>
+                <w:bCs w:val="false"/>
+                <w:color w:val="2D3436"/>
+                <w:sz w:val="19"/>
+                <w:szCs w:val="19"/>
+              </w:rPr>
+              <w:t xml:space="preserve">JobStreet (SEEK) partner feed</w:t>
+            </w:r>
+          </w:p>
+        </w:tc>
+        <w:tc>
+          <w:tcPr>
+            <w:tcW w:type="dxa" w:w="5626"/>
+            <w:tcBorders>
+              <w:top w:val="single" w:color="D8CDB4" w:sz="1"/>
+              <w:left w:val="single" w:color="D8CDB4" w:sz="1"/>
+              <w:bottom w:val="single" w:color="D8CDB4" w:sz="1"/>
+              <w:right w:val="single" w:color="D8CDB4" w:sz="1"/>
+            </w:tcBorders>
+            <w:shd w:fill="FBF9F3" w:val="clear"/>
+            <w:tcMar>
+              <w:top w:type="dxa" w:w="70"/>
+              <w:left w:type="dxa" w:w="110"/>
+              <w:bottom w:type="dxa" w:w="70"/>
+              <w:right w:type="dxa" w:w="110"/>
+            </w:tcMar>
+          </w:tcPr>
+          <w:p>
+            <w:pPr>
+              <w:spacing w:after="0" w:line="250"/>
+            </w:pPr>
+            <w:r>
+              <w:rPr>
+                <w:rFonts w:ascii="Arial" w:cs="Arial" w:eastAsia="Arial" w:hAnsi="Arial"/>
+                <w:b w:val="false"/>
+                <w:bCs w:val="false"/>
+                <w:color w:val="2D3436"/>
+                <w:sz w:val="19"/>
+                <w:szCs w:val="19"/>
+              </w:rPr>
+              <w:t xml:space="preserve">Supplementary job listings beyond Talentbank’s own network</w:t>
+            </w:r>
+          </w:p>
+        </w:tc>
+      </w:tr>
+      <w:tr>
+        <w:tc>
+          <w:tcPr>
+            <w:tcW w:type="dxa" w:w="3400"/>
+            <w:tcBorders>
+              <w:top w:val="single" w:color="D8CDB4" w:sz="1"/>
+              <w:left w:val="single" w:color="D8CDB4" w:sz="1"/>
+              <w:bottom w:val="single" w:color="D8CDB4" w:sz="1"/>
+              <w:right w:val="single" w:color="D8CDB4" w:sz="1"/>
+            </w:tcBorders>
+            <w:shd w:fill="FFFFFF" w:val="clear"/>
+            <w:tcMar>
+              <w:top w:type="dxa" w:w="70"/>
+              <w:left w:type="dxa" w:w="110"/>
+              <w:bottom w:type="dxa" w:w="70"/>
+              <w:right w:type="dxa" w:w="110"/>
+            </w:tcMar>
+          </w:tcPr>
+          <w:p>
+            <w:pPr>
+              <w:spacing w:after="0" w:line="250"/>
+            </w:pPr>
+            <w:r>
+              <w:rPr>
+                <w:rFonts w:ascii="Arial" w:cs="Arial" w:eastAsia="Arial" w:hAnsi="Arial"/>
+                <w:b w:val="false"/>
+                <w:bCs w:val="false"/>
+                <w:color w:val="2D3436"/>
+                <w:sz w:val="19"/>
+                <w:szCs w:val="19"/>
+              </w:rPr>
+              <w:t xml:space="preserve">Anthropic Claude API</w:t>
+            </w:r>
+          </w:p>
+        </w:tc>
+        <w:tc>
+          <w:tcPr>
+            <w:tcW w:type="dxa" w:w="5626"/>
+            <w:tcBorders>
+              <w:top w:val="single" w:color="D8CDB4" w:sz="1"/>
+              <w:left w:val="single" w:color="D8CDB4" w:sz="1"/>
+              <w:bottom w:val="single" w:color="D8CDB4" w:sz="1"/>
+              <w:right w:val="single" w:color="D8CDB4" w:sz="1"/>
+            </w:tcBorders>
+            <w:shd w:fill="FFFFFF" w:val="clear"/>
+            <w:tcMar>
+              <w:top w:type="dxa" w:w="70"/>
+              <w:left w:type="dxa" w:w="110"/>
+              <w:bottom w:type="dxa" w:w="70"/>
+              <w:right w:type="dxa" w:w="110"/>
+            </w:tcMar>
+          </w:tcPr>
+          <w:p>
+            <w:pPr>
+              <w:spacing w:after="0" w:line="250"/>
+            </w:pPr>
+            <w:r>
+              <w:rPr>
+                <w:rFonts w:ascii="Arial" w:cs="Arial" w:eastAsia="Arial" w:hAnsi="Arial"/>
+                <w:b w:val="false"/>
+                <w:bCs w:val="false"/>
+                <w:color w:val="2D3436"/>
+                <w:sz w:val="19"/>
+                <w:szCs w:val="19"/>
+              </w:rPr>
+              <w:t xml:space="preserve">SIFU coaching (already live), resume feedback, insight generation</w:t>
+            </w:r>
+          </w:p>
+        </w:tc>
+      </w:tr>
+      <w:tr>
+        <w:tc>
+          <w:tcPr>
+            <w:tcW w:type="dxa" w:w="3400"/>
+            <w:tcBorders>
+              <w:top w:val="single" w:color="D8CDB4" w:sz="1"/>
+              <w:left w:val="single" w:color="D8CDB4" w:sz="1"/>
+              <w:bottom w:val="single" w:color="D8CDB4" w:sz="1"/>
+              <w:right w:val="single" w:color="D8CDB4" w:sz="1"/>
+            </w:tcBorders>
+            <w:shd w:fill="FBF9F3" w:val="clear"/>
+            <w:tcMar>
+              <w:top w:type="dxa" w:w="70"/>
+              <w:left w:type="dxa" w:w="110"/>
+              <w:bottom w:type="dxa" w:w="70"/>
+              <w:right w:type="dxa" w:w="110"/>
+            </w:tcMar>
+          </w:tcPr>
+          <w:p>
+            <w:pPr>
+              <w:spacing w:after="0" w:line="250"/>
+            </w:pPr>
+            <w:r>
+              <w:rPr>
+                <w:rFonts w:ascii="Arial" w:cs="Arial" w:eastAsia="Arial" w:hAnsi="Arial"/>
+                <w:b w:val="false"/>
+                <w:bCs w:val="false"/>
+                <w:color w:val="2D3436"/>
+                <w:sz w:val="19"/>
+                <w:szCs w:val="19"/>
+              </w:rPr>
+              <w:t xml:space="preserve">Mux / Cloudflare Stream</w:t>
+            </w:r>
+          </w:p>
+        </w:tc>
+        <w:tc>
+          <w:tcPr>
+            <w:tcW w:type="dxa" w:w="5626"/>
+            <w:tcBorders>
+              <w:top w:val="single" w:color="D8CDB4" w:sz="1"/>
+              <w:left w:val="single" w:color="D8CDB4" w:sz="1"/>
+              <w:bottom w:val="single" w:color="D8CDB4" w:sz="1"/>
+              <w:right w:val="single" w:color="D8CDB4" w:sz="1"/>
+            </w:tcBorders>
+            <w:shd w:fill="FBF9F3" w:val="clear"/>
+            <w:tcMar>
+              <w:top w:type="dxa" w:w="70"/>
+              <w:left w:type="dxa" w:w="110"/>
+              <w:bottom w:type="dxa" w:w="70"/>
+              <w:right w:type="dxa" w:w="110"/>
+            </w:tcMar>
+          </w:tcPr>
+          <w:p>
+            <w:pPr>
+              <w:spacing w:after="0" w:line="250"/>
+            </w:pPr>
+            <w:r>
+              <w:rPr>
+                <w:rFonts w:ascii="Arial" w:cs="Arial" w:eastAsia="Arial" w:hAnsi="Arial"/>
+                <w:b w:val="false"/>
+                <w:bCs w:val="false"/>
+                <w:color w:val="2D3436"/>
+                <w:sz w:val="19"/>
+                <w:szCs w:val="19"/>
+              </w:rPr>
+              <w:t xml:space="preserve">Story Video hosting and playback</w:t>
+            </w:r>
+          </w:p>
+        </w:tc>
+      </w:tr>
+    </w:tbl>
+    <w:p>
+      <w:pPr>
+        <w:pStyle w:val="Heading3"/>
+        <w:spacing w:after="70" w:before="200"/>
+      </w:pPr>
+      <w:r>
+        <w:rPr>
+          <w:rFonts w:ascii="Arial" w:cs="Arial" w:eastAsia="Arial" w:hAnsi="Arial"/>
+          <w:b/>
+          <w:bCs/>
+          <w:color w:val="8A6D1F"/>
+          <w:sz w:val="22"/>
+          <w:szCs w:val="22"/>
+        </w:rPr>
+        <w:t xml:space="preserve">D. Platform-native data — we generate it ourselves</w:t>
+      </w:r>
+    </w:p>
+    <w:p>
+      <w:pPr>
+        <w:spacing w:after="110" w:line="268"/>
+      </w:pPr>
+      <w:r>
+        <w:rPr>
+          <w:rFonts w:ascii="Arial" w:cs="Arial" w:eastAsia="Arial" w:hAnsi="Arial"/>
+          <w:color w:val="2D3436"/>
+          <w:sz w:val="21"/>
+          <w:szCs w:val="21"/>
+        </w:rPr>
+        <w:t xml:space="preserve">Some of the most valuable data has no external source, because nobody collects it today. This is proprietary from day one:</w:t>
       </w:r>
     </w:p>
     <w:p>
@@ -5846,11 +7919,2277 @@
       <w:r>
         <w:rPr>
           <w:rFonts w:ascii="Arial" w:cs="Arial" w:eastAsia="Arial" w:hAnsi="Arial"/>
-          <w:color w:val="2D3436"/>
-          <w:sz w:val="21"/>
-          <w:szCs w:val="21"/>
-        </w:rPr>
-        <w:t xml:space="preserve">University data pipelines feeding real tracer-study reporting</w:t>
+          <w:b/>
+          <w:bCs/>
+          <w:color w:val="2D3436"/>
+          <w:sz w:val="21"/>
+          <w:szCs w:val="21"/>
+        </w:rPr>
+        <w:t xml:space="preserve">Anti-Ghost scores</w:t>
+      </w:r>
+      <w:r>
+        <w:rPr>
+          <w:rFonts w:ascii="Arial" w:cs="Arial" w:eastAsia="Arial" w:hAnsi="Arial"/>
+          <w:color w:val="2D3436"/>
+          <w:sz w:val="21"/>
+          <w:szCs w:val="21"/>
+        </w:rPr>
+        <w:t xml:space="preserve"> — computed from real employer response timestamps inside the platform</w:t>
+      </w:r>
+    </w:p>
+    <w:p>
+      <w:pPr>
+        <w:pStyle w:val="ListParagraph"/>
+        <w:numPr>
+          <w:ilvl w:val="0"/>
+          <w:numId w:val="3"/>
+        </w:numPr>
+        <w:spacing w:after="55" w:line="260"/>
+      </w:pPr>
+      <w:r>
+        <w:rPr>
+          <w:rFonts w:ascii="Arial" w:cs="Arial" w:eastAsia="Arial" w:hAnsi="Arial"/>
+          <w:b/>
+          <w:bCs/>
+          <w:color w:val="2D3436"/>
+          <w:sz w:val="21"/>
+          <w:szCs w:val="21"/>
+        </w:rPr>
+        <w:t xml:space="preserve">Career Readiness Scores</w:t>
+      </w:r>
+      <w:r>
+        <w:rPr>
+          <w:rFonts w:ascii="Arial" w:cs="Arial" w:eastAsia="Arial" w:hAnsi="Arial"/>
+          <w:color w:val="2D3436"/>
+          <w:sz w:val="21"/>
+          <w:szCs w:val="21"/>
+        </w:rPr>
+        <w:t xml:space="preserve"> — the same formula, run on real resumes, real applications and verified portfolios</w:t>
+      </w:r>
+    </w:p>
+    <w:p>
+      <w:pPr>
+        <w:pStyle w:val="ListParagraph"/>
+        <w:numPr>
+          <w:ilvl w:val="0"/>
+          <w:numId w:val="3"/>
+        </w:numPr>
+        <w:spacing w:after="55" w:line="260"/>
+      </w:pPr>
+      <w:r>
+        <w:rPr>
+          <w:rFonts w:ascii="Arial" w:cs="Arial" w:eastAsia="Arial" w:hAnsi="Arial"/>
+          <w:b/>
+          <w:bCs/>
+          <w:color w:val="2D3436"/>
+          <w:sz w:val="21"/>
+          <w:szCs w:val="21"/>
+        </w:rPr>
+        <w:t xml:space="preserve">Match Score outcomes</w:t>
+      </w:r>
+      <w:r>
+        <w:rPr>
+          <w:rFonts w:ascii="Arial" w:cs="Arial" w:eastAsia="Arial" w:hAnsi="Arial"/>
+          <w:color w:val="2D3436"/>
+          <w:sz w:val="21"/>
+          <w:szCs w:val="21"/>
+        </w:rPr>
+        <w:t xml:space="preserve"> — which predicted matches actually converted to hires, used to tune the weightings</w:t>
+      </w:r>
+    </w:p>
+    <w:p>
+      <w:pPr>
+        <w:pStyle w:val="Heading2"/>
+        <w:spacing w:after="90" w:before="260"/>
+      </w:pPr>
+      <w:r>
+        <w:rPr>
+          <w:rFonts w:ascii="Arial" w:cs="Arial" w:eastAsia="Arial" w:hAnsi="Arial"/>
+          <w:b/>
+          <w:bCs/>
+          <w:color w:val="C0392B"/>
+          <w:sz w:val="24"/>
+          <w:szCs w:val="24"/>
+        </w:rPr>
+        <w:t xml:space="preserve">Module-by-module: prototype → production</w:t>
+      </w:r>
+    </w:p>
+    <w:tbl>
+      <w:tblPr>
+        <w:tblW w:type="dxa" w:w="9026"/>
+        <w:tblBorders>
+          <w:top w:val="single" w:color="auto" w:sz="4"/>
+          <w:left w:val="single" w:color="auto" w:sz="4"/>
+          <w:bottom w:val="single" w:color="auto" w:sz="4"/>
+          <w:right w:val="single" w:color="auto" w:sz="4"/>
+          <w:insideH w:val="single" w:color="auto" w:sz="4"/>
+          <w:insideV w:val="single" w:color="auto" w:sz="4"/>
+        </w:tblBorders>
+      </w:tblPr>
+      <w:tblGrid>
+        <w:gridCol w:w="2200"/>
+        <w:gridCol w:w="2600"/>
+        <w:gridCol w:w="4226"/>
+      </w:tblGrid>
+      <w:tr>
+        <w:trPr>
+          <w:tblHeader/>
+        </w:trPr>
+        <w:tc>
+          <w:tcPr>
+            <w:tcW w:type="dxa" w:w="2200"/>
+            <w:tcBorders>
+              <w:top w:val="single" w:color="D8CDB4" w:sz="1"/>
+              <w:left w:val="single" w:color="D8CDB4" w:sz="1"/>
+              <w:bottom w:val="single" w:color="D8CDB4" w:sz="1"/>
+              <w:right w:val="single" w:color="D8CDB4" w:sz="1"/>
+            </w:tcBorders>
+            <w:shd w:fill="8A6D1F" w:val="clear"/>
+            <w:tcMar>
+              <w:top w:type="dxa" w:w="70"/>
+              <w:left w:type="dxa" w:w="110"/>
+              <w:bottom w:type="dxa" w:w="70"/>
+              <w:right w:type="dxa" w:w="110"/>
+            </w:tcMar>
+          </w:tcPr>
+          <w:p>
+            <w:pPr>
+              <w:spacing w:after="0" w:line="250"/>
+            </w:pPr>
+            <w:r>
+              <w:rPr>
+                <w:rFonts w:ascii="Arial" w:cs="Arial" w:eastAsia="Arial" w:hAnsi="Arial"/>
+                <w:b/>
+                <w:bCs/>
+                <w:color w:val="FFFFFF"/>
+                <w:sz w:val="19"/>
+                <w:szCs w:val="19"/>
+              </w:rPr>
+              <w:t xml:space="preserve">Module</w:t>
+            </w:r>
+          </w:p>
+        </w:tc>
+        <w:tc>
+          <w:tcPr>
+            <w:tcW w:type="dxa" w:w="2600"/>
+            <w:tcBorders>
+              <w:top w:val="single" w:color="D8CDB4" w:sz="1"/>
+              <w:left w:val="single" w:color="D8CDB4" w:sz="1"/>
+              <w:bottom w:val="single" w:color="D8CDB4" w:sz="1"/>
+              <w:right w:val="single" w:color="D8CDB4" w:sz="1"/>
+            </w:tcBorders>
+            <w:shd w:fill="8A6D1F" w:val="clear"/>
+            <w:tcMar>
+              <w:top w:type="dxa" w:w="70"/>
+              <w:left w:type="dxa" w:w="110"/>
+              <w:bottom w:type="dxa" w:w="70"/>
+              <w:right w:type="dxa" w:w="110"/>
+            </w:tcMar>
+          </w:tcPr>
+          <w:p>
+            <w:pPr>
+              <w:spacing w:after="0" w:line="250"/>
+            </w:pPr>
+            <w:r>
+              <w:rPr>
+                <w:rFonts w:ascii="Arial" w:cs="Arial" w:eastAsia="Arial" w:hAnsi="Arial"/>
+                <w:b/>
+                <w:bCs/>
+                <w:color w:val="FFFFFF"/>
+                <w:sz w:val="19"/>
+                <w:szCs w:val="19"/>
+              </w:rPr>
+              <w:t xml:space="preserve">Today (prototype)</w:t>
+            </w:r>
+          </w:p>
+        </w:tc>
+        <w:tc>
+          <w:tcPr>
+            <w:tcW w:type="dxa" w:w="4226"/>
+            <w:tcBorders>
+              <w:top w:val="single" w:color="D8CDB4" w:sz="1"/>
+              <w:left w:val="single" w:color="D8CDB4" w:sz="1"/>
+              <w:bottom w:val="single" w:color="D8CDB4" w:sz="1"/>
+              <w:right w:val="single" w:color="D8CDB4" w:sz="1"/>
+            </w:tcBorders>
+            <w:shd w:fill="8A6D1F" w:val="clear"/>
+            <w:tcMar>
+              <w:top w:type="dxa" w:w="70"/>
+              <w:left w:type="dxa" w:w="110"/>
+              <w:bottom w:type="dxa" w:w="70"/>
+              <w:right w:type="dxa" w:w="110"/>
+            </w:tcMar>
+          </w:tcPr>
+          <w:p>
+            <w:pPr>
+              <w:spacing w:after="0" w:line="250"/>
+            </w:pPr>
+            <w:r>
+              <w:rPr>
+                <w:rFonts w:ascii="Arial" w:cs="Arial" w:eastAsia="Arial" w:hAnsi="Arial"/>
+                <w:b/>
+                <w:bCs/>
+                <w:color w:val="FFFFFF"/>
+                <w:sz w:val="19"/>
+                <w:szCs w:val="19"/>
+              </w:rPr>
+              <w:t xml:space="preserve">In production</w:t>
+            </w:r>
+          </w:p>
+        </w:tc>
+      </w:tr>
+      <w:tr>
+        <w:tc>
+          <w:tcPr>
+            <w:tcW w:type="dxa" w:w="2200"/>
+            <w:tcBorders>
+              <w:top w:val="single" w:color="D8CDB4" w:sz="1"/>
+              <w:left w:val="single" w:color="D8CDB4" w:sz="1"/>
+              <w:bottom w:val="single" w:color="D8CDB4" w:sz="1"/>
+              <w:right w:val="single" w:color="D8CDB4" w:sz="1"/>
+            </w:tcBorders>
+            <w:shd w:fill="FFFFFF" w:val="clear"/>
+            <w:tcMar>
+              <w:top w:type="dxa" w:w="70"/>
+              <w:left w:type="dxa" w:w="110"/>
+              <w:bottom w:type="dxa" w:w="70"/>
+              <w:right w:type="dxa" w:w="110"/>
+            </w:tcMar>
+          </w:tcPr>
+          <w:p>
+            <w:pPr>
+              <w:spacing w:after="0" w:line="250"/>
+            </w:pPr>
+            <w:r>
+              <w:rPr>
+                <w:rFonts w:ascii="Arial" w:cs="Arial" w:eastAsia="Arial" w:hAnsi="Arial"/>
+                <w:b w:val="false"/>
+                <w:bCs w:val="false"/>
+                <w:color w:val="2D3436"/>
+                <w:sz w:val="19"/>
+                <w:szCs w:val="19"/>
+              </w:rPr>
+              <w:t xml:space="preserve">Job Search &amp; Match</w:t>
+            </w:r>
+          </w:p>
+        </w:tc>
+        <w:tc>
+          <w:tcPr>
+            <w:tcW w:type="dxa" w:w="2600"/>
+            <w:tcBorders>
+              <w:top w:val="single" w:color="D8CDB4" w:sz="1"/>
+              <w:left w:val="single" w:color="D8CDB4" w:sz="1"/>
+              <w:bottom w:val="single" w:color="D8CDB4" w:sz="1"/>
+              <w:right w:val="single" w:color="D8CDB4" w:sz="1"/>
+            </w:tcBorders>
+            <w:shd w:fill="FFFFFF" w:val="clear"/>
+            <w:tcMar>
+              <w:top w:type="dxa" w:w="70"/>
+              <w:left w:type="dxa" w:w="110"/>
+              <w:bottom w:type="dxa" w:w="70"/>
+              <w:right w:type="dxa" w:w="110"/>
+            </w:tcMar>
+          </w:tcPr>
+          <w:p>
+            <w:pPr>
+              <w:spacing w:after="0" w:line="250"/>
+            </w:pPr>
+            <w:r>
+              <w:rPr>
+                <w:rFonts w:ascii="Arial" w:cs="Arial" w:eastAsia="Arial" w:hAnsi="Arial"/>
+                <w:b w:val="false"/>
+                <w:bCs w:val="false"/>
+                <w:color w:val="2D3436"/>
+                <w:sz w:val="19"/>
+                <w:szCs w:val="19"/>
+              </w:rPr>
+              <w:t xml:space="preserve">mockJobs</w:t>
+            </w:r>
+          </w:p>
+        </w:tc>
+        <w:tc>
+          <w:tcPr>
+            <w:tcW w:type="dxa" w:w="4226"/>
+            <w:tcBorders>
+              <w:top w:val="single" w:color="D8CDB4" w:sz="1"/>
+              <w:left w:val="single" w:color="D8CDB4" w:sz="1"/>
+              <w:bottom w:val="single" w:color="D8CDB4" w:sz="1"/>
+              <w:right w:val="single" w:color="D8CDB4" w:sz="1"/>
+            </w:tcBorders>
+            <w:shd w:fill="FFFFFF" w:val="clear"/>
+            <w:tcMar>
+              <w:top w:type="dxa" w:w="70"/>
+              <w:left w:type="dxa" w:w="110"/>
+              <w:bottom w:type="dxa" w:w="70"/>
+              <w:right w:type="dxa" w:w="110"/>
+            </w:tcMar>
+          </w:tcPr>
+          <w:p>
+            <w:pPr>
+              <w:spacing w:after="0" w:line="250"/>
+            </w:pPr>
+            <w:r>
+              <w:rPr>
+                <w:rFonts w:ascii="Arial" w:cs="Arial" w:eastAsia="Arial" w:hAnsi="Arial"/>
+                <w:b w:val="false"/>
+                <w:bCs w:val="false"/>
+                <w:color w:val="2D3436"/>
+                <w:sz w:val="19"/>
+                <w:szCs w:val="19"/>
+              </w:rPr>
+              <w:t xml:space="preserve">Talentbank employer network + JobStreet partner feed + MyFutureJobs</w:t>
+            </w:r>
+          </w:p>
+        </w:tc>
+      </w:tr>
+      <w:tr>
+        <w:tc>
+          <w:tcPr>
+            <w:tcW w:type="dxa" w:w="2200"/>
+            <w:tcBorders>
+              <w:top w:val="single" w:color="D8CDB4" w:sz="1"/>
+              <w:left w:val="single" w:color="D8CDB4" w:sz="1"/>
+              <w:bottom w:val="single" w:color="D8CDB4" w:sz="1"/>
+              <w:right w:val="single" w:color="D8CDB4" w:sz="1"/>
+            </w:tcBorders>
+            <w:shd w:fill="FBF9F3" w:val="clear"/>
+            <w:tcMar>
+              <w:top w:type="dxa" w:w="70"/>
+              <w:left w:type="dxa" w:w="110"/>
+              <w:bottom w:type="dxa" w:w="70"/>
+              <w:right w:type="dxa" w:w="110"/>
+            </w:tcMar>
+          </w:tcPr>
+          <w:p>
+            <w:pPr>
+              <w:spacing w:after="0" w:line="250"/>
+            </w:pPr>
+            <w:r>
+              <w:rPr>
+                <w:rFonts w:ascii="Arial" w:cs="Arial" w:eastAsia="Arial" w:hAnsi="Arial"/>
+                <w:b w:val="false"/>
+                <w:bCs w:val="false"/>
+                <w:color w:val="2D3436"/>
+                <w:sz w:val="19"/>
+                <w:szCs w:val="19"/>
+              </w:rPr>
+              <w:t xml:space="preserve">Career Readiness Score</w:t>
+            </w:r>
+          </w:p>
+        </w:tc>
+        <w:tc>
+          <w:tcPr>
+            <w:tcW w:type="dxa" w:w="2600"/>
+            <w:tcBorders>
+              <w:top w:val="single" w:color="D8CDB4" w:sz="1"/>
+              <w:left w:val="single" w:color="D8CDB4" w:sz="1"/>
+              <w:bottom w:val="single" w:color="D8CDB4" w:sz="1"/>
+              <w:right w:val="single" w:color="D8CDB4" w:sz="1"/>
+            </w:tcBorders>
+            <w:shd w:fill="FBF9F3" w:val="clear"/>
+            <w:tcMar>
+              <w:top w:type="dxa" w:w="70"/>
+              <w:left w:type="dxa" w:w="110"/>
+              <w:bottom w:type="dxa" w:w="70"/>
+              <w:right w:type="dxa" w:w="110"/>
+            </w:tcMar>
+          </w:tcPr>
+          <w:p>
+            <w:pPr>
+              <w:spacing w:after="0" w:line="250"/>
+            </w:pPr>
+            <w:r>
+              <w:rPr>
+                <w:rFonts w:ascii="Arial" w:cs="Arial" w:eastAsia="Arial" w:hAnsi="Arial"/>
+                <w:b w:val="false"/>
+                <w:bCs w:val="false"/>
+                <w:color w:val="2D3436"/>
+                <w:sz w:val="19"/>
+                <w:szCs w:val="19"/>
+              </w:rPr>
+              <w:t xml:space="preserve">Computed from seeded profiles</w:t>
+            </w:r>
+          </w:p>
+        </w:tc>
+        <w:tc>
+          <w:tcPr>
+            <w:tcW w:type="dxa" w:w="4226"/>
+            <w:tcBorders>
+              <w:top w:val="single" w:color="D8CDB4" w:sz="1"/>
+              <w:left w:val="single" w:color="D8CDB4" w:sz="1"/>
+              <w:bottom w:val="single" w:color="D8CDB4" w:sz="1"/>
+              <w:right w:val="single" w:color="D8CDB4" w:sz="1"/>
+            </w:tcBorders>
+            <w:shd w:fill="FBF9F3" w:val="clear"/>
+            <w:tcMar>
+              <w:top w:type="dxa" w:w="70"/>
+              <w:left w:type="dxa" w:w="110"/>
+              <w:bottom w:type="dxa" w:w="70"/>
+              <w:right w:type="dxa" w:w="110"/>
+            </w:tcMar>
+          </w:tcPr>
+          <w:p>
+            <w:pPr>
+              <w:spacing w:after="0" w:line="250"/>
+            </w:pPr>
+            <w:r>
+              <w:rPr>
+                <w:rFonts w:ascii="Arial" w:cs="Arial" w:eastAsia="Arial" w:hAnsi="Arial"/>
+                <w:b w:val="false"/>
+                <w:bCs w:val="false"/>
+                <w:color w:val="2D3436"/>
+                <w:sz w:val="19"/>
+                <w:szCs w:val="19"/>
+              </w:rPr>
+              <w:t xml:space="preserve">Same formula — real parsed resumes, real application activity</w:t>
+            </w:r>
+          </w:p>
+        </w:tc>
+      </w:tr>
+      <w:tr>
+        <w:tc>
+          <w:tcPr>
+            <w:tcW w:type="dxa" w:w="2200"/>
+            <w:tcBorders>
+              <w:top w:val="single" w:color="D8CDB4" w:sz="1"/>
+              <w:left w:val="single" w:color="D8CDB4" w:sz="1"/>
+              <w:bottom w:val="single" w:color="D8CDB4" w:sz="1"/>
+              <w:right w:val="single" w:color="D8CDB4" w:sz="1"/>
+            </w:tcBorders>
+            <w:shd w:fill="FFFFFF" w:val="clear"/>
+            <w:tcMar>
+              <w:top w:type="dxa" w:w="70"/>
+              <w:left w:type="dxa" w:w="110"/>
+              <w:bottom w:type="dxa" w:w="70"/>
+              <w:right w:type="dxa" w:w="110"/>
+            </w:tcMar>
+          </w:tcPr>
+          <w:p>
+            <w:pPr>
+              <w:spacing w:after="0" w:line="250"/>
+            </w:pPr>
+            <w:r>
+              <w:rPr>
+                <w:rFonts w:ascii="Arial" w:cs="Arial" w:eastAsia="Arial" w:hAnsi="Arial"/>
+                <w:b w:val="false"/>
+                <w:bCs w:val="false"/>
+                <w:color w:val="2D3436"/>
+                <w:sz w:val="19"/>
+                <w:szCs w:val="19"/>
+              </w:rPr>
+              <w:t xml:space="preserve">ATS Scanner</w:t>
+            </w:r>
+          </w:p>
+        </w:tc>
+        <w:tc>
+          <w:tcPr>
+            <w:tcW w:type="dxa" w:w="2600"/>
+            <w:tcBorders>
+              <w:top w:val="single" w:color="D8CDB4" w:sz="1"/>
+              <w:left w:val="single" w:color="D8CDB4" w:sz="1"/>
+              <w:bottom w:val="single" w:color="D8CDB4" w:sz="1"/>
+              <w:right w:val="single" w:color="D8CDB4" w:sz="1"/>
+            </w:tcBorders>
+            <w:shd w:fill="FFFFFF" w:val="clear"/>
+            <w:tcMar>
+              <w:top w:type="dxa" w:w="70"/>
+              <w:left w:type="dxa" w:w="110"/>
+              <w:bottom w:type="dxa" w:w="70"/>
+              <w:right w:type="dxa" w:w="110"/>
+            </w:tcMar>
+          </w:tcPr>
+          <w:p>
+            <w:pPr>
+              <w:spacing w:after="0" w:line="250"/>
+            </w:pPr>
+            <w:r>
+              <w:rPr>
+                <w:rFonts w:ascii="Arial" w:cs="Arial" w:eastAsia="Arial" w:hAnsi="Arial"/>
+                <w:b w:val="false"/>
+                <w:bCs w:val="false"/>
+                <w:color w:val="2D3436"/>
+                <w:sz w:val="19"/>
+                <w:szCs w:val="19"/>
+              </w:rPr>
+              <w:t xml:space="preserve">Simulated score</w:t>
+            </w:r>
+          </w:p>
+        </w:tc>
+        <w:tc>
+          <w:tcPr>
+            <w:tcW w:type="dxa" w:w="4226"/>
+            <w:tcBorders>
+              <w:top w:val="single" w:color="D8CDB4" w:sz="1"/>
+              <w:left w:val="single" w:color="D8CDB4" w:sz="1"/>
+              <w:bottom w:val="single" w:color="D8CDB4" w:sz="1"/>
+              <w:right w:val="single" w:color="D8CDB4" w:sz="1"/>
+            </w:tcBorders>
+            <w:shd w:fill="FFFFFF" w:val="clear"/>
+            <w:tcMar>
+              <w:top w:type="dxa" w:w="70"/>
+              <w:left w:type="dxa" w:w="110"/>
+              <w:bottom w:type="dxa" w:w="70"/>
+              <w:right w:type="dxa" w:w="110"/>
+            </w:tcMar>
+          </w:tcPr>
+          <w:p>
+            <w:pPr>
+              <w:spacing w:after="0" w:line="250"/>
+            </w:pPr>
+            <w:r>
+              <w:rPr>
+                <w:rFonts w:ascii="Arial" w:cs="Arial" w:eastAsia="Arial" w:hAnsi="Arial"/>
+                <w:b w:val="false"/>
+                <w:bCs w:val="false"/>
+                <w:color w:val="2D3436"/>
+                <w:sz w:val="19"/>
+                <w:szCs w:val="19"/>
+              </w:rPr>
+              <w:t xml:space="preserve">Textkernel / Affinda parsing + Claude analysis</w:t>
+            </w:r>
+          </w:p>
+        </w:tc>
+      </w:tr>
+      <w:tr>
+        <w:tc>
+          <w:tcPr>
+            <w:tcW w:type="dxa" w:w="2200"/>
+            <w:tcBorders>
+              <w:top w:val="single" w:color="D8CDB4" w:sz="1"/>
+              <w:left w:val="single" w:color="D8CDB4" w:sz="1"/>
+              <w:bottom w:val="single" w:color="D8CDB4" w:sz="1"/>
+              <w:right w:val="single" w:color="D8CDB4" w:sz="1"/>
+            </w:tcBorders>
+            <w:shd w:fill="FBF9F3" w:val="clear"/>
+            <w:tcMar>
+              <w:top w:type="dxa" w:w="70"/>
+              <w:left w:type="dxa" w:w="110"/>
+              <w:bottom w:type="dxa" w:w="70"/>
+              <w:right w:type="dxa" w:w="110"/>
+            </w:tcMar>
+          </w:tcPr>
+          <w:p>
+            <w:pPr>
+              <w:spacing w:after="0" w:line="250"/>
+            </w:pPr>
+            <w:r>
+              <w:rPr>
+                <w:rFonts w:ascii="Arial" w:cs="Arial" w:eastAsia="Arial" w:hAnsi="Arial"/>
+                <w:b w:val="false"/>
+                <w:bCs w:val="false"/>
+                <w:color w:val="2D3436"/>
+                <w:sz w:val="19"/>
+                <w:szCs w:val="19"/>
+              </w:rPr>
+              <w:t xml:space="preserve">Course Advisor</w:t>
+            </w:r>
+          </w:p>
+        </w:tc>
+        <w:tc>
+          <w:tcPr>
+            <w:tcW w:type="dxa" w:w="2600"/>
+            <w:tcBorders>
+              <w:top w:val="single" w:color="D8CDB4" w:sz="1"/>
+              <w:left w:val="single" w:color="D8CDB4" w:sz="1"/>
+              <w:bottom w:val="single" w:color="D8CDB4" w:sz="1"/>
+              <w:right w:val="single" w:color="D8CDB4" w:sz="1"/>
+            </w:tcBorders>
+            <w:shd w:fill="FBF9F3" w:val="clear"/>
+            <w:tcMar>
+              <w:top w:type="dxa" w:w="70"/>
+              <w:left w:type="dxa" w:w="110"/>
+              <w:bottom w:type="dxa" w:w="70"/>
+              <w:right w:type="dxa" w:w="110"/>
+            </w:tcMar>
+          </w:tcPr>
+          <w:p>
+            <w:pPr>
+              <w:spacing w:after="0" w:line="250"/>
+            </w:pPr>
+            <w:r>
+              <w:rPr>
+                <w:rFonts w:ascii="Arial" w:cs="Arial" w:eastAsia="Arial" w:hAnsi="Arial"/>
+                <w:b w:val="false"/>
+                <w:bCs w:val="false"/>
+                <w:color w:val="2D3436"/>
+                <w:sz w:val="19"/>
+                <w:szCs w:val="19"/>
+              </w:rPr>
+              <w:t xml:space="preserve">lib/courseAdvisor.ts</w:t>
+            </w:r>
+          </w:p>
+        </w:tc>
+        <w:tc>
+          <w:tcPr>
+            <w:tcW w:type="dxa" w:w="4226"/>
+            <w:tcBorders>
+              <w:top w:val="single" w:color="D8CDB4" w:sz="1"/>
+              <w:left w:val="single" w:color="D8CDB4" w:sz="1"/>
+              <w:bottom w:val="single" w:color="D8CDB4" w:sz="1"/>
+              <w:right w:val="single" w:color="D8CDB4" w:sz="1"/>
+            </w:tcBorders>
+            <w:shd w:fill="FBF9F3" w:val="clear"/>
+            <w:tcMar>
+              <w:top w:type="dxa" w:w="70"/>
+              <w:left w:type="dxa" w:w="110"/>
+              <w:bottom w:type="dxa" w:w="70"/>
+              <w:right w:type="dxa" w:w="110"/>
+            </w:tcMar>
+          </w:tcPr>
+          <w:p>
+            <w:pPr>
+              <w:spacing w:after="0" w:line="250"/>
+            </w:pPr>
+            <w:r>
+              <w:rPr>
+                <w:rFonts w:ascii="Arial" w:cs="Arial" w:eastAsia="Arial" w:hAnsi="Arial"/>
+                <w:b w:val="false"/>
+                <w:bCs w:val="false"/>
+                <w:color w:val="2D3436"/>
+                <w:sz w:val="19"/>
+                <w:szCs w:val="19"/>
+              </w:rPr>
+              <w:t xml:space="preserve">MQA Qualifications Register + MOHE tracer outcomes + TalentCorp demand data</w:t>
+            </w:r>
+          </w:p>
+        </w:tc>
+      </w:tr>
+      <w:tr>
+        <w:tc>
+          <w:tcPr>
+            <w:tcW w:type="dxa" w:w="2200"/>
+            <w:tcBorders>
+              <w:top w:val="single" w:color="D8CDB4" w:sz="1"/>
+              <w:left w:val="single" w:color="D8CDB4" w:sz="1"/>
+              <w:bottom w:val="single" w:color="D8CDB4" w:sz="1"/>
+              <w:right w:val="single" w:color="D8CDB4" w:sz="1"/>
+            </w:tcBorders>
+            <w:shd w:fill="FFFFFF" w:val="clear"/>
+            <w:tcMar>
+              <w:top w:type="dxa" w:w="70"/>
+              <w:left w:type="dxa" w:w="110"/>
+              <w:bottom w:type="dxa" w:w="70"/>
+              <w:right w:type="dxa" w:w="110"/>
+            </w:tcMar>
+          </w:tcPr>
+          <w:p>
+            <w:pPr>
+              <w:spacing w:after="0" w:line="250"/>
+            </w:pPr>
+            <w:r>
+              <w:rPr>
+                <w:rFonts w:ascii="Arial" w:cs="Arial" w:eastAsia="Arial" w:hAnsi="Arial"/>
+                <w:b w:val="false"/>
+                <w:bCs w:val="false"/>
+                <w:color w:val="2D3436"/>
+                <w:sz w:val="19"/>
+                <w:szCs w:val="19"/>
+              </w:rPr>
+              <w:t xml:space="preserve">Career Path</w:t>
+            </w:r>
+          </w:p>
+        </w:tc>
+        <w:tc>
+          <w:tcPr>
+            <w:tcW w:type="dxa" w:w="2600"/>
+            <w:tcBorders>
+              <w:top w:val="single" w:color="D8CDB4" w:sz="1"/>
+              <w:left w:val="single" w:color="D8CDB4" w:sz="1"/>
+              <w:bottom w:val="single" w:color="D8CDB4" w:sz="1"/>
+              <w:right w:val="single" w:color="D8CDB4" w:sz="1"/>
+            </w:tcBorders>
+            <w:shd w:fill="FFFFFF" w:val="clear"/>
+            <w:tcMar>
+              <w:top w:type="dxa" w:w="70"/>
+              <w:left w:type="dxa" w:w="110"/>
+              <w:bottom w:type="dxa" w:w="70"/>
+              <w:right w:type="dxa" w:w="110"/>
+            </w:tcMar>
+          </w:tcPr>
+          <w:p>
+            <w:pPr>
+              <w:spacing w:after="0" w:line="250"/>
+            </w:pPr>
+            <w:r>
+              <w:rPr>
+                <w:rFonts w:ascii="Arial" w:cs="Arial" w:eastAsia="Arial" w:hAnsi="Arial"/>
+                <w:b w:val="false"/>
+                <w:bCs w:val="false"/>
+                <w:color w:val="2D3436"/>
+                <w:sz w:val="19"/>
+                <w:szCs w:val="19"/>
+              </w:rPr>
+              <w:t xml:space="preserve">careerPathData</w:t>
+            </w:r>
+          </w:p>
+        </w:tc>
+        <w:tc>
+          <w:tcPr>
+            <w:tcW w:type="dxa" w:w="4226"/>
+            <w:tcBorders>
+              <w:top w:val="single" w:color="D8CDB4" w:sz="1"/>
+              <w:left w:val="single" w:color="D8CDB4" w:sz="1"/>
+              <w:bottom w:val="single" w:color="D8CDB4" w:sz="1"/>
+              <w:right w:val="single" w:color="D8CDB4" w:sz="1"/>
+            </w:tcBorders>
+            <w:shd w:fill="FFFFFF" w:val="clear"/>
+            <w:tcMar>
+              <w:top w:type="dxa" w:w="70"/>
+              <w:left w:type="dxa" w:w="110"/>
+              <w:bottom w:type="dxa" w:w="70"/>
+              <w:right w:type="dxa" w:w="110"/>
+            </w:tcMar>
+          </w:tcPr>
+          <w:p>
+            <w:pPr>
+              <w:spacing w:after="0" w:line="250"/>
+            </w:pPr>
+            <w:r>
+              <w:rPr>
+                <w:rFonts w:ascii="Arial" w:cs="Arial" w:eastAsia="Arial" w:hAnsi="Arial"/>
+                <w:b w:val="false"/>
+                <w:bCs w:val="false"/>
+                <w:color w:val="2D3436"/>
+                <w:sz w:val="19"/>
+                <w:szCs w:val="19"/>
+              </w:rPr>
+              <w:t xml:space="preserve">Real career transitions aggregated from platform placements</w:t>
+            </w:r>
+          </w:p>
+        </w:tc>
+      </w:tr>
+      <w:tr>
+        <w:tc>
+          <w:tcPr>
+            <w:tcW w:type="dxa" w:w="2200"/>
+            <w:tcBorders>
+              <w:top w:val="single" w:color="D8CDB4" w:sz="1"/>
+              <w:left w:val="single" w:color="D8CDB4" w:sz="1"/>
+              <w:bottom w:val="single" w:color="D8CDB4" w:sz="1"/>
+              <w:right w:val="single" w:color="D8CDB4" w:sz="1"/>
+            </w:tcBorders>
+            <w:shd w:fill="FBF9F3" w:val="clear"/>
+            <w:tcMar>
+              <w:top w:type="dxa" w:w="70"/>
+              <w:left w:type="dxa" w:w="110"/>
+              <w:bottom w:type="dxa" w:w="70"/>
+              <w:right w:type="dxa" w:w="110"/>
+            </w:tcMar>
+          </w:tcPr>
+          <w:p>
+            <w:pPr>
+              <w:spacing w:after="0" w:line="250"/>
+            </w:pPr>
+            <w:r>
+              <w:rPr>
+                <w:rFonts w:ascii="Arial" w:cs="Arial" w:eastAsia="Arial" w:hAnsi="Arial"/>
+                <w:b w:val="false"/>
+                <w:bCs w:val="false"/>
+                <w:color w:val="2D3436"/>
+                <w:sz w:val="19"/>
+                <w:szCs w:val="19"/>
+              </w:rPr>
+              <w:t xml:space="preserve">Salary Insights</w:t>
+            </w:r>
+          </w:p>
+        </w:tc>
+        <w:tc>
+          <w:tcPr>
+            <w:tcW w:type="dxa" w:w="2600"/>
+            <w:tcBorders>
+              <w:top w:val="single" w:color="D8CDB4" w:sz="1"/>
+              <w:left w:val="single" w:color="D8CDB4" w:sz="1"/>
+              <w:bottom w:val="single" w:color="D8CDB4" w:sz="1"/>
+              <w:right w:val="single" w:color="D8CDB4" w:sz="1"/>
+            </w:tcBorders>
+            <w:shd w:fill="FBF9F3" w:val="clear"/>
+            <w:tcMar>
+              <w:top w:type="dxa" w:w="70"/>
+              <w:left w:type="dxa" w:w="110"/>
+              <w:bottom w:type="dxa" w:w="70"/>
+              <w:right w:type="dxa" w:w="110"/>
+            </w:tcMar>
+          </w:tcPr>
+          <w:p>
+            <w:pPr>
+              <w:spacing w:after="0" w:line="250"/>
+            </w:pPr>
+            <w:r>
+              <w:rPr>
+                <w:rFonts w:ascii="Arial" w:cs="Arial" w:eastAsia="Arial" w:hAnsi="Arial"/>
+                <w:b w:val="false"/>
+                <w:bCs w:val="false"/>
+                <w:color w:val="2D3436"/>
+                <w:sz w:val="19"/>
+                <w:szCs w:val="19"/>
+              </w:rPr>
+              <w:t xml:space="preserve">mockSalaryData</w:t>
+            </w:r>
+          </w:p>
+        </w:tc>
+        <w:tc>
+          <w:tcPr>
+            <w:tcW w:type="dxa" w:w="4226"/>
+            <w:tcBorders>
+              <w:top w:val="single" w:color="D8CDB4" w:sz="1"/>
+              <w:left w:val="single" w:color="D8CDB4" w:sz="1"/>
+              <w:bottom w:val="single" w:color="D8CDB4" w:sz="1"/>
+              <w:right w:val="single" w:color="D8CDB4" w:sz="1"/>
+            </w:tcBorders>
+            <w:shd w:fill="FBF9F3" w:val="clear"/>
+            <w:tcMar>
+              <w:top w:type="dxa" w:w="70"/>
+              <w:left w:type="dxa" w:w="110"/>
+              <w:bottom w:type="dxa" w:w="70"/>
+              <w:right w:type="dxa" w:w="110"/>
+            </w:tcMar>
+          </w:tcPr>
+          <w:p>
+            <w:pPr>
+              <w:spacing w:after="0" w:line="250"/>
+            </w:pPr>
+            <w:r>
+              <w:rPr>
+                <w:rFonts w:ascii="Arial" w:cs="Arial" w:eastAsia="Arial" w:hAnsi="Arial"/>
+                <w:b w:val="false"/>
+                <w:bCs w:val="false"/>
+                <w:color w:val="2D3436"/>
+                <w:sz w:val="19"/>
+                <w:szCs w:val="19"/>
+              </w:rPr>
+              <w:t xml:space="preserve">DOSM Salaries &amp; Wages Survey + platform placement salaries</w:t>
+            </w:r>
+          </w:p>
+        </w:tc>
+      </w:tr>
+      <w:tr>
+        <w:tc>
+          <w:tcPr>
+            <w:tcW w:type="dxa" w:w="2200"/>
+            <w:tcBorders>
+              <w:top w:val="single" w:color="D8CDB4" w:sz="1"/>
+              <w:left w:val="single" w:color="D8CDB4" w:sz="1"/>
+              <w:bottom w:val="single" w:color="D8CDB4" w:sz="1"/>
+              <w:right w:val="single" w:color="D8CDB4" w:sz="1"/>
+            </w:tcBorders>
+            <w:shd w:fill="FFFFFF" w:val="clear"/>
+            <w:tcMar>
+              <w:top w:type="dxa" w:w="70"/>
+              <w:left w:type="dxa" w:w="110"/>
+              <w:bottom w:type="dxa" w:w="70"/>
+              <w:right w:type="dxa" w:w="110"/>
+            </w:tcMar>
+          </w:tcPr>
+          <w:p>
+            <w:pPr>
+              <w:spacing w:after="0" w:line="250"/>
+            </w:pPr>
+            <w:r>
+              <w:rPr>
+                <w:rFonts w:ascii="Arial" w:cs="Arial" w:eastAsia="Arial" w:hAnsi="Arial"/>
+                <w:b w:val="false"/>
+                <w:bCs w:val="false"/>
+                <w:color w:val="2D3436"/>
+                <w:sz w:val="19"/>
+                <w:szCs w:val="19"/>
+              </w:rPr>
+              <w:t xml:space="preserve">YourAnimal Test</w:t>
+            </w:r>
+          </w:p>
+        </w:tc>
+        <w:tc>
+          <w:tcPr>
+            <w:tcW w:type="dxa" w:w="2600"/>
+            <w:tcBorders>
+              <w:top w:val="single" w:color="D8CDB4" w:sz="1"/>
+              <w:left w:val="single" w:color="D8CDB4" w:sz="1"/>
+              <w:bottom w:val="single" w:color="D8CDB4" w:sz="1"/>
+              <w:right w:val="single" w:color="D8CDB4" w:sz="1"/>
+            </w:tcBorders>
+            <w:shd w:fill="FFFFFF" w:val="clear"/>
+            <w:tcMar>
+              <w:top w:type="dxa" w:w="70"/>
+              <w:left w:type="dxa" w:w="110"/>
+              <w:bottom w:type="dxa" w:w="70"/>
+              <w:right w:type="dxa" w:w="110"/>
+            </w:tcMar>
+          </w:tcPr>
+          <w:p>
+            <w:pPr>
+              <w:spacing w:after="0" w:line="250"/>
+            </w:pPr>
+            <w:r>
+              <w:rPr>
+                <w:rFonts w:ascii="Arial" w:cs="Arial" w:eastAsia="Arial" w:hAnsi="Arial"/>
+                <w:b w:val="false"/>
+                <w:bCs w:val="false"/>
+                <w:color w:val="2D3436"/>
+                <w:sz w:val="19"/>
+                <w:szCs w:val="19"/>
+              </w:rPr>
+              <w:t xml:space="preserve">lib/animalTest.ts</w:t>
+            </w:r>
+          </w:p>
+        </w:tc>
+        <w:tc>
+          <w:tcPr>
+            <w:tcW w:type="dxa" w:w="4226"/>
+            <w:tcBorders>
+              <w:top w:val="single" w:color="D8CDB4" w:sz="1"/>
+              <w:left w:val="single" w:color="D8CDB4" w:sz="1"/>
+              <w:bottom w:val="single" w:color="D8CDB4" w:sz="1"/>
+              <w:right w:val="single" w:color="D8CDB4" w:sz="1"/>
+            </w:tcBorders>
+            <w:shd w:fill="FFFFFF" w:val="clear"/>
+            <w:tcMar>
+              <w:top w:type="dxa" w:w="70"/>
+              <w:left w:type="dxa" w:w="110"/>
+              <w:bottom w:type="dxa" w:w="70"/>
+              <w:right w:type="dxa" w:w="110"/>
+            </w:tcMar>
+          </w:tcPr>
+          <w:p>
+            <w:pPr>
+              <w:spacing w:after="0" w:line="250"/>
+            </w:pPr>
+            <w:r>
+              <w:rPr>
+                <w:rFonts w:ascii="Arial" w:cs="Arial" w:eastAsia="Arial" w:hAnsi="Arial"/>
+                <w:b w:val="false"/>
+                <w:bCs w:val="false"/>
+                <w:color w:val="2D3436"/>
+                <w:sz w:val="19"/>
+                <w:szCs w:val="19"/>
+              </w:rPr>
+              <w:t xml:space="preserve">Integrate Talentbank’s existing yourworkanimal.com system</w:t>
+            </w:r>
+          </w:p>
+        </w:tc>
+      </w:tr>
+      <w:tr>
+        <w:tc>
+          <w:tcPr>
+            <w:tcW w:type="dxa" w:w="2200"/>
+            <w:tcBorders>
+              <w:top w:val="single" w:color="D8CDB4" w:sz="1"/>
+              <w:left w:val="single" w:color="D8CDB4" w:sz="1"/>
+              <w:bottom w:val="single" w:color="D8CDB4" w:sz="1"/>
+              <w:right w:val="single" w:color="D8CDB4" w:sz="1"/>
+            </w:tcBorders>
+            <w:shd w:fill="FBF9F3" w:val="clear"/>
+            <w:tcMar>
+              <w:top w:type="dxa" w:w="70"/>
+              <w:left w:type="dxa" w:w="110"/>
+              <w:bottom w:type="dxa" w:w="70"/>
+              <w:right w:type="dxa" w:w="110"/>
+            </w:tcMar>
+          </w:tcPr>
+          <w:p>
+            <w:pPr>
+              <w:spacing w:after="0" w:line="250"/>
+            </w:pPr>
+            <w:r>
+              <w:rPr>
+                <w:rFonts w:ascii="Arial" w:cs="Arial" w:eastAsia="Arial" w:hAnsi="Arial"/>
+                <w:b w:val="false"/>
+                <w:bCs w:val="false"/>
+                <w:color w:val="2D3436"/>
+                <w:sz w:val="19"/>
+                <w:szCs w:val="19"/>
+              </w:rPr>
+              <w:t xml:space="preserve">Company profiles</w:t>
+            </w:r>
+          </w:p>
+        </w:tc>
+        <w:tc>
+          <w:tcPr>
+            <w:tcW w:type="dxa" w:w="2600"/>
+            <w:tcBorders>
+              <w:top w:val="single" w:color="D8CDB4" w:sz="1"/>
+              <w:left w:val="single" w:color="D8CDB4" w:sz="1"/>
+              <w:bottom w:val="single" w:color="D8CDB4" w:sz="1"/>
+              <w:right w:val="single" w:color="D8CDB4" w:sz="1"/>
+            </w:tcBorders>
+            <w:shd w:fill="FBF9F3" w:val="clear"/>
+            <w:tcMar>
+              <w:top w:type="dxa" w:w="70"/>
+              <w:left w:type="dxa" w:w="110"/>
+              <w:bottom w:type="dxa" w:w="70"/>
+              <w:right w:type="dxa" w:w="110"/>
+            </w:tcMar>
+          </w:tcPr>
+          <w:p>
+            <w:pPr>
+              <w:spacing w:after="0" w:line="250"/>
+            </w:pPr>
+            <w:r>
+              <w:rPr>
+                <w:rFonts w:ascii="Arial" w:cs="Arial" w:eastAsia="Arial" w:hAnsi="Arial"/>
+                <w:b w:val="false"/>
+                <w:bCs w:val="false"/>
+                <w:color w:val="2D3436"/>
+                <w:sz w:val="19"/>
+                <w:szCs w:val="19"/>
+              </w:rPr>
+              <w:t xml:space="preserve">mockCompanies</w:t>
+            </w:r>
+          </w:p>
+        </w:tc>
+        <w:tc>
+          <w:tcPr>
+            <w:tcW w:type="dxa" w:w="4226"/>
+            <w:tcBorders>
+              <w:top w:val="single" w:color="D8CDB4" w:sz="1"/>
+              <w:left w:val="single" w:color="D8CDB4" w:sz="1"/>
+              <w:bottom w:val="single" w:color="D8CDB4" w:sz="1"/>
+              <w:right w:val="single" w:color="D8CDB4" w:sz="1"/>
+            </w:tcBorders>
+            <w:shd w:fill="FBF9F3" w:val="clear"/>
+            <w:tcMar>
+              <w:top w:type="dxa" w:w="70"/>
+              <w:left w:type="dxa" w:w="110"/>
+              <w:bottom w:type="dxa" w:w="70"/>
+              <w:right w:type="dxa" w:w="110"/>
+            </w:tcMar>
+          </w:tcPr>
+          <w:p>
+            <w:pPr>
+              <w:spacing w:after="0" w:line="250"/>
+            </w:pPr>
+            <w:r>
+              <w:rPr>
+                <w:rFonts w:ascii="Arial" w:cs="Arial" w:eastAsia="Arial" w:hAnsi="Arial"/>
+                <w:b w:val="false"/>
+                <w:bCs w:val="false"/>
+                <w:color w:val="2D3436"/>
+                <w:sz w:val="19"/>
+                <w:szCs w:val="19"/>
+              </w:rPr>
+              <w:t xml:space="preserve">SSM e-Info verification + Talentbank verified partner network</w:t>
+            </w:r>
+          </w:p>
+        </w:tc>
+      </w:tr>
+      <w:tr>
+        <w:tc>
+          <w:tcPr>
+            <w:tcW w:type="dxa" w:w="2200"/>
+            <w:tcBorders>
+              <w:top w:val="single" w:color="D8CDB4" w:sz="1"/>
+              <w:left w:val="single" w:color="D8CDB4" w:sz="1"/>
+              <w:bottom w:val="single" w:color="D8CDB4" w:sz="1"/>
+              <w:right w:val="single" w:color="D8CDB4" w:sz="1"/>
+            </w:tcBorders>
+            <w:shd w:fill="FFFFFF" w:val="clear"/>
+            <w:tcMar>
+              <w:top w:type="dxa" w:w="70"/>
+              <w:left w:type="dxa" w:w="110"/>
+              <w:bottom w:type="dxa" w:w="70"/>
+              <w:right w:type="dxa" w:w="110"/>
+            </w:tcMar>
+          </w:tcPr>
+          <w:p>
+            <w:pPr>
+              <w:spacing w:after="0" w:line="250"/>
+            </w:pPr>
+            <w:r>
+              <w:rPr>
+                <w:rFonts w:ascii="Arial" w:cs="Arial" w:eastAsia="Arial" w:hAnsi="Arial"/>
+                <w:b w:val="false"/>
+                <w:bCs w:val="false"/>
+                <w:color w:val="2D3436"/>
+                <w:sz w:val="19"/>
+                <w:szCs w:val="19"/>
+              </w:rPr>
+              <w:t xml:space="preserve">Company reviews</w:t>
+            </w:r>
+          </w:p>
+        </w:tc>
+        <w:tc>
+          <w:tcPr>
+            <w:tcW w:type="dxa" w:w="2600"/>
+            <w:tcBorders>
+              <w:top w:val="single" w:color="D8CDB4" w:sz="1"/>
+              <w:left w:val="single" w:color="D8CDB4" w:sz="1"/>
+              <w:bottom w:val="single" w:color="D8CDB4" w:sz="1"/>
+              <w:right w:val="single" w:color="D8CDB4" w:sz="1"/>
+            </w:tcBorders>
+            <w:shd w:fill="FFFFFF" w:val="clear"/>
+            <w:tcMar>
+              <w:top w:type="dxa" w:w="70"/>
+              <w:left w:type="dxa" w:w="110"/>
+              <w:bottom w:type="dxa" w:w="70"/>
+              <w:right w:type="dxa" w:w="110"/>
+            </w:tcMar>
+          </w:tcPr>
+          <w:p>
+            <w:pPr>
+              <w:spacing w:after="0" w:line="250"/>
+            </w:pPr>
+            <w:r>
+              <w:rPr>
+                <w:rFonts w:ascii="Arial" w:cs="Arial" w:eastAsia="Arial" w:hAnsi="Arial"/>
+                <w:b w:val="false"/>
+                <w:bCs w:val="false"/>
+                <w:color w:val="2D3436"/>
+                <w:sz w:val="19"/>
+                <w:szCs w:val="19"/>
+              </w:rPr>
+              <w:t xml:space="preserve">Simulated</w:t>
+            </w:r>
+          </w:p>
+        </w:tc>
+        <w:tc>
+          <w:tcPr>
+            <w:tcW w:type="dxa" w:w="4226"/>
+            <w:tcBorders>
+              <w:top w:val="single" w:color="D8CDB4" w:sz="1"/>
+              <w:left w:val="single" w:color="D8CDB4" w:sz="1"/>
+              <w:bottom w:val="single" w:color="D8CDB4" w:sz="1"/>
+              <w:right w:val="single" w:color="D8CDB4" w:sz="1"/>
+            </w:tcBorders>
+            <w:shd w:fill="FFFFFF" w:val="clear"/>
+            <w:tcMar>
+              <w:top w:type="dxa" w:w="70"/>
+              <w:left w:type="dxa" w:w="110"/>
+              <w:bottom w:type="dxa" w:w="70"/>
+              <w:right w:type="dxa" w:w="110"/>
+            </w:tcMar>
+          </w:tcPr>
+          <w:p>
+            <w:pPr>
+              <w:spacing w:after="0" w:line="250"/>
+            </w:pPr>
+            <w:r>
+              <w:rPr>
+                <w:rFonts w:ascii="Arial" w:cs="Arial" w:eastAsia="Arial" w:hAnsi="Arial"/>
+                <w:b w:val="false"/>
+                <w:bCs w:val="false"/>
+                <w:color w:val="2D3436"/>
+                <w:sz w:val="19"/>
+                <w:szCs w:val="19"/>
+              </w:rPr>
+              <w:t xml:space="preserve">Reviews from candidates actually placed through the platform</w:t>
+            </w:r>
+          </w:p>
+        </w:tc>
+      </w:tr>
+      <w:tr>
+        <w:tc>
+          <w:tcPr>
+            <w:tcW w:type="dxa" w:w="2200"/>
+            <w:tcBorders>
+              <w:top w:val="single" w:color="D8CDB4" w:sz="1"/>
+              <w:left w:val="single" w:color="D8CDB4" w:sz="1"/>
+              <w:bottom w:val="single" w:color="D8CDB4" w:sz="1"/>
+              <w:right w:val="single" w:color="D8CDB4" w:sz="1"/>
+            </w:tcBorders>
+            <w:shd w:fill="FBF9F3" w:val="clear"/>
+            <w:tcMar>
+              <w:top w:type="dxa" w:w="70"/>
+              <w:left w:type="dxa" w:w="110"/>
+              <w:bottom w:type="dxa" w:w="70"/>
+              <w:right w:type="dxa" w:w="110"/>
+            </w:tcMar>
+          </w:tcPr>
+          <w:p>
+            <w:pPr>
+              <w:spacing w:after="0" w:line="250"/>
+            </w:pPr>
+            <w:r>
+              <w:rPr>
+                <w:rFonts w:ascii="Arial" w:cs="Arial" w:eastAsia="Arial" w:hAnsi="Arial"/>
+                <w:b w:val="false"/>
+                <w:bCs w:val="false"/>
+                <w:color w:val="2D3436"/>
+                <w:sz w:val="19"/>
+                <w:szCs w:val="19"/>
+              </w:rPr>
+              <w:t xml:space="preserve">Anti-Ghost score</w:t>
+            </w:r>
+          </w:p>
+        </w:tc>
+        <w:tc>
+          <w:tcPr>
+            <w:tcW w:type="dxa" w:w="2600"/>
+            <w:tcBorders>
+              <w:top w:val="single" w:color="D8CDB4" w:sz="1"/>
+              <w:left w:val="single" w:color="D8CDB4" w:sz="1"/>
+              <w:bottom w:val="single" w:color="D8CDB4" w:sz="1"/>
+              <w:right w:val="single" w:color="D8CDB4" w:sz="1"/>
+            </w:tcBorders>
+            <w:shd w:fill="FBF9F3" w:val="clear"/>
+            <w:tcMar>
+              <w:top w:type="dxa" w:w="70"/>
+              <w:left w:type="dxa" w:w="110"/>
+              <w:bottom w:type="dxa" w:w="70"/>
+              <w:right w:type="dxa" w:w="110"/>
+            </w:tcMar>
+          </w:tcPr>
+          <w:p>
+            <w:pPr>
+              <w:spacing w:after="0" w:line="250"/>
+            </w:pPr>
+            <w:r>
+              <w:rPr>
+                <w:rFonts w:ascii="Arial" w:cs="Arial" w:eastAsia="Arial" w:hAnsi="Arial"/>
+                <w:b w:val="false"/>
+                <w:bCs w:val="false"/>
+                <w:color w:val="2D3436"/>
+                <w:sz w:val="19"/>
+                <w:szCs w:val="19"/>
+              </w:rPr>
+              <w:t xml:space="preserve">Seeded values</w:t>
+            </w:r>
+          </w:p>
+        </w:tc>
+        <w:tc>
+          <w:tcPr>
+            <w:tcW w:type="dxa" w:w="4226"/>
+            <w:tcBorders>
+              <w:top w:val="single" w:color="D8CDB4" w:sz="1"/>
+              <w:left w:val="single" w:color="D8CDB4" w:sz="1"/>
+              <w:bottom w:val="single" w:color="D8CDB4" w:sz="1"/>
+              <w:right w:val="single" w:color="D8CDB4" w:sz="1"/>
+            </w:tcBorders>
+            <w:shd w:fill="FBF9F3" w:val="clear"/>
+            <w:tcMar>
+              <w:top w:type="dxa" w:w="70"/>
+              <w:left w:type="dxa" w:w="110"/>
+              <w:bottom w:type="dxa" w:w="70"/>
+              <w:right w:type="dxa" w:w="110"/>
+            </w:tcMar>
+          </w:tcPr>
+          <w:p>
+            <w:pPr>
+              <w:spacing w:after="0" w:line="250"/>
+            </w:pPr>
+            <w:r>
+              <w:rPr>
+                <w:rFonts w:ascii="Arial" w:cs="Arial" w:eastAsia="Arial" w:hAnsi="Arial"/>
+                <w:b w:val="false"/>
+                <w:bCs w:val="false"/>
+                <w:color w:val="2D3436"/>
+                <w:sz w:val="19"/>
+                <w:szCs w:val="19"/>
+              </w:rPr>
+              <w:t xml:space="preserve">Platform-native — real employer response timestamps</w:t>
+            </w:r>
+          </w:p>
+        </w:tc>
+      </w:tr>
+      <w:tr>
+        <w:tc>
+          <w:tcPr>
+            <w:tcW w:type="dxa" w:w="2200"/>
+            <w:tcBorders>
+              <w:top w:val="single" w:color="D8CDB4" w:sz="1"/>
+              <w:left w:val="single" w:color="D8CDB4" w:sz="1"/>
+              <w:bottom w:val="single" w:color="D8CDB4" w:sz="1"/>
+              <w:right w:val="single" w:color="D8CDB4" w:sz="1"/>
+            </w:tcBorders>
+            <w:shd w:fill="FFFFFF" w:val="clear"/>
+            <w:tcMar>
+              <w:top w:type="dxa" w:w="70"/>
+              <w:left w:type="dxa" w:w="110"/>
+              <w:bottom w:type="dxa" w:w="70"/>
+              <w:right w:type="dxa" w:w="110"/>
+            </w:tcMar>
+          </w:tcPr>
+          <w:p>
+            <w:pPr>
+              <w:spacing w:after="0" w:line="250"/>
+            </w:pPr>
+            <w:r>
+              <w:rPr>
+                <w:rFonts w:ascii="Arial" w:cs="Arial" w:eastAsia="Arial" w:hAnsi="Arial"/>
+                <w:b w:val="false"/>
+                <w:bCs w:val="false"/>
+                <w:color w:val="2D3436"/>
+                <w:sz w:val="19"/>
+                <w:szCs w:val="19"/>
+              </w:rPr>
+              <w:t xml:space="preserve">SIFU Interview Coach</w:t>
+            </w:r>
+          </w:p>
+        </w:tc>
+        <w:tc>
+          <w:tcPr>
+            <w:tcW w:type="dxa" w:w="2600"/>
+            <w:tcBorders>
+              <w:top w:val="single" w:color="D8CDB4" w:sz="1"/>
+              <w:left w:val="single" w:color="D8CDB4" w:sz="1"/>
+              <w:bottom w:val="single" w:color="D8CDB4" w:sz="1"/>
+              <w:right w:val="single" w:color="D8CDB4" w:sz="1"/>
+            </w:tcBorders>
+            <w:shd w:fill="FFFFFF" w:val="clear"/>
+            <w:tcMar>
+              <w:top w:type="dxa" w:w="70"/>
+              <w:left w:type="dxa" w:w="110"/>
+              <w:bottom w:type="dxa" w:w="70"/>
+              <w:right w:type="dxa" w:w="110"/>
+            </w:tcMar>
+          </w:tcPr>
+          <w:p>
+            <w:pPr>
+              <w:spacing w:after="0" w:line="250"/>
+            </w:pPr>
+            <w:r>
+              <w:rPr>
+                <w:rFonts w:ascii="Arial" w:cs="Arial" w:eastAsia="Arial" w:hAnsi="Arial"/>
+                <w:b w:val="false"/>
+                <w:bCs w:val="false"/>
+                <w:color w:val="2D3436"/>
+                <w:sz w:val="19"/>
+                <w:szCs w:val="19"/>
+              </w:rPr>
+              <w:t xml:space="preserve">ALREADY REAL (Claude API)</w:t>
+            </w:r>
+          </w:p>
+        </w:tc>
+        <w:tc>
+          <w:tcPr>
+            <w:tcW w:type="dxa" w:w="4226"/>
+            <w:tcBorders>
+              <w:top w:val="single" w:color="D8CDB4" w:sz="1"/>
+              <w:left w:val="single" w:color="D8CDB4" w:sz="1"/>
+              <w:bottom w:val="single" w:color="D8CDB4" w:sz="1"/>
+              <w:right w:val="single" w:color="D8CDB4" w:sz="1"/>
+            </w:tcBorders>
+            <w:shd w:fill="FFFFFF" w:val="clear"/>
+            <w:tcMar>
+              <w:top w:type="dxa" w:w="70"/>
+              <w:left w:type="dxa" w:w="110"/>
+              <w:bottom w:type="dxa" w:w="70"/>
+              <w:right w:type="dxa" w:w="110"/>
+            </w:tcMar>
+          </w:tcPr>
+          <w:p>
+            <w:pPr>
+              <w:spacing w:after="0" w:line="250"/>
+            </w:pPr>
+            <w:r>
+              <w:rPr>
+                <w:rFonts w:ascii="Arial" w:cs="Arial" w:eastAsia="Arial" w:hAnsi="Arial"/>
+                <w:b w:val="false"/>
+                <w:bCs w:val="false"/>
+                <w:color w:val="2D3436"/>
+                <w:sz w:val="19"/>
+                <w:szCs w:val="19"/>
+              </w:rPr>
+              <w:t xml:space="preserve">Same, plus voice input and richer feedback</w:t>
+            </w:r>
+          </w:p>
+        </w:tc>
+      </w:tr>
+      <w:tr>
+        <w:tc>
+          <w:tcPr>
+            <w:tcW w:type="dxa" w:w="2200"/>
+            <w:tcBorders>
+              <w:top w:val="single" w:color="D8CDB4" w:sz="1"/>
+              <w:left w:val="single" w:color="D8CDB4" w:sz="1"/>
+              <w:bottom w:val="single" w:color="D8CDB4" w:sz="1"/>
+              <w:right w:val="single" w:color="D8CDB4" w:sz="1"/>
+            </w:tcBorders>
+            <w:shd w:fill="FBF9F3" w:val="clear"/>
+            <w:tcMar>
+              <w:top w:type="dxa" w:w="70"/>
+              <w:left w:type="dxa" w:w="110"/>
+              <w:bottom w:type="dxa" w:w="70"/>
+              <w:right w:type="dxa" w:w="110"/>
+            </w:tcMar>
+          </w:tcPr>
+          <w:p>
+            <w:pPr>
+              <w:spacing w:after="0" w:line="250"/>
+            </w:pPr>
+            <w:r>
+              <w:rPr>
+                <w:rFonts w:ascii="Arial" w:cs="Arial" w:eastAsia="Arial" w:hAnsi="Arial"/>
+                <w:b w:val="false"/>
+                <w:bCs w:val="false"/>
+                <w:color w:val="2D3436"/>
+                <w:sz w:val="19"/>
+                <w:szCs w:val="19"/>
+              </w:rPr>
+              <w:t xml:space="preserve">Story Video</w:t>
+            </w:r>
+          </w:p>
+        </w:tc>
+        <w:tc>
+          <w:tcPr>
+            <w:tcW w:type="dxa" w:w="2600"/>
+            <w:tcBorders>
+              <w:top w:val="single" w:color="D8CDB4" w:sz="1"/>
+              <w:left w:val="single" w:color="D8CDB4" w:sz="1"/>
+              <w:bottom w:val="single" w:color="D8CDB4" w:sz="1"/>
+              <w:right w:val="single" w:color="D8CDB4" w:sz="1"/>
+            </w:tcBorders>
+            <w:shd w:fill="FBF9F3" w:val="clear"/>
+            <w:tcMar>
+              <w:top w:type="dxa" w:w="70"/>
+              <w:left w:type="dxa" w:w="110"/>
+              <w:bottom w:type="dxa" w:w="70"/>
+              <w:right w:type="dxa" w:w="110"/>
+            </w:tcMar>
+          </w:tcPr>
+          <w:p>
+            <w:pPr>
+              <w:spacing w:after="0" w:line="250"/>
+            </w:pPr>
+            <w:r>
+              <w:rPr>
+                <w:rFonts w:ascii="Arial" w:cs="Arial" w:eastAsia="Arial" w:hAnsi="Arial"/>
+                <w:b w:val="false"/>
+                <w:bCs w:val="false"/>
+                <w:color w:val="2D3436"/>
+                <w:sz w:val="19"/>
+                <w:szCs w:val="19"/>
+              </w:rPr>
+              <w:t xml:space="preserve">In-browser only</w:t>
+            </w:r>
+          </w:p>
+        </w:tc>
+        <w:tc>
+          <w:tcPr>
+            <w:tcW w:type="dxa" w:w="4226"/>
+            <w:tcBorders>
+              <w:top w:val="single" w:color="D8CDB4" w:sz="1"/>
+              <w:left w:val="single" w:color="D8CDB4" w:sz="1"/>
+              <w:bottom w:val="single" w:color="D8CDB4" w:sz="1"/>
+              <w:right w:val="single" w:color="D8CDB4" w:sz="1"/>
+            </w:tcBorders>
+            <w:shd w:fill="FBF9F3" w:val="clear"/>
+            <w:tcMar>
+              <w:top w:type="dxa" w:w="70"/>
+              <w:left w:type="dxa" w:w="110"/>
+              <w:bottom w:type="dxa" w:w="70"/>
+              <w:right w:type="dxa" w:w="110"/>
+            </w:tcMar>
+          </w:tcPr>
+          <w:p>
+            <w:pPr>
+              <w:spacing w:after="0" w:line="250"/>
+            </w:pPr>
+            <w:r>
+              <w:rPr>
+                <w:rFonts w:ascii="Arial" w:cs="Arial" w:eastAsia="Arial" w:hAnsi="Arial"/>
+                <w:b w:val="false"/>
+                <w:bCs w:val="false"/>
+                <w:color w:val="2D3436"/>
+                <w:sz w:val="19"/>
+                <w:szCs w:val="19"/>
+              </w:rPr>
+              <w:t xml:space="preserve">Mux / Cloudflare Stream upload and hosting</w:t>
+            </w:r>
+          </w:p>
+        </w:tc>
+      </w:tr>
+      <w:tr>
+        <w:tc>
+          <w:tcPr>
+            <w:tcW w:type="dxa" w:w="2200"/>
+            <w:tcBorders>
+              <w:top w:val="single" w:color="D8CDB4" w:sz="1"/>
+              <w:left w:val="single" w:color="D8CDB4" w:sz="1"/>
+              <w:bottom w:val="single" w:color="D8CDB4" w:sz="1"/>
+              <w:right w:val="single" w:color="D8CDB4" w:sz="1"/>
+            </w:tcBorders>
+            <w:shd w:fill="FFFFFF" w:val="clear"/>
+            <w:tcMar>
+              <w:top w:type="dxa" w:w="70"/>
+              <w:left w:type="dxa" w:w="110"/>
+              <w:bottom w:type="dxa" w:w="70"/>
+              <w:right w:type="dxa" w:w="110"/>
+            </w:tcMar>
+          </w:tcPr>
+          <w:p>
+            <w:pPr>
+              <w:spacing w:after="0" w:line="250"/>
+            </w:pPr>
+            <w:r>
+              <w:rPr>
+                <w:rFonts w:ascii="Arial" w:cs="Arial" w:eastAsia="Arial" w:hAnsi="Arial"/>
+                <w:b w:val="false"/>
+                <w:bCs w:val="false"/>
+                <w:color w:val="2D3436"/>
+                <w:sz w:val="19"/>
+                <w:szCs w:val="19"/>
+              </w:rPr>
+              <w:t xml:space="preserve">University dashboards</w:t>
+            </w:r>
+          </w:p>
+        </w:tc>
+        <w:tc>
+          <w:tcPr>
+            <w:tcW w:type="dxa" w:w="2600"/>
+            <w:tcBorders>
+              <w:top w:val="single" w:color="D8CDB4" w:sz="1"/>
+              <w:left w:val="single" w:color="D8CDB4" w:sz="1"/>
+              <w:bottom w:val="single" w:color="D8CDB4" w:sz="1"/>
+              <w:right w:val="single" w:color="D8CDB4" w:sz="1"/>
+            </w:tcBorders>
+            <w:shd w:fill="FFFFFF" w:val="clear"/>
+            <w:tcMar>
+              <w:top w:type="dxa" w:w="70"/>
+              <w:left w:type="dxa" w:w="110"/>
+              <w:bottom w:type="dxa" w:w="70"/>
+              <w:right w:type="dxa" w:w="110"/>
+            </w:tcMar>
+          </w:tcPr>
+          <w:p>
+            <w:pPr>
+              <w:spacing w:after="0" w:line="250"/>
+            </w:pPr>
+            <w:r>
+              <w:rPr>
+                <w:rFonts w:ascii="Arial" w:cs="Arial" w:eastAsia="Arial" w:hAnsi="Arial"/>
+                <w:b w:val="false"/>
+                <w:bCs w:val="false"/>
+                <w:color w:val="2D3436"/>
+                <w:sz w:val="19"/>
+                <w:szCs w:val="19"/>
+              </w:rPr>
+              <w:t xml:space="preserve">Derived from seeded cohort</w:t>
+            </w:r>
+          </w:p>
+        </w:tc>
+        <w:tc>
+          <w:tcPr>
+            <w:tcW w:type="dxa" w:w="4226"/>
+            <w:tcBorders>
+              <w:top w:val="single" w:color="D8CDB4" w:sz="1"/>
+              <w:left w:val="single" w:color="D8CDB4" w:sz="1"/>
+              <w:bottom w:val="single" w:color="D8CDB4" w:sz="1"/>
+              <w:right w:val="single" w:color="D8CDB4" w:sz="1"/>
+            </w:tcBorders>
+            <w:shd w:fill="FFFFFF" w:val="clear"/>
+            <w:tcMar>
+              <w:top w:type="dxa" w:w="70"/>
+              <w:left w:type="dxa" w:w="110"/>
+              <w:bottom w:type="dxa" w:w="70"/>
+              <w:right w:type="dxa" w:w="110"/>
+            </w:tcMar>
+          </w:tcPr>
+          <w:p>
+            <w:pPr>
+              <w:spacing w:after="0" w:line="250"/>
+            </w:pPr>
+            <w:r>
+              <w:rPr>
+                <w:rFonts w:ascii="Arial" w:cs="Arial" w:eastAsia="Arial" w:hAnsi="Arial"/>
+                <w:b w:val="false"/>
+                <w:bCs w:val="false"/>
+                <w:color w:val="2D3436"/>
+                <w:sz w:val="19"/>
+                <w:szCs w:val="19"/>
+              </w:rPr>
+              <w:t xml:space="preserve">University SIS integration + MOHE Graduate Tracer Study</w:t>
+            </w:r>
+          </w:p>
+        </w:tc>
+      </w:tr>
+      <w:tr>
+        <w:tc>
+          <w:tcPr>
+            <w:tcW w:type="dxa" w:w="2200"/>
+            <w:tcBorders>
+              <w:top w:val="single" w:color="D8CDB4" w:sz="1"/>
+              <w:left w:val="single" w:color="D8CDB4" w:sz="1"/>
+              <w:bottom w:val="single" w:color="D8CDB4" w:sz="1"/>
+              <w:right w:val="single" w:color="D8CDB4" w:sz="1"/>
+            </w:tcBorders>
+            <w:shd w:fill="FBF9F3" w:val="clear"/>
+            <w:tcMar>
+              <w:top w:type="dxa" w:w="70"/>
+              <w:left w:type="dxa" w:w="110"/>
+              <w:bottom w:type="dxa" w:w="70"/>
+              <w:right w:type="dxa" w:w="110"/>
+            </w:tcMar>
+          </w:tcPr>
+          <w:p>
+            <w:pPr>
+              <w:spacing w:after="0" w:line="250"/>
+            </w:pPr>
+            <w:r>
+              <w:rPr>
+                <w:rFonts w:ascii="Arial" w:cs="Arial" w:eastAsia="Arial" w:hAnsi="Arial"/>
+                <w:b w:val="false"/>
+                <w:bCs w:val="false"/>
+                <w:color w:val="2D3436"/>
+                <w:sz w:val="19"/>
+                <w:szCs w:val="19"/>
+              </w:rPr>
+              <w:t xml:space="preserve">Ministry dashboard</w:t>
+            </w:r>
+          </w:p>
+        </w:tc>
+        <w:tc>
+          <w:tcPr>
+            <w:tcW w:type="dxa" w:w="2600"/>
+            <w:tcBorders>
+              <w:top w:val="single" w:color="D8CDB4" w:sz="1"/>
+              <w:left w:val="single" w:color="D8CDB4" w:sz="1"/>
+              <w:bottom w:val="single" w:color="D8CDB4" w:sz="1"/>
+              <w:right w:val="single" w:color="D8CDB4" w:sz="1"/>
+            </w:tcBorders>
+            <w:shd w:fill="FBF9F3" w:val="clear"/>
+            <w:tcMar>
+              <w:top w:type="dxa" w:w="70"/>
+              <w:left w:type="dxa" w:w="110"/>
+              <w:bottom w:type="dxa" w:w="70"/>
+              <w:right w:type="dxa" w:w="110"/>
+            </w:tcMar>
+          </w:tcPr>
+          <w:p>
+            <w:pPr>
+              <w:spacing w:after="0" w:line="250"/>
+            </w:pPr>
+            <w:r>
+              <w:rPr>
+                <w:rFonts w:ascii="Arial" w:cs="Arial" w:eastAsia="Arial" w:hAnsi="Arial"/>
+                <w:b w:val="false"/>
+                <w:bCs w:val="false"/>
+                <w:color w:val="2D3436"/>
+                <w:sz w:val="19"/>
+                <w:szCs w:val="19"/>
+              </w:rPr>
+              <w:t xml:space="preserve">mockMinistryStats</w:t>
+            </w:r>
+          </w:p>
+        </w:tc>
+        <w:tc>
+          <w:tcPr>
+            <w:tcW w:type="dxa" w:w="4226"/>
+            <w:tcBorders>
+              <w:top w:val="single" w:color="D8CDB4" w:sz="1"/>
+              <w:left w:val="single" w:color="D8CDB4" w:sz="1"/>
+              <w:bottom w:val="single" w:color="D8CDB4" w:sz="1"/>
+              <w:right w:val="single" w:color="D8CDB4" w:sz="1"/>
+            </w:tcBorders>
+            <w:shd w:fill="FBF9F3" w:val="clear"/>
+            <w:tcMar>
+              <w:top w:type="dxa" w:w="70"/>
+              <w:left w:type="dxa" w:w="110"/>
+              <w:bottom w:type="dxa" w:w="70"/>
+              <w:right w:type="dxa" w:w="110"/>
+            </w:tcMar>
+          </w:tcPr>
+          <w:p>
+            <w:pPr>
+              <w:spacing w:after="0" w:line="250"/>
+            </w:pPr>
+            <w:r>
+              <w:rPr>
+                <w:rFonts w:ascii="Arial" w:cs="Arial" w:eastAsia="Arial" w:hAnsi="Arial"/>
+                <w:b w:val="false"/>
+                <w:bCs w:val="false"/>
+                <w:color w:val="2D3436"/>
+                <w:sz w:val="19"/>
+                <w:szCs w:val="19"/>
+              </w:rPr>
+              <w:t xml:space="preserve">MOHE / MyMOHES national statistics</w:t>
+            </w:r>
+          </w:p>
+        </w:tc>
+      </w:tr>
+      <w:tr>
+        <w:tc>
+          <w:tcPr>
+            <w:tcW w:type="dxa" w:w="2200"/>
+            <w:tcBorders>
+              <w:top w:val="single" w:color="D8CDB4" w:sz="1"/>
+              <w:left w:val="single" w:color="D8CDB4" w:sz="1"/>
+              <w:bottom w:val="single" w:color="D8CDB4" w:sz="1"/>
+              <w:right w:val="single" w:color="D8CDB4" w:sz="1"/>
+            </w:tcBorders>
+            <w:shd w:fill="FFFFFF" w:val="clear"/>
+            <w:tcMar>
+              <w:top w:type="dxa" w:w="70"/>
+              <w:left w:type="dxa" w:w="110"/>
+              <w:bottom w:type="dxa" w:w="70"/>
+              <w:right w:type="dxa" w:w="110"/>
+            </w:tcMar>
+          </w:tcPr>
+          <w:p>
+            <w:pPr>
+              <w:spacing w:after="0" w:line="250"/>
+            </w:pPr>
+            <w:r>
+              <w:rPr>
+                <w:rFonts w:ascii="Arial" w:cs="Arial" w:eastAsia="Arial" w:hAnsi="Arial"/>
+                <w:b w:val="false"/>
+                <w:bCs w:val="false"/>
+                <w:color w:val="2D3436"/>
+                <w:sz w:val="19"/>
+                <w:szCs w:val="19"/>
+              </w:rPr>
+              <w:t xml:space="preserve">Retention (Speed vs Stickiness)</w:t>
+            </w:r>
+          </w:p>
+        </w:tc>
+        <w:tc>
+          <w:tcPr>
+            <w:tcW w:type="dxa" w:w="2600"/>
+            <w:tcBorders>
+              <w:top w:val="single" w:color="D8CDB4" w:sz="1"/>
+              <w:left w:val="single" w:color="D8CDB4" w:sz="1"/>
+              <w:bottom w:val="single" w:color="D8CDB4" w:sz="1"/>
+              <w:right w:val="single" w:color="D8CDB4" w:sz="1"/>
+            </w:tcBorders>
+            <w:shd w:fill="FFFFFF" w:val="clear"/>
+            <w:tcMar>
+              <w:top w:type="dxa" w:w="70"/>
+              <w:left w:type="dxa" w:w="110"/>
+              <w:bottom w:type="dxa" w:w="70"/>
+              <w:right w:type="dxa" w:w="110"/>
+            </w:tcMar>
+          </w:tcPr>
+          <w:p>
+            <w:pPr>
+              <w:spacing w:after="0" w:line="250"/>
+            </w:pPr>
+            <w:r>
+              <w:rPr>
+                <w:rFonts w:ascii="Arial" w:cs="Arial" w:eastAsia="Arial" w:hAnsi="Arial"/>
+                <w:b w:val="false"/>
+                <w:bCs w:val="false"/>
+                <w:color w:val="2D3436"/>
+                <w:sz w:val="19"/>
+                <w:szCs w:val="19"/>
+              </w:rPr>
+              <w:t xml:space="preserve">Seeded values</w:t>
+            </w:r>
+          </w:p>
+        </w:tc>
+        <w:tc>
+          <w:tcPr>
+            <w:tcW w:type="dxa" w:w="4226"/>
+            <w:tcBorders>
+              <w:top w:val="single" w:color="D8CDB4" w:sz="1"/>
+              <w:left w:val="single" w:color="D8CDB4" w:sz="1"/>
+              <w:bottom w:val="single" w:color="D8CDB4" w:sz="1"/>
+              <w:right w:val="single" w:color="D8CDB4" w:sz="1"/>
+            </w:tcBorders>
+            <w:shd w:fill="FFFFFF" w:val="clear"/>
+            <w:tcMar>
+              <w:top w:type="dxa" w:w="70"/>
+              <w:left w:type="dxa" w:w="110"/>
+              <w:bottom w:type="dxa" w:w="70"/>
+              <w:right w:type="dxa" w:w="110"/>
+            </w:tcMar>
+          </w:tcPr>
+          <w:p>
+            <w:pPr>
+              <w:spacing w:after="0" w:line="250"/>
+            </w:pPr>
+            <w:r>
+              <w:rPr>
+                <w:rFonts w:ascii="Arial" w:cs="Arial" w:eastAsia="Arial" w:hAnsi="Arial"/>
+                <w:b w:val="false"/>
+                <w:bCs w:val="false"/>
+                <w:color w:val="2D3436"/>
+                <w:sz w:val="19"/>
+                <w:szCs w:val="19"/>
+              </w:rPr>
+              <w:t xml:space="preserve">EPF / SOCSO contribution continuity + tracer follow-up surveys</w:t>
+            </w:r>
+          </w:p>
+        </w:tc>
+      </w:tr>
+    </w:tbl>
+    <w:p>
+      <w:pPr>
+        <w:pStyle w:val="Heading2"/>
+        <w:spacing w:after="90" w:before="260"/>
+      </w:pPr>
+      <w:r>
+        <w:rPr>
+          <w:rFonts w:ascii="Arial" w:cs="Arial" w:eastAsia="Arial" w:hAnsi="Arial"/>
+          <w:b/>
+          <w:bCs/>
+          <w:color w:val="C0392B"/>
+          <w:sz w:val="24"/>
+          <w:szCs w:val="24"/>
+        </w:rPr>
+        <w:t xml:space="preserve">Realistic sequencing</w:t>
+      </w:r>
+    </w:p>
+    <w:p>
+      <w:pPr>
+        <w:spacing w:after="110" w:line="268"/>
+      </w:pPr>
+      <w:r>
+        <w:rPr>
+          <w:rFonts w:ascii="Arial" w:cs="Arial" w:eastAsia="Arial" w:hAnsi="Arial"/>
+          <w:color w:val="2D3436"/>
+          <w:sz w:val="21"/>
+          <w:szCs w:val="21"/>
+        </w:rPr>
+        <w:t xml:space="preserve">We are deliberately honest about what is easy and what needs partnership:</w:t>
+      </w:r>
+    </w:p>
+    <w:tbl>
+      <w:tblPr>
+        <w:tblW w:type="dxa" w:w="9026"/>
+        <w:tblBorders>
+          <w:top w:val="single" w:color="auto" w:sz="4"/>
+          <w:left w:val="single" w:color="auto" w:sz="4"/>
+          <w:bottom w:val="single" w:color="auto" w:sz="4"/>
+          <w:right w:val="single" w:color="auto" w:sz="4"/>
+          <w:insideH w:val="single" w:color="auto" w:sz="4"/>
+          <w:insideV w:val="single" w:color="auto" w:sz="4"/>
+        </w:tblBorders>
+      </w:tblPr>
+      <w:tblGrid>
+        <w:gridCol w:w="2300"/>
+        <w:gridCol w:w="3600"/>
+        <w:gridCol w:w="3126"/>
+      </w:tblGrid>
+      <w:tr>
+        <w:trPr>
+          <w:tblHeader/>
+        </w:trPr>
+        <w:tc>
+          <w:tcPr>
+            <w:tcW w:type="dxa" w:w="2300"/>
+            <w:tcBorders>
+              <w:top w:val="single" w:color="D8CDB4" w:sz="1"/>
+              <w:left w:val="single" w:color="D8CDB4" w:sz="1"/>
+              <w:bottom w:val="single" w:color="D8CDB4" w:sz="1"/>
+              <w:right w:val="single" w:color="D8CDB4" w:sz="1"/>
+            </w:tcBorders>
+            <w:shd w:fill="8A6D1F" w:val="clear"/>
+            <w:tcMar>
+              <w:top w:type="dxa" w:w="70"/>
+              <w:left w:type="dxa" w:w="110"/>
+              <w:bottom w:type="dxa" w:w="70"/>
+              <w:right w:type="dxa" w:w="110"/>
+            </w:tcMar>
+          </w:tcPr>
+          <w:p>
+            <w:pPr>
+              <w:spacing w:after="0" w:line="250"/>
+            </w:pPr>
+            <w:r>
+              <w:rPr>
+                <w:rFonts w:ascii="Arial" w:cs="Arial" w:eastAsia="Arial" w:hAnsi="Arial"/>
+                <w:b/>
+                <w:bCs/>
+                <w:color w:val="FFFFFF"/>
+                <w:sz w:val="19"/>
+                <w:szCs w:val="19"/>
+              </w:rPr>
+              <w:t xml:space="preserve">Tier</w:t>
+            </w:r>
+          </w:p>
+        </w:tc>
+        <w:tc>
+          <w:tcPr>
+            <w:tcW w:type="dxa" w:w="3600"/>
+            <w:tcBorders>
+              <w:top w:val="single" w:color="D8CDB4" w:sz="1"/>
+              <w:left w:val="single" w:color="D8CDB4" w:sz="1"/>
+              <w:bottom w:val="single" w:color="D8CDB4" w:sz="1"/>
+              <w:right w:val="single" w:color="D8CDB4" w:sz="1"/>
+            </w:tcBorders>
+            <w:shd w:fill="8A6D1F" w:val="clear"/>
+            <w:tcMar>
+              <w:top w:type="dxa" w:w="70"/>
+              <w:left w:type="dxa" w:w="110"/>
+              <w:bottom w:type="dxa" w:w="70"/>
+              <w:right w:type="dxa" w:w="110"/>
+            </w:tcMar>
+          </w:tcPr>
+          <w:p>
+            <w:pPr>
+              <w:spacing w:after="0" w:line="250"/>
+            </w:pPr>
+            <w:r>
+              <w:rPr>
+                <w:rFonts w:ascii="Arial" w:cs="Arial" w:eastAsia="Arial" w:hAnsi="Arial"/>
+                <w:b/>
+                <w:bCs/>
+                <w:color w:val="FFFFFF"/>
+                <w:sz w:val="19"/>
+                <w:szCs w:val="19"/>
+              </w:rPr>
+              <w:t xml:space="preserve">What</w:t>
+            </w:r>
+          </w:p>
+        </w:tc>
+        <w:tc>
+          <w:tcPr>
+            <w:tcW w:type="dxa" w:w="3126"/>
+            <w:tcBorders>
+              <w:top w:val="single" w:color="D8CDB4" w:sz="1"/>
+              <w:left w:val="single" w:color="D8CDB4" w:sz="1"/>
+              <w:bottom w:val="single" w:color="D8CDB4" w:sz="1"/>
+              <w:right w:val="single" w:color="D8CDB4" w:sz="1"/>
+            </w:tcBorders>
+            <w:shd w:fill="8A6D1F" w:val="clear"/>
+            <w:tcMar>
+              <w:top w:type="dxa" w:w="70"/>
+              <w:left w:type="dxa" w:w="110"/>
+              <w:bottom w:type="dxa" w:w="70"/>
+              <w:right w:type="dxa" w:w="110"/>
+            </w:tcMar>
+          </w:tcPr>
+          <w:p>
+            <w:pPr>
+              <w:spacing w:after="0" w:line="250"/>
+            </w:pPr>
+            <w:r>
+              <w:rPr>
+                <w:rFonts w:ascii="Arial" w:cs="Arial" w:eastAsia="Arial" w:hAnsi="Arial"/>
+                <w:b/>
+                <w:bCs/>
+                <w:color w:val="FFFFFF"/>
+                <w:sz w:val="19"/>
+                <w:szCs w:val="19"/>
+              </w:rPr>
+              <w:t xml:space="preserve">What it needs</w:t>
+            </w:r>
+          </w:p>
+        </w:tc>
+      </w:tr>
+      <w:tr>
+        <w:tc>
+          <w:tcPr>
+            <w:tcW w:type="dxa" w:w="2300"/>
+            <w:tcBorders>
+              <w:top w:val="single" w:color="D8CDB4" w:sz="1"/>
+              <w:left w:val="single" w:color="D8CDB4" w:sz="1"/>
+              <w:bottom w:val="single" w:color="D8CDB4" w:sz="1"/>
+              <w:right w:val="single" w:color="D8CDB4" w:sz="1"/>
+            </w:tcBorders>
+            <w:shd w:fill="FFFFFF" w:val="clear"/>
+            <w:tcMar>
+              <w:top w:type="dxa" w:w="70"/>
+              <w:left w:type="dxa" w:w="110"/>
+              <w:bottom w:type="dxa" w:w="70"/>
+              <w:right w:type="dxa" w:w="110"/>
+            </w:tcMar>
+          </w:tcPr>
+          <w:p>
+            <w:pPr>
+              <w:spacing w:after="0" w:line="250"/>
+            </w:pPr>
+            <w:r>
+              <w:rPr>
+                <w:rFonts w:ascii="Arial" w:cs="Arial" w:eastAsia="Arial" w:hAnsi="Arial"/>
+                <w:b w:val="false"/>
+                <w:bCs w:val="false"/>
+                <w:color w:val="2D3436"/>
+                <w:sz w:val="19"/>
+                <w:szCs w:val="19"/>
+              </w:rPr>
+              <w:t xml:space="preserve">1 — Buildable immediately</w:t>
+            </w:r>
+          </w:p>
+        </w:tc>
+        <w:tc>
+          <w:tcPr>
+            <w:tcW w:type="dxa" w:w="3600"/>
+            <w:tcBorders>
+              <w:top w:val="single" w:color="D8CDB4" w:sz="1"/>
+              <w:left w:val="single" w:color="D8CDB4" w:sz="1"/>
+              <w:bottom w:val="single" w:color="D8CDB4" w:sz="1"/>
+              <w:right w:val="single" w:color="D8CDB4" w:sz="1"/>
+            </w:tcBorders>
+            <w:shd w:fill="FFFFFF" w:val="clear"/>
+            <w:tcMar>
+              <w:top w:type="dxa" w:w="70"/>
+              <w:left w:type="dxa" w:w="110"/>
+              <w:bottom w:type="dxa" w:w="70"/>
+              <w:right w:type="dxa" w:w="110"/>
+            </w:tcMar>
+          </w:tcPr>
+          <w:p>
+            <w:pPr>
+              <w:spacing w:after="0" w:line="250"/>
+            </w:pPr>
+            <w:r>
+              <w:rPr>
+                <w:rFonts w:ascii="Arial" w:cs="Arial" w:eastAsia="Arial" w:hAnsi="Arial"/>
+                <w:b w:val="false"/>
+                <w:bCs w:val="false"/>
+                <w:color w:val="2D3436"/>
+                <w:sz w:val="19"/>
+                <w:szCs w:val="19"/>
+              </w:rPr>
+              <w:t xml:space="preserve">Database, auth, resume parsing, video hosting, expanded AI, platform-native scoring</w:t>
+            </w:r>
+          </w:p>
+        </w:tc>
+        <w:tc>
+          <w:tcPr>
+            <w:tcW w:type="dxa" w:w="3126"/>
+            <w:tcBorders>
+              <w:top w:val="single" w:color="D8CDB4" w:sz="1"/>
+              <w:left w:val="single" w:color="D8CDB4" w:sz="1"/>
+              <w:bottom w:val="single" w:color="D8CDB4" w:sz="1"/>
+              <w:right w:val="single" w:color="D8CDB4" w:sz="1"/>
+            </w:tcBorders>
+            <w:shd w:fill="FFFFFF" w:val="clear"/>
+            <w:tcMar>
+              <w:top w:type="dxa" w:w="70"/>
+              <w:left w:type="dxa" w:w="110"/>
+              <w:bottom w:type="dxa" w:w="70"/>
+              <w:right w:type="dxa" w:w="110"/>
+            </w:tcMar>
+          </w:tcPr>
+          <w:p>
+            <w:pPr>
+              <w:spacing w:after="0" w:line="250"/>
+            </w:pPr>
+            <w:r>
+              <w:rPr>
+                <w:rFonts w:ascii="Arial" w:cs="Arial" w:eastAsia="Arial" w:hAnsi="Arial"/>
+                <w:b w:val="false"/>
+                <w:bCs w:val="false"/>
+                <w:color w:val="2D3436"/>
+                <w:sz w:val="19"/>
+                <w:szCs w:val="19"/>
+              </w:rPr>
+              <w:t xml:space="preserve">Commercial contracts only. Weeks, not months.</w:t>
+            </w:r>
+          </w:p>
+        </w:tc>
+      </w:tr>
+      <w:tr>
+        <w:tc>
+          <w:tcPr>
+            <w:tcW w:type="dxa" w:w="2300"/>
+            <w:tcBorders>
+              <w:top w:val="single" w:color="D8CDB4" w:sz="1"/>
+              <w:left w:val="single" w:color="D8CDB4" w:sz="1"/>
+              <w:bottom w:val="single" w:color="D8CDB4" w:sz="1"/>
+              <w:right w:val="single" w:color="D8CDB4" w:sz="1"/>
+            </w:tcBorders>
+            <w:shd w:fill="FBF9F3" w:val="clear"/>
+            <w:tcMar>
+              <w:top w:type="dxa" w:w="70"/>
+              <w:left w:type="dxa" w:w="110"/>
+              <w:bottom w:type="dxa" w:w="70"/>
+              <w:right w:type="dxa" w:w="110"/>
+            </w:tcMar>
+          </w:tcPr>
+          <w:p>
+            <w:pPr>
+              <w:spacing w:after="0" w:line="250"/>
+            </w:pPr>
+            <w:r>
+              <w:rPr>
+                <w:rFonts w:ascii="Arial" w:cs="Arial" w:eastAsia="Arial" w:hAnsi="Arial"/>
+                <w:b w:val="false"/>
+                <w:bCs w:val="false"/>
+                <w:color w:val="2D3436"/>
+                <w:sz w:val="19"/>
+                <w:szCs w:val="19"/>
+              </w:rPr>
+              <w:t xml:space="preserve">2 — Needs Talentbank</w:t>
+            </w:r>
+          </w:p>
+        </w:tc>
+        <w:tc>
+          <w:tcPr>
+            <w:tcW w:type="dxa" w:w="3600"/>
+            <w:tcBorders>
+              <w:top w:val="single" w:color="D8CDB4" w:sz="1"/>
+              <w:left w:val="single" w:color="D8CDB4" w:sz="1"/>
+              <w:bottom w:val="single" w:color="D8CDB4" w:sz="1"/>
+              <w:right w:val="single" w:color="D8CDB4" w:sz="1"/>
+            </w:tcBorders>
+            <w:shd w:fill="FBF9F3" w:val="clear"/>
+            <w:tcMar>
+              <w:top w:type="dxa" w:w="70"/>
+              <w:left w:type="dxa" w:w="110"/>
+              <w:bottom w:type="dxa" w:w="70"/>
+              <w:right w:type="dxa" w:w="110"/>
+            </w:tcMar>
+          </w:tcPr>
+          <w:p>
+            <w:pPr>
+              <w:spacing w:after="0" w:line="250"/>
+            </w:pPr>
+            <w:r>
+              <w:rPr>
+                <w:rFonts w:ascii="Arial" w:cs="Arial" w:eastAsia="Arial" w:hAnsi="Arial"/>
+                <w:b w:val="false"/>
+                <w:bCs w:val="false"/>
+                <w:color w:val="2D3436"/>
+                <w:sz w:val="19"/>
+                <w:szCs w:val="19"/>
+              </w:rPr>
+              <w:t xml:space="preserve">Live employer listings, verified companies, university cohort data, YourAnimal integration</w:t>
+            </w:r>
+          </w:p>
+        </w:tc>
+        <w:tc>
+          <w:tcPr>
+            <w:tcW w:type="dxa" w:w="3126"/>
+            <w:tcBorders>
+              <w:top w:val="single" w:color="D8CDB4" w:sz="1"/>
+              <w:left w:val="single" w:color="D8CDB4" w:sz="1"/>
+              <w:bottom w:val="single" w:color="D8CDB4" w:sz="1"/>
+              <w:right w:val="single" w:color="D8CDB4" w:sz="1"/>
+            </w:tcBorders>
+            <w:shd w:fill="FBF9F3" w:val="clear"/>
+            <w:tcMar>
+              <w:top w:type="dxa" w:w="70"/>
+              <w:left w:type="dxa" w:w="110"/>
+              <w:bottom w:type="dxa" w:w="70"/>
+              <w:right w:type="dxa" w:w="110"/>
+            </w:tcMar>
+          </w:tcPr>
+          <w:p>
+            <w:pPr>
+              <w:spacing w:after="0" w:line="250"/>
+            </w:pPr>
+            <w:r>
+              <w:rPr>
+                <w:rFonts w:ascii="Arial" w:cs="Arial" w:eastAsia="Arial" w:hAnsi="Arial"/>
+                <w:b w:val="false"/>
+                <w:bCs w:val="false"/>
+                <w:color w:val="2D3436"/>
+                <w:sz w:val="19"/>
+                <w:szCs w:val="19"/>
+              </w:rPr>
+              <w:t xml:space="preserve">Talentbank’s existing network and university MOUs — assets they already hold</w:t>
+            </w:r>
+          </w:p>
+        </w:tc>
+      </w:tr>
+      <w:tr>
+        <w:tc>
+          <w:tcPr>
+            <w:tcW w:type="dxa" w:w="2300"/>
+            <w:tcBorders>
+              <w:top w:val="single" w:color="D8CDB4" w:sz="1"/>
+              <w:left w:val="single" w:color="D8CDB4" w:sz="1"/>
+              <w:bottom w:val="single" w:color="D8CDB4" w:sz="1"/>
+              <w:right w:val="single" w:color="D8CDB4" w:sz="1"/>
+            </w:tcBorders>
+            <w:shd w:fill="FFFFFF" w:val="clear"/>
+            <w:tcMar>
+              <w:top w:type="dxa" w:w="70"/>
+              <w:left w:type="dxa" w:w="110"/>
+              <w:bottom w:type="dxa" w:w="70"/>
+              <w:right w:type="dxa" w:w="110"/>
+            </w:tcMar>
+          </w:tcPr>
+          <w:p>
+            <w:pPr>
+              <w:spacing w:after="0" w:line="250"/>
+            </w:pPr>
+            <w:r>
+              <w:rPr>
+                <w:rFonts w:ascii="Arial" w:cs="Arial" w:eastAsia="Arial" w:hAnsi="Arial"/>
+                <w:b w:val="false"/>
+                <w:bCs w:val="false"/>
+                <w:color w:val="2D3436"/>
+                <w:sz w:val="19"/>
+                <w:szCs w:val="19"/>
+              </w:rPr>
+              <w:t xml:space="preserve">3 — Needs government partnership</w:t>
+            </w:r>
+          </w:p>
+        </w:tc>
+        <w:tc>
+          <w:tcPr>
+            <w:tcW w:type="dxa" w:w="3600"/>
+            <w:tcBorders>
+              <w:top w:val="single" w:color="D8CDB4" w:sz="1"/>
+              <w:left w:val="single" w:color="D8CDB4" w:sz="1"/>
+              <w:bottom w:val="single" w:color="D8CDB4" w:sz="1"/>
+              <w:right w:val="single" w:color="D8CDB4" w:sz="1"/>
+            </w:tcBorders>
+            <w:shd w:fill="FFFFFF" w:val="clear"/>
+            <w:tcMar>
+              <w:top w:type="dxa" w:w="70"/>
+              <w:left w:type="dxa" w:w="110"/>
+              <w:bottom w:type="dxa" w:w="70"/>
+              <w:right w:type="dxa" w:w="110"/>
+            </w:tcMar>
+          </w:tcPr>
+          <w:p>
+            <w:pPr>
+              <w:spacing w:after="0" w:line="250"/>
+            </w:pPr>
+            <w:r>
+              <w:rPr>
+                <w:rFonts w:ascii="Arial" w:cs="Arial" w:eastAsia="Arial" w:hAnsi="Arial"/>
+                <w:b w:val="false"/>
+                <w:bCs w:val="false"/>
+                <w:color w:val="2D3436"/>
+                <w:sz w:val="19"/>
+                <w:szCs w:val="19"/>
+              </w:rPr>
+              <w:t xml:space="preserve">MOHE tracer integration, national ministry reporting, EPF/SOCSO retention measurement</w:t>
+            </w:r>
+          </w:p>
+        </w:tc>
+        <w:tc>
+          <w:tcPr>
+            <w:tcW w:type="dxa" w:w="3126"/>
+            <w:tcBorders>
+              <w:top w:val="single" w:color="D8CDB4" w:sz="1"/>
+              <w:left w:val="single" w:color="D8CDB4" w:sz="1"/>
+              <w:bottom w:val="single" w:color="D8CDB4" w:sz="1"/>
+              <w:right w:val="single" w:color="D8CDB4" w:sz="1"/>
+            </w:tcBorders>
+            <w:shd w:fill="FFFFFF" w:val="clear"/>
+            <w:tcMar>
+              <w:top w:type="dxa" w:w="70"/>
+              <w:left w:type="dxa" w:w="110"/>
+              <w:bottom w:type="dxa" w:w="70"/>
+              <w:right w:type="dxa" w:w="110"/>
+            </w:tcMar>
+          </w:tcPr>
+          <w:p>
+            <w:pPr>
+              <w:spacing w:after="0" w:line="250"/>
+            </w:pPr>
+            <w:r>
+              <w:rPr>
+                <w:rFonts w:ascii="Arial" w:cs="Arial" w:eastAsia="Arial" w:hAnsi="Arial"/>
+                <w:b w:val="false"/>
+                <w:bCs w:val="false"/>
+                <w:color w:val="2D3436"/>
+                <w:sz w:val="19"/>
+                <w:szCs w:val="19"/>
+              </w:rPr>
+              <w:t xml:space="preserve">Data-sharing agreements with MOHE and PERKESO. Highest impact, longest timeline.</w:t>
+            </w:r>
+          </w:p>
+        </w:tc>
+      </w:tr>
+    </w:tbl>
+    <w:p>
+      <w:pPr>
+        <w:spacing w:after="110" w:line="268"/>
+      </w:pPr>
+      <w:r>
+        <w:rPr>
+          <w:rFonts w:ascii="Arial" w:cs="Arial" w:eastAsia="Arial" w:hAnsi="Arial"/>
+          <w:b/>
+          <w:bCs/>
+          <w:color w:val="2D3436"/>
+          <w:sz w:val="21"/>
+          <w:szCs w:val="21"/>
+        </w:rPr>
+        <w:t xml:space="preserve">The honest summary: </w:t>
+      </w:r>
+      <w:r>
+        <w:rPr>
+          <w:rFonts w:ascii="Arial" w:cs="Arial" w:eastAsia="Arial" w:hAnsi="Arial"/>
+          <w:color w:val="2D3436"/>
+          <w:sz w:val="21"/>
+          <w:szCs w:val="21"/>
+        </w:rPr>
+        <w:t xml:space="preserve">everything a candidate touches is Tier 1 or Tier 2 and could ship within months. The ministry-scale retention measurement is Tier 3 — the most valuable and the slowest, which is exactly why it belongs to an organisation with existing government relationships rather than to a startup building alone.</w:t>
       </w:r>
     </w:p>
     <w:sectPr>

</xml_diff>